<commit_message>
V4: Engraved Pgs 5-10. Started 11-12 (not finished). Updated Errata list
</commit_message>
<xml_diff>
--- a/Proof Reading and Review/LARA Bonecas Russas - Errata_v1.docx
+++ b/Proof Reading and Review/LARA Bonecas Russas - Errata_v1.docx
@@ -297,10 +297,10 @@
         <w:tc>
           <w:tcPr>
             <w:tcW w:w="1782" w:type="dxa"/>
-          </w:tcPr>
-          <w:p>
-            <w:pPr>
-              <w:jc w:val="center"/>
+            <w:vAlign w:val="center"/>
+          </w:tcPr>
+          <w:p>
+            <w:pPr>
               <w:rPr>
                 <w:rFonts w:ascii="Times" w:eastAsia="Times" w:hAnsi="Times" w:cs="Times"/>
                 <w:b/>
@@ -320,10 +320,10 @@
         <w:tc>
           <w:tcPr>
             <w:tcW w:w="913" w:type="dxa"/>
-          </w:tcPr>
-          <w:p>
-            <w:pPr>
-              <w:jc w:val="center"/>
+            <w:vAlign w:val="center"/>
+          </w:tcPr>
+          <w:p>
+            <w:pPr>
               <w:rPr>
                 <w:rFonts w:ascii="Times" w:eastAsia="Times" w:hAnsi="Times" w:cs="Times"/>
                 <w:b/>
@@ -343,10 +343,10 @@
         <w:tc>
           <w:tcPr>
             <w:tcW w:w="3679" w:type="dxa"/>
-          </w:tcPr>
-          <w:p>
-            <w:pPr>
-              <w:jc w:val="center"/>
+            <w:vAlign w:val="center"/>
+          </w:tcPr>
+          <w:p>
+            <w:pPr>
               <w:rPr>
                 <w:rFonts w:ascii="Times" w:eastAsia="Times" w:hAnsi="Times" w:cs="Times"/>
                 <w:b/>
@@ -366,10 +366,10 @@
         <w:tc>
           <w:tcPr>
             <w:tcW w:w="2711" w:type="dxa"/>
-          </w:tcPr>
-          <w:p>
-            <w:pPr>
-              <w:jc w:val="center"/>
+            <w:vAlign w:val="center"/>
+          </w:tcPr>
+          <w:p>
+            <w:pPr>
               <w:rPr>
                 <w:rFonts w:ascii="Times" w:eastAsia="Times" w:hAnsi="Times" w:cs="Times"/>
                 <w:b/>
@@ -394,40 +394,131 @@
         <w:tc>
           <w:tcPr>
             <w:tcW w:w="1782" w:type="dxa"/>
-          </w:tcPr>
-          <w:p>
-            <w:pPr>
-              <w:jc w:val="center"/>
-              <w:rPr>
-                <w:rFonts w:ascii="Times" w:eastAsia="Times" w:hAnsi="Times" w:cs="Times"/>
-                <w:color w:val="ED7D31" w:themeColor="accent2"/>
-              </w:rPr>
-            </w:pPr>
+            <w:vAlign w:val="center"/>
+          </w:tcPr>
+          <w:p>
+            <w:pPr>
+              <w:rPr>
+                <w:rFonts w:ascii="Times" w:eastAsia="Times" w:hAnsi="Times" w:cs="Times"/>
+              </w:rPr>
+            </w:pPr>
+            <w:r>
+              <w:rPr>
+                <w:rFonts w:ascii="Times" w:eastAsia="Times" w:hAnsi="Times" w:cs="Times"/>
+              </w:rPr>
+              <w:t>Trumpet</w:t>
+            </w:r>
           </w:p>
         </w:tc>
         <w:tc>
           <w:tcPr>
             <w:tcW w:w="913" w:type="dxa"/>
-          </w:tcPr>
-          <w:p>
-            <w:pPr>
-              <w:jc w:val="center"/>
-              <w:rPr>
-                <w:rFonts w:ascii="Times" w:eastAsia="Times" w:hAnsi="Times" w:cs="Times"/>
-                <w:color w:val="ED7D31" w:themeColor="accent2"/>
-              </w:rPr>
-            </w:pPr>
+            <w:vAlign w:val="center"/>
+          </w:tcPr>
+          <w:p>
+            <w:pPr>
+              <w:rPr>
+                <w:rFonts w:ascii="Times" w:eastAsia="Times" w:hAnsi="Times" w:cs="Times"/>
+              </w:rPr>
+            </w:pPr>
+            <w:r>
+              <w:rPr>
+                <w:rFonts w:ascii="Times" w:eastAsia="Times" w:hAnsi="Times" w:cs="Times"/>
+              </w:rPr>
+              <w:t>27</w:t>
+            </w:r>
           </w:p>
         </w:tc>
         <w:tc>
           <w:tcPr>
             <w:tcW w:w="3679" w:type="dxa"/>
-          </w:tcPr>
-          <w:p>
-            <w:pPr>
-              <w:rPr>
-                <w:rFonts w:ascii="Times" w:eastAsia="Times" w:hAnsi="Times" w:cs="Times"/>
-                <w:color w:val="ED7D31" w:themeColor="accent2"/>
+            <w:vAlign w:val="center"/>
+          </w:tcPr>
+          <w:p>
+            <w:pPr>
+              <w:rPr>
+                <w:rFonts w:ascii="Times" w:eastAsia="Times" w:hAnsi="Times" w:cs="Times"/>
+              </w:rPr>
+            </w:pPr>
+          </w:p>
+          <w:p>
+            <w:pPr>
+              <w:rPr>
+                <w:rFonts w:ascii="Times" w:eastAsia="Times" w:hAnsi="Times" w:cs="Times"/>
+              </w:rPr>
+            </w:pPr>
+            <w:r>
+              <w:rPr>
+                <w:rFonts w:ascii="Times" w:eastAsia="Times" w:hAnsi="Times" w:cs="Times"/>
+              </w:rPr>
+              <w:drawing>
+                <wp:inline distT="0" distB="0" distL="0" distR="0" wp14:anchorId="65140A51" wp14:editId="0D95A813">
+                  <wp:extent cx="1802980" cy="704428"/>
+                  <wp:effectExtent l="0" t="0" r="6985" b="635"/>
+                  <wp:docPr id="1489938688" name="Picture 1"/>
+                  <wp:cNvGraphicFramePr>
+                    <a:graphicFrameLocks xmlns:a="http://schemas.openxmlformats.org/drawingml/2006/main" noChangeAspect="1"/>
+                  </wp:cNvGraphicFramePr>
+                  <a:graphic xmlns:a="http://schemas.openxmlformats.org/drawingml/2006/main">
+                    <a:graphicData uri="http://schemas.openxmlformats.org/drawingml/2006/picture">
+                      <pic:pic xmlns:pic="http://schemas.openxmlformats.org/drawingml/2006/picture">
+                        <pic:nvPicPr>
+                          <pic:cNvPr id="1489938688" name=""/>
+                          <pic:cNvPicPr/>
+                        </pic:nvPicPr>
+                        <pic:blipFill>
+                          <a:blip r:embed="rId8"/>
+                          <a:stretch>
+                            <a:fillRect/>
+                          </a:stretch>
+                        </pic:blipFill>
+                        <pic:spPr>
+                          <a:xfrm>
+                            <a:off x="0" y="0"/>
+                            <a:ext cx="1818969" cy="710675"/>
+                          </a:xfrm>
+                          <a:prstGeom prst="rect">
+                            <a:avLst/>
+                          </a:prstGeom>
+                        </pic:spPr>
+                      </pic:pic>
+                    </a:graphicData>
+                  </a:graphic>
+                </wp:inline>
+              </w:drawing>
+            </w:r>
+          </w:p>
+          <w:p>
+            <w:pPr>
+              <w:rPr>
+                <w:rFonts w:ascii="Times" w:eastAsia="Times" w:hAnsi="Times" w:cs="Times"/>
+              </w:rPr>
+            </w:pPr>
+            <w:r>
+              <w:rPr>
+                <w:rFonts w:ascii="Times" w:eastAsia="Times" w:hAnsi="Times" w:cs="Times"/>
+              </w:rPr>
+              <w:t xml:space="preserve">Is this meant to be a 3 </w:t>
+            </w:r>
+            <w:proofErr w:type="spellStart"/>
+            <w:r>
+              <w:rPr>
+                <w:rFonts w:ascii="Times" w:eastAsia="Times" w:hAnsi="Times" w:cs="Times"/>
+              </w:rPr>
+              <w:t>tuplet</w:t>
+            </w:r>
+            <w:proofErr w:type="spellEnd"/>
+            <w:r>
+              <w:rPr>
+                <w:rFonts w:ascii="Times" w:eastAsia="Times" w:hAnsi="Times" w:cs="Times"/>
+              </w:rPr>
+              <w:t>?</w:t>
+            </w:r>
+          </w:p>
+          <w:p>
+            <w:pPr>
+              <w:rPr>
+                <w:rFonts w:ascii="Times" w:eastAsia="Times" w:hAnsi="Times" w:cs="Times"/>
               </w:rPr>
             </w:pPr>
           </w:p>
@@ -435,10 +526,10 @@
         <w:tc>
           <w:tcPr>
             <w:tcW w:w="2711" w:type="dxa"/>
-          </w:tcPr>
-          <w:p>
-            <w:pPr>
-              <w:jc w:val="center"/>
+            <w:vAlign w:val="center"/>
+          </w:tcPr>
+          <w:p>
+            <w:pPr>
               <w:rPr>
                 <w:rFonts w:ascii="Times" w:eastAsia="Times" w:hAnsi="Times" w:cs="Times"/>
               </w:rPr>
@@ -453,10 +544,10 @@
         <w:tc>
           <w:tcPr>
             <w:tcW w:w="1782" w:type="dxa"/>
-          </w:tcPr>
-          <w:p>
-            <w:pPr>
-              <w:jc w:val="center"/>
+            <w:vAlign w:val="center"/>
+          </w:tcPr>
+          <w:p>
+            <w:pPr>
               <w:rPr>
                 <w:rFonts w:ascii="Times" w:eastAsia="Times" w:hAnsi="Times" w:cs="Times"/>
               </w:rPr>
@@ -466,10 +557,10 @@
         <w:tc>
           <w:tcPr>
             <w:tcW w:w="913" w:type="dxa"/>
-          </w:tcPr>
-          <w:p>
-            <w:pPr>
-              <w:jc w:val="center"/>
+            <w:vAlign w:val="center"/>
+          </w:tcPr>
+          <w:p>
+            <w:pPr>
               <w:rPr>
                 <w:rFonts w:ascii="Times" w:eastAsia="Times" w:hAnsi="Times" w:cs="Times"/>
               </w:rPr>
@@ -479,6 +570,7 @@
         <w:tc>
           <w:tcPr>
             <w:tcW w:w="3679" w:type="dxa"/>
+            <w:vAlign w:val="center"/>
           </w:tcPr>
           <w:p>
             <w:pPr>
@@ -491,10 +583,10 @@
         <w:tc>
           <w:tcPr>
             <w:tcW w:w="2711" w:type="dxa"/>
-          </w:tcPr>
-          <w:p>
-            <w:pPr>
-              <w:jc w:val="center"/>
+            <w:vAlign w:val="center"/>
+          </w:tcPr>
+          <w:p>
+            <w:pPr>
               <w:rPr>
                 <w:rFonts w:ascii="Times" w:eastAsia="Times" w:hAnsi="Times" w:cs="Times"/>
               </w:rPr>
@@ -509,13 +601,12 @@
         <w:tc>
           <w:tcPr>
             <w:tcW w:w="1782" w:type="dxa"/>
-          </w:tcPr>
-          <w:p>
-            <w:pPr>
-              <w:jc w:val="center"/>
-              <w:rPr>
-                <w:rFonts w:ascii="Times" w:eastAsia="Times" w:hAnsi="Times" w:cs="Times"/>
-                <w:color w:val="385623" w:themeColor="accent6" w:themeShade="80"/>
+            <w:vAlign w:val="center"/>
+          </w:tcPr>
+          <w:p>
+            <w:pPr>
+              <w:rPr>
+                <w:rFonts w:ascii="Times" w:eastAsia="Times" w:hAnsi="Times" w:cs="Times"/>
               </w:rPr>
             </w:pPr>
           </w:p>
@@ -523,13 +614,12 @@
         <w:tc>
           <w:tcPr>
             <w:tcW w:w="913" w:type="dxa"/>
-          </w:tcPr>
-          <w:p>
-            <w:pPr>
-              <w:jc w:val="center"/>
-              <w:rPr>
-                <w:rFonts w:ascii="Times" w:eastAsia="Times" w:hAnsi="Times" w:cs="Times"/>
-                <w:color w:val="385623" w:themeColor="accent6" w:themeShade="80"/>
+            <w:vAlign w:val="center"/>
+          </w:tcPr>
+          <w:p>
+            <w:pPr>
+              <w:rPr>
+                <w:rFonts w:ascii="Times" w:eastAsia="Times" w:hAnsi="Times" w:cs="Times"/>
               </w:rPr>
             </w:pPr>
           </w:p>
@@ -537,12 +627,12 @@
         <w:tc>
           <w:tcPr>
             <w:tcW w:w="3679" w:type="dxa"/>
-          </w:tcPr>
-          <w:p>
-            <w:pPr>
-              <w:rPr>
-                <w:rFonts w:ascii="Times" w:eastAsia="Times" w:hAnsi="Times" w:cs="Times"/>
-                <w:color w:val="385623" w:themeColor="accent6" w:themeShade="80"/>
+            <w:vAlign w:val="center"/>
+          </w:tcPr>
+          <w:p>
+            <w:pPr>
+              <w:rPr>
+                <w:rFonts w:ascii="Times" w:eastAsia="Times" w:hAnsi="Times" w:cs="Times"/>
               </w:rPr>
             </w:pPr>
           </w:p>
@@ -550,13 +640,12 @@
         <w:tc>
           <w:tcPr>
             <w:tcW w:w="2711" w:type="dxa"/>
-          </w:tcPr>
-          <w:p>
-            <w:pPr>
-              <w:jc w:val="center"/>
-              <w:rPr>
-                <w:rFonts w:ascii="Times" w:eastAsia="Times" w:hAnsi="Times" w:cs="Times"/>
-                <w:color w:val="385623" w:themeColor="accent6" w:themeShade="80"/>
+            <w:vAlign w:val="center"/>
+          </w:tcPr>
+          <w:p>
+            <w:pPr>
+              <w:rPr>
+                <w:rFonts w:ascii="Times" w:eastAsia="Times" w:hAnsi="Times" w:cs="Times"/>
               </w:rPr>
             </w:pPr>
           </w:p>
@@ -569,13 +658,12 @@
         <w:tc>
           <w:tcPr>
             <w:tcW w:w="1782" w:type="dxa"/>
-          </w:tcPr>
-          <w:p>
-            <w:pPr>
-              <w:jc w:val="center"/>
-              <w:rPr>
-                <w:rFonts w:ascii="Times" w:eastAsia="Times" w:hAnsi="Times" w:cs="Times"/>
-                <w:color w:val="ED7D31" w:themeColor="accent2"/>
+            <w:vAlign w:val="center"/>
+          </w:tcPr>
+          <w:p>
+            <w:pPr>
+              <w:rPr>
+                <w:rFonts w:ascii="Times" w:eastAsia="Times" w:hAnsi="Times" w:cs="Times"/>
               </w:rPr>
             </w:pPr>
           </w:p>
@@ -583,13 +671,12 @@
         <w:tc>
           <w:tcPr>
             <w:tcW w:w="913" w:type="dxa"/>
-          </w:tcPr>
-          <w:p>
-            <w:pPr>
-              <w:jc w:val="center"/>
-              <w:rPr>
-                <w:rFonts w:ascii="Times" w:eastAsia="Times" w:hAnsi="Times" w:cs="Times"/>
-                <w:color w:val="ED7D31" w:themeColor="accent2"/>
+            <w:vAlign w:val="center"/>
+          </w:tcPr>
+          <w:p>
+            <w:pPr>
+              <w:rPr>
+                <w:rFonts w:ascii="Times" w:eastAsia="Times" w:hAnsi="Times" w:cs="Times"/>
               </w:rPr>
             </w:pPr>
           </w:p>
@@ -597,12 +684,12 @@
         <w:tc>
           <w:tcPr>
             <w:tcW w:w="3679" w:type="dxa"/>
-          </w:tcPr>
-          <w:p>
-            <w:pPr>
-              <w:rPr>
-                <w:rFonts w:ascii="Times" w:eastAsia="Times" w:hAnsi="Times" w:cs="Times"/>
-                <w:color w:val="ED7D31" w:themeColor="accent2"/>
+            <w:vAlign w:val="center"/>
+          </w:tcPr>
+          <w:p>
+            <w:pPr>
+              <w:rPr>
+                <w:rFonts w:ascii="Times" w:eastAsia="Times" w:hAnsi="Times" w:cs="Times"/>
               </w:rPr>
             </w:pPr>
           </w:p>
@@ -610,10 +697,10 @@
         <w:tc>
           <w:tcPr>
             <w:tcW w:w="2711" w:type="dxa"/>
-          </w:tcPr>
-          <w:p>
-            <w:pPr>
-              <w:jc w:val="center"/>
+            <w:vAlign w:val="center"/>
+          </w:tcPr>
+          <w:p>
+            <w:pPr>
               <w:rPr>
                 <w:rFonts w:ascii="Times" w:eastAsia="Times" w:hAnsi="Times" w:cs="Times"/>
               </w:rPr>
@@ -628,10 +715,10 @@
         <w:tc>
           <w:tcPr>
             <w:tcW w:w="1782" w:type="dxa"/>
-          </w:tcPr>
-          <w:p>
-            <w:pPr>
-              <w:jc w:val="center"/>
+            <w:vAlign w:val="center"/>
+          </w:tcPr>
+          <w:p>
+            <w:pPr>
               <w:rPr>
                 <w:rFonts w:ascii="Times" w:eastAsia="Times" w:hAnsi="Times" w:cs="Times"/>
               </w:rPr>
@@ -641,10 +728,10 @@
         <w:tc>
           <w:tcPr>
             <w:tcW w:w="913" w:type="dxa"/>
-          </w:tcPr>
-          <w:p>
-            <w:pPr>
-              <w:jc w:val="center"/>
+            <w:vAlign w:val="center"/>
+          </w:tcPr>
+          <w:p>
+            <w:pPr>
               <w:rPr>
                 <w:rFonts w:ascii="Times" w:eastAsia="Times" w:hAnsi="Times" w:cs="Times"/>
               </w:rPr>
@@ -654,6 +741,7 @@
         <w:tc>
           <w:tcPr>
             <w:tcW w:w="3679" w:type="dxa"/>
+            <w:vAlign w:val="center"/>
           </w:tcPr>
           <w:p>
             <w:pPr>
@@ -666,10 +754,10 @@
         <w:tc>
           <w:tcPr>
             <w:tcW w:w="2711" w:type="dxa"/>
-          </w:tcPr>
-          <w:p>
-            <w:pPr>
-              <w:jc w:val="center"/>
+            <w:vAlign w:val="center"/>
+          </w:tcPr>
+          <w:p>
+            <w:pPr>
               <w:rPr>
                 <w:rFonts w:ascii="Times" w:eastAsia="Times" w:hAnsi="Times" w:cs="Times"/>
               </w:rPr>
@@ -684,10 +772,10 @@
         <w:tc>
           <w:tcPr>
             <w:tcW w:w="1782" w:type="dxa"/>
-          </w:tcPr>
-          <w:p>
-            <w:pPr>
-              <w:jc w:val="center"/>
+            <w:vAlign w:val="center"/>
+          </w:tcPr>
+          <w:p>
+            <w:pPr>
               <w:rPr>
                 <w:rFonts w:ascii="Times" w:eastAsia="Times" w:hAnsi="Times" w:cs="Times"/>
               </w:rPr>
@@ -697,10 +785,10 @@
         <w:tc>
           <w:tcPr>
             <w:tcW w:w="913" w:type="dxa"/>
-          </w:tcPr>
-          <w:p>
-            <w:pPr>
-              <w:jc w:val="center"/>
+            <w:vAlign w:val="center"/>
+          </w:tcPr>
+          <w:p>
+            <w:pPr>
               <w:rPr>
                 <w:rFonts w:ascii="Times" w:eastAsia="Times" w:hAnsi="Times" w:cs="Times"/>
               </w:rPr>
@@ -710,6 +798,7 @@
         <w:tc>
           <w:tcPr>
             <w:tcW w:w="3679" w:type="dxa"/>
+            <w:vAlign w:val="center"/>
           </w:tcPr>
           <w:p>
             <w:pPr>
@@ -722,10 +811,10 @@
         <w:tc>
           <w:tcPr>
             <w:tcW w:w="2711" w:type="dxa"/>
-          </w:tcPr>
-          <w:p>
-            <w:pPr>
-              <w:jc w:val="center"/>
+            <w:vAlign w:val="center"/>
+          </w:tcPr>
+          <w:p>
+            <w:pPr>
               <w:rPr>
                 <w:rFonts w:ascii="Times" w:eastAsia="Times" w:hAnsi="Times" w:cs="Times"/>
               </w:rPr>
@@ -740,10 +829,10 @@
         <w:tc>
           <w:tcPr>
             <w:tcW w:w="1782" w:type="dxa"/>
-          </w:tcPr>
-          <w:p>
-            <w:pPr>
-              <w:jc w:val="center"/>
+            <w:vAlign w:val="center"/>
+          </w:tcPr>
+          <w:p>
+            <w:pPr>
               <w:rPr>
                 <w:rFonts w:ascii="Times" w:eastAsia="Times" w:hAnsi="Times" w:cs="Times"/>
               </w:rPr>
@@ -753,10 +842,10 @@
         <w:tc>
           <w:tcPr>
             <w:tcW w:w="913" w:type="dxa"/>
-          </w:tcPr>
-          <w:p>
-            <w:pPr>
-              <w:jc w:val="center"/>
+            <w:vAlign w:val="center"/>
+          </w:tcPr>
+          <w:p>
+            <w:pPr>
               <w:rPr>
                 <w:rFonts w:ascii="Times" w:eastAsia="Times" w:hAnsi="Times" w:cs="Times"/>
               </w:rPr>
@@ -766,6 +855,7 @@
         <w:tc>
           <w:tcPr>
             <w:tcW w:w="3679" w:type="dxa"/>
+            <w:vAlign w:val="center"/>
           </w:tcPr>
           <w:p>
             <w:pPr>
@@ -778,10 +868,10 @@
         <w:tc>
           <w:tcPr>
             <w:tcW w:w="2711" w:type="dxa"/>
-          </w:tcPr>
-          <w:p>
-            <w:pPr>
-              <w:jc w:val="center"/>
+            <w:vAlign w:val="center"/>
+          </w:tcPr>
+          <w:p>
+            <w:pPr>
               <w:rPr>
                 <w:rFonts w:ascii="Times" w:eastAsia="Times" w:hAnsi="Times" w:cs="Times"/>
               </w:rPr>
@@ -796,10 +886,10 @@
         <w:tc>
           <w:tcPr>
             <w:tcW w:w="1782" w:type="dxa"/>
-          </w:tcPr>
-          <w:p>
-            <w:pPr>
-              <w:jc w:val="center"/>
+            <w:vAlign w:val="center"/>
+          </w:tcPr>
+          <w:p>
+            <w:pPr>
               <w:rPr>
                 <w:rFonts w:ascii="Times" w:eastAsia="Times" w:hAnsi="Times" w:cs="Times"/>
               </w:rPr>
@@ -809,10 +899,10 @@
         <w:tc>
           <w:tcPr>
             <w:tcW w:w="913" w:type="dxa"/>
-          </w:tcPr>
-          <w:p>
-            <w:pPr>
-              <w:jc w:val="center"/>
+            <w:vAlign w:val="center"/>
+          </w:tcPr>
+          <w:p>
+            <w:pPr>
               <w:rPr>
                 <w:rFonts w:ascii="Times" w:eastAsia="Times" w:hAnsi="Times" w:cs="Times"/>
               </w:rPr>
@@ -822,6 +912,7 @@
         <w:tc>
           <w:tcPr>
             <w:tcW w:w="3679" w:type="dxa"/>
+            <w:vAlign w:val="center"/>
           </w:tcPr>
           <w:p>
             <w:pPr>
@@ -834,10 +925,10 @@
         <w:tc>
           <w:tcPr>
             <w:tcW w:w="2711" w:type="dxa"/>
-          </w:tcPr>
-          <w:p>
-            <w:pPr>
-              <w:jc w:val="center"/>
+            <w:vAlign w:val="center"/>
+          </w:tcPr>
+          <w:p>
+            <w:pPr>
               <w:rPr>
                 <w:rFonts w:ascii="Times" w:eastAsia="Times" w:hAnsi="Times" w:cs="Times"/>
               </w:rPr>
@@ -852,13 +943,12 @@
         <w:tc>
           <w:tcPr>
             <w:tcW w:w="1782" w:type="dxa"/>
-          </w:tcPr>
-          <w:p>
-            <w:pPr>
-              <w:jc w:val="center"/>
-              <w:rPr>
-                <w:rFonts w:ascii="Times" w:eastAsia="Times" w:hAnsi="Times" w:cs="Times"/>
-                <w:color w:val="ED7D31" w:themeColor="accent2"/>
+            <w:vAlign w:val="center"/>
+          </w:tcPr>
+          <w:p>
+            <w:pPr>
+              <w:rPr>
+                <w:rFonts w:ascii="Times" w:eastAsia="Times" w:hAnsi="Times" w:cs="Times"/>
               </w:rPr>
             </w:pPr>
           </w:p>
@@ -866,13 +956,12 @@
         <w:tc>
           <w:tcPr>
             <w:tcW w:w="913" w:type="dxa"/>
-          </w:tcPr>
-          <w:p>
-            <w:pPr>
-              <w:jc w:val="center"/>
-              <w:rPr>
-                <w:rFonts w:ascii="Times" w:eastAsia="Times" w:hAnsi="Times" w:cs="Times"/>
-                <w:color w:val="ED7D31" w:themeColor="accent2"/>
+            <w:vAlign w:val="center"/>
+          </w:tcPr>
+          <w:p>
+            <w:pPr>
+              <w:rPr>
+                <w:rFonts w:ascii="Times" w:eastAsia="Times" w:hAnsi="Times" w:cs="Times"/>
               </w:rPr>
             </w:pPr>
           </w:p>
@@ -880,12 +969,12 @@
         <w:tc>
           <w:tcPr>
             <w:tcW w:w="3679" w:type="dxa"/>
-          </w:tcPr>
-          <w:p>
-            <w:pPr>
-              <w:rPr>
-                <w:rFonts w:ascii="Times" w:eastAsia="Times" w:hAnsi="Times" w:cs="Times"/>
-                <w:color w:val="ED7D31" w:themeColor="accent2"/>
+            <w:vAlign w:val="center"/>
+          </w:tcPr>
+          <w:p>
+            <w:pPr>
+              <w:rPr>
+                <w:rFonts w:ascii="Times" w:eastAsia="Times" w:hAnsi="Times" w:cs="Times"/>
               </w:rPr>
             </w:pPr>
           </w:p>
@@ -893,10 +982,10 @@
         <w:tc>
           <w:tcPr>
             <w:tcW w:w="2711" w:type="dxa"/>
-          </w:tcPr>
-          <w:p>
-            <w:pPr>
-              <w:jc w:val="center"/>
+            <w:vAlign w:val="center"/>
+          </w:tcPr>
+          <w:p>
+            <w:pPr>
               <w:rPr>
                 <w:rFonts w:ascii="Times" w:eastAsia="Times" w:hAnsi="Times" w:cs="Times"/>
               </w:rPr>
@@ -911,20 +1000,17 @@
         <w:tc>
           <w:tcPr>
             <w:tcW w:w="1782" w:type="dxa"/>
-          </w:tcPr>
-          <w:p>
-            <w:pPr>
-              <w:jc w:val="center"/>
-            </w:pPr>
-          </w:p>
+            <w:vAlign w:val="center"/>
+          </w:tcPr>
+          <w:p/>
         </w:tc>
         <w:tc>
           <w:tcPr>
             <w:tcW w:w="913" w:type="dxa"/>
-          </w:tcPr>
-          <w:p>
-            <w:pPr>
-              <w:jc w:val="center"/>
+            <w:vAlign w:val="center"/>
+          </w:tcPr>
+          <w:p>
+            <w:pPr>
               <w:rPr>
                 <w:rFonts w:ascii="Times" w:eastAsia="Times" w:hAnsi="Times" w:cs="Times"/>
               </w:rPr>
@@ -934,6 +1020,7 @@
         <w:tc>
           <w:tcPr>
             <w:tcW w:w="3679" w:type="dxa"/>
+            <w:vAlign w:val="center"/>
           </w:tcPr>
           <w:p>
             <w:pPr>
@@ -946,10 +1033,10 @@
         <w:tc>
           <w:tcPr>
             <w:tcW w:w="2711" w:type="dxa"/>
-          </w:tcPr>
-          <w:p>
-            <w:pPr>
-              <w:jc w:val="center"/>
+            <w:vAlign w:val="center"/>
+          </w:tcPr>
+          <w:p>
+            <w:pPr>
               <w:rPr>
                 <w:rFonts w:ascii="Times" w:eastAsia="Times" w:hAnsi="Times" w:cs="Times"/>
               </w:rPr>
@@ -964,20 +1051,17 @@
         <w:tc>
           <w:tcPr>
             <w:tcW w:w="1782" w:type="dxa"/>
-          </w:tcPr>
-          <w:p>
-            <w:pPr>
-              <w:jc w:val="center"/>
-            </w:pPr>
-          </w:p>
+            <w:vAlign w:val="center"/>
+          </w:tcPr>
+          <w:p/>
         </w:tc>
         <w:tc>
           <w:tcPr>
             <w:tcW w:w="913" w:type="dxa"/>
-          </w:tcPr>
-          <w:p>
-            <w:pPr>
-              <w:jc w:val="center"/>
+            <w:vAlign w:val="center"/>
+          </w:tcPr>
+          <w:p>
+            <w:pPr>
               <w:rPr>
                 <w:rFonts w:ascii="Times" w:eastAsia="Times" w:hAnsi="Times" w:cs="Times"/>
               </w:rPr>
@@ -987,6 +1071,7 @@
         <w:tc>
           <w:tcPr>
             <w:tcW w:w="3679" w:type="dxa"/>
+            <w:vAlign w:val="center"/>
           </w:tcPr>
           <w:p>
             <w:pPr>
@@ -999,10 +1084,10 @@
         <w:tc>
           <w:tcPr>
             <w:tcW w:w="2711" w:type="dxa"/>
-          </w:tcPr>
-          <w:p>
-            <w:pPr>
-              <w:jc w:val="center"/>
+            <w:vAlign w:val="center"/>
+          </w:tcPr>
+          <w:p>
+            <w:pPr>
               <w:rPr>
                 <w:rFonts w:ascii="Times" w:eastAsia="Times" w:hAnsi="Times" w:cs="Times"/>
               </w:rPr>
@@ -1017,20 +1102,17 @@
         <w:tc>
           <w:tcPr>
             <w:tcW w:w="1782" w:type="dxa"/>
-          </w:tcPr>
-          <w:p>
-            <w:pPr>
-              <w:jc w:val="center"/>
-            </w:pPr>
-          </w:p>
+            <w:vAlign w:val="center"/>
+          </w:tcPr>
+          <w:p/>
         </w:tc>
         <w:tc>
           <w:tcPr>
             <w:tcW w:w="913" w:type="dxa"/>
-          </w:tcPr>
-          <w:p>
-            <w:pPr>
-              <w:jc w:val="center"/>
+            <w:vAlign w:val="center"/>
+          </w:tcPr>
+          <w:p>
+            <w:pPr>
               <w:rPr>
                 <w:rFonts w:ascii="Times" w:eastAsia="Times" w:hAnsi="Times" w:cs="Times"/>
               </w:rPr>
@@ -1040,6 +1122,7 @@
         <w:tc>
           <w:tcPr>
             <w:tcW w:w="3679" w:type="dxa"/>
+            <w:vAlign w:val="center"/>
           </w:tcPr>
           <w:p>
             <w:pPr>
@@ -1052,10 +1135,10 @@
         <w:tc>
           <w:tcPr>
             <w:tcW w:w="2711" w:type="dxa"/>
-          </w:tcPr>
-          <w:p>
-            <w:pPr>
-              <w:jc w:val="center"/>
+            <w:vAlign w:val="center"/>
+          </w:tcPr>
+          <w:p>
+            <w:pPr>
               <w:rPr>
                 <w:rFonts w:ascii="Times" w:eastAsia="Times" w:hAnsi="Times" w:cs="Times"/>
               </w:rPr>
@@ -1070,26 +1153,19 @@
         <w:tc>
           <w:tcPr>
             <w:tcW w:w="1782" w:type="dxa"/>
-          </w:tcPr>
-          <w:p>
-            <w:pPr>
-              <w:jc w:val="center"/>
-              <w:rPr>
-                <w:color w:val="ED7D31" w:themeColor="accent2"/>
-              </w:rPr>
-            </w:pPr>
-          </w:p>
+            <w:vAlign w:val="center"/>
+          </w:tcPr>
+          <w:p/>
         </w:tc>
         <w:tc>
           <w:tcPr>
             <w:tcW w:w="913" w:type="dxa"/>
-          </w:tcPr>
-          <w:p>
-            <w:pPr>
-              <w:jc w:val="center"/>
-              <w:rPr>
-                <w:rFonts w:ascii="Times" w:eastAsia="Times" w:hAnsi="Times" w:cs="Times"/>
-                <w:color w:val="ED7D31" w:themeColor="accent2"/>
+            <w:vAlign w:val="center"/>
+          </w:tcPr>
+          <w:p>
+            <w:pPr>
+              <w:rPr>
+                <w:rFonts w:ascii="Times" w:eastAsia="Times" w:hAnsi="Times" w:cs="Times"/>
               </w:rPr>
             </w:pPr>
           </w:p>
@@ -1097,12 +1173,12 @@
         <w:tc>
           <w:tcPr>
             <w:tcW w:w="3679" w:type="dxa"/>
-          </w:tcPr>
-          <w:p>
-            <w:pPr>
-              <w:rPr>
-                <w:rFonts w:ascii="Times" w:eastAsia="Times" w:hAnsi="Times" w:cs="Times"/>
-                <w:color w:val="ED7D31" w:themeColor="accent2"/>
+            <w:vAlign w:val="center"/>
+          </w:tcPr>
+          <w:p>
+            <w:pPr>
+              <w:rPr>
+                <w:rFonts w:ascii="Times" w:eastAsia="Times" w:hAnsi="Times" w:cs="Times"/>
               </w:rPr>
             </w:pPr>
           </w:p>
@@ -1110,10 +1186,10 @@
         <w:tc>
           <w:tcPr>
             <w:tcW w:w="2711" w:type="dxa"/>
-          </w:tcPr>
-          <w:p>
-            <w:pPr>
-              <w:jc w:val="center"/>
+            <w:vAlign w:val="center"/>
+          </w:tcPr>
+          <w:p>
+            <w:pPr>
               <w:rPr>
                 <w:rFonts w:ascii="Times" w:eastAsia="Times" w:hAnsi="Times" w:cs="Times"/>
               </w:rPr>
@@ -1128,20 +1204,17 @@
         <w:tc>
           <w:tcPr>
             <w:tcW w:w="1782" w:type="dxa"/>
-          </w:tcPr>
-          <w:p>
-            <w:pPr>
-              <w:jc w:val="center"/>
-            </w:pPr>
-          </w:p>
+            <w:vAlign w:val="center"/>
+          </w:tcPr>
+          <w:p/>
         </w:tc>
         <w:tc>
           <w:tcPr>
             <w:tcW w:w="913" w:type="dxa"/>
-          </w:tcPr>
-          <w:p>
-            <w:pPr>
-              <w:jc w:val="center"/>
+            <w:vAlign w:val="center"/>
+          </w:tcPr>
+          <w:p>
+            <w:pPr>
               <w:rPr>
                 <w:rFonts w:ascii="Times" w:eastAsia="Times" w:hAnsi="Times" w:cs="Times"/>
               </w:rPr>
@@ -1151,6 +1224,7 @@
         <w:tc>
           <w:tcPr>
             <w:tcW w:w="3679" w:type="dxa"/>
+            <w:vAlign w:val="center"/>
           </w:tcPr>
           <w:p>
             <w:pPr>
@@ -1163,10 +1237,10 @@
         <w:tc>
           <w:tcPr>
             <w:tcW w:w="2711" w:type="dxa"/>
-          </w:tcPr>
-          <w:p>
-            <w:pPr>
-              <w:jc w:val="center"/>
+            <w:vAlign w:val="center"/>
+          </w:tcPr>
+          <w:p>
+            <w:pPr>
               <w:rPr>
                 <w:rFonts w:ascii="Times" w:eastAsia="Times" w:hAnsi="Times" w:cs="Times"/>
               </w:rPr>
@@ -1181,26 +1255,19 @@
         <w:tc>
           <w:tcPr>
             <w:tcW w:w="1782" w:type="dxa"/>
-          </w:tcPr>
-          <w:p>
-            <w:pPr>
-              <w:jc w:val="center"/>
-              <w:rPr>
-                <w:color w:val="ED7D31" w:themeColor="accent2"/>
-              </w:rPr>
-            </w:pPr>
-          </w:p>
+            <w:vAlign w:val="center"/>
+          </w:tcPr>
+          <w:p/>
         </w:tc>
         <w:tc>
           <w:tcPr>
             <w:tcW w:w="913" w:type="dxa"/>
-          </w:tcPr>
-          <w:p>
-            <w:pPr>
-              <w:jc w:val="center"/>
-              <w:rPr>
-                <w:rFonts w:ascii="Times" w:eastAsia="Times" w:hAnsi="Times" w:cs="Times"/>
-                <w:color w:val="ED7D31" w:themeColor="accent2"/>
+            <w:vAlign w:val="center"/>
+          </w:tcPr>
+          <w:p>
+            <w:pPr>
+              <w:rPr>
+                <w:rFonts w:ascii="Times" w:eastAsia="Times" w:hAnsi="Times" w:cs="Times"/>
               </w:rPr>
             </w:pPr>
           </w:p>
@@ -1208,12 +1275,12 @@
         <w:tc>
           <w:tcPr>
             <w:tcW w:w="3679" w:type="dxa"/>
-          </w:tcPr>
-          <w:p>
-            <w:pPr>
-              <w:rPr>
-                <w:rFonts w:ascii="Times" w:eastAsia="Times" w:hAnsi="Times" w:cs="Times"/>
-                <w:color w:val="ED7D31" w:themeColor="accent2"/>
+            <w:vAlign w:val="center"/>
+          </w:tcPr>
+          <w:p>
+            <w:pPr>
+              <w:rPr>
+                <w:rFonts w:ascii="Times" w:eastAsia="Times" w:hAnsi="Times" w:cs="Times"/>
               </w:rPr>
             </w:pPr>
           </w:p>
@@ -1221,10 +1288,10 @@
         <w:tc>
           <w:tcPr>
             <w:tcW w:w="2711" w:type="dxa"/>
-          </w:tcPr>
-          <w:p>
-            <w:pPr>
-              <w:jc w:val="center"/>
+            <w:vAlign w:val="center"/>
+          </w:tcPr>
+          <w:p>
+            <w:pPr>
               <w:rPr>
                 <w:rFonts w:ascii="Times" w:eastAsia="Times" w:hAnsi="Times" w:cs="Times"/>
               </w:rPr>
@@ -1239,26 +1306,19 @@
         <w:tc>
           <w:tcPr>
             <w:tcW w:w="1782" w:type="dxa"/>
-          </w:tcPr>
-          <w:p>
-            <w:pPr>
-              <w:jc w:val="center"/>
-              <w:rPr>
-                <w:color w:val="ED7D31" w:themeColor="accent2"/>
-              </w:rPr>
-            </w:pPr>
-          </w:p>
+            <w:vAlign w:val="center"/>
+          </w:tcPr>
+          <w:p/>
         </w:tc>
         <w:tc>
           <w:tcPr>
             <w:tcW w:w="913" w:type="dxa"/>
-          </w:tcPr>
-          <w:p>
-            <w:pPr>
-              <w:jc w:val="center"/>
-              <w:rPr>
-                <w:rFonts w:ascii="Times" w:eastAsia="Times" w:hAnsi="Times" w:cs="Times"/>
-                <w:color w:val="ED7D31" w:themeColor="accent2"/>
+            <w:vAlign w:val="center"/>
+          </w:tcPr>
+          <w:p>
+            <w:pPr>
+              <w:rPr>
+                <w:rFonts w:ascii="Times" w:eastAsia="Times" w:hAnsi="Times" w:cs="Times"/>
               </w:rPr>
             </w:pPr>
           </w:p>
@@ -1266,12 +1326,12 @@
         <w:tc>
           <w:tcPr>
             <w:tcW w:w="3679" w:type="dxa"/>
-          </w:tcPr>
-          <w:p>
-            <w:pPr>
-              <w:rPr>
-                <w:rFonts w:ascii="Times" w:eastAsia="Times" w:hAnsi="Times" w:cs="Times"/>
-                <w:color w:val="ED7D31" w:themeColor="accent2"/>
+            <w:vAlign w:val="center"/>
+          </w:tcPr>
+          <w:p>
+            <w:pPr>
+              <w:rPr>
+                <w:rFonts w:ascii="Times" w:eastAsia="Times" w:hAnsi="Times" w:cs="Times"/>
               </w:rPr>
             </w:pPr>
           </w:p>
@@ -1279,10 +1339,10 @@
         <w:tc>
           <w:tcPr>
             <w:tcW w:w="2711" w:type="dxa"/>
-          </w:tcPr>
-          <w:p>
-            <w:pPr>
-              <w:jc w:val="center"/>
+            <w:vAlign w:val="center"/>
+          </w:tcPr>
+          <w:p>
+            <w:pPr>
               <w:rPr>
                 <w:rFonts w:ascii="Times" w:eastAsia="Times" w:hAnsi="Times" w:cs="Times"/>
               </w:rPr>
@@ -1297,20 +1357,17 @@
         <w:tc>
           <w:tcPr>
             <w:tcW w:w="1782" w:type="dxa"/>
-          </w:tcPr>
-          <w:p>
-            <w:pPr>
-              <w:jc w:val="center"/>
-            </w:pPr>
-          </w:p>
+            <w:vAlign w:val="center"/>
+          </w:tcPr>
+          <w:p/>
         </w:tc>
         <w:tc>
           <w:tcPr>
             <w:tcW w:w="913" w:type="dxa"/>
-          </w:tcPr>
-          <w:p>
-            <w:pPr>
-              <w:jc w:val="center"/>
+            <w:vAlign w:val="center"/>
+          </w:tcPr>
+          <w:p>
+            <w:pPr>
               <w:rPr>
                 <w:rFonts w:ascii="Times" w:eastAsia="Times" w:hAnsi="Times" w:cs="Times"/>
               </w:rPr>
@@ -1320,6 +1377,7 @@
         <w:tc>
           <w:tcPr>
             <w:tcW w:w="3679" w:type="dxa"/>
+            <w:vAlign w:val="center"/>
           </w:tcPr>
           <w:p>
             <w:pPr>
@@ -1332,10 +1390,10 @@
         <w:tc>
           <w:tcPr>
             <w:tcW w:w="2711" w:type="dxa"/>
-          </w:tcPr>
-          <w:p>
-            <w:pPr>
-              <w:jc w:val="center"/>
+            <w:vAlign w:val="center"/>
+          </w:tcPr>
+          <w:p>
+            <w:pPr>
               <w:rPr>
                 <w:rFonts w:ascii="Times" w:eastAsia="Times" w:hAnsi="Times" w:cs="Times"/>
               </w:rPr>
@@ -1350,20 +1408,17 @@
         <w:tc>
           <w:tcPr>
             <w:tcW w:w="1782" w:type="dxa"/>
-          </w:tcPr>
-          <w:p>
-            <w:pPr>
-              <w:jc w:val="center"/>
-            </w:pPr>
-          </w:p>
+            <w:vAlign w:val="center"/>
+          </w:tcPr>
+          <w:p/>
         </w:tc>
         <w:tc>
           <w:tcPr>
             <w:tcW w:w="913" w:type="dxa"/>
-          </w:tcPr>
-          <w:p>
-            <w:pPr>
-              <w:jc w:val="center"/>
+            <w:vAlign w:val="center"/>
+          </w:tcPr>
+          <w:p>
+            <w:pPr>
               <w:rPr>
                 <w:rFonts w:ascii="Times" w:eastAsia="Times" w:hAnsi="Times" w:cs="Times"/>
               </w:rPr>
@@ -1373,6 +1428,7 @@
         <w:tc>
           <w:tcPr>
             <w:tcW w:w="3679" w:type="dxa"/>
+            <w:vAlign w:val="center"/>
           </w:tcPr>
           <w:p>
             <w:pPr>
@@ -1385,10 +1441,10 @@
         <w:tc>
           <w:tcPr>
             <w:tcW w:w="2711" w:type="dxa"/>
-          </w:tcPr>
-          <w:p>
-            <w:pPr>
-              <w:jc w:val="center"/>
+            <w:vAlign w:val="center"/>
+          </w:tcPr>
+          <w:p>
+            <w:pPr>
               <w:rPr>
                 <w:rFonts w:ascii="Times" w:eastAsia="Times" w:hAnsi="Times" w:cs="Times"/>
               </w:rPr>
@@ -1403,20 +1459,17 @@
         <w:tc>
           <w:tcPr>
             <w:tcW w:w="1782" w:type="dxa"/>
-          </w:tcPr>
-          <w:p>
-            <w:pPr>
-              <w:jc w:val="center"/>
-            </w:pPr>
-          </w:p>
+            <w:vAlign w:val="center"/>
+          </w:tcPr>
+          <w:p/>
         </w:tc>
         <w:tc>
           <w:tcPr>
             <w:tcW w:w="913" w:type="dxa"/>
-          </w:tcPr>
-          <w:p>
-            <w:pPr>
-              <w:jc w:val="center"/>
+            <w:vAlign w:val="center"/>
+          </w:tcPr>
+          <w:p>
+            <w:pPr>
               <w:rPr>
                 <w:rFonts w:ascii="Times" w:eastAsia="Times" w:hAnsi="Times" w:cs="Times"/>
               </w:rPr>
@@ -1426,6 +1479,7 @@
         <w:tc>
           <w:tcPr>
             <w:tcW w:w="3679" w:type="dxa"/>
+            <w:vAlign w:val="center"/>
           </w:tcPr>
           <w:p>
             <w:pPr>
@@ -1438,10 +1492,10 @@
         <w:tc>
           <w:tcPr>
             <w:tcW w:w="2711" w:type="dxa"/>
-          </w:tcPr>
-          <w:p>
-            <w:pPr>
-              <w:jc w:val="center"/>
+            <w:vAlign w:val="center"/>
+          </w:tcPr>
+          <w:p>
+            <w:pPr>
               <w:rPr>
                 <w:rFonts w:ascii="Times" w:eastAsia="Times" w:hAnsi="Times" w:cs="Times"/>
               </w:rPr>
@@ -1456,20 +1510,17 @@
         <w:tc>
           <w:tcPr>
             <w:tcW w:w="1782" w:type="dxa"/>
-          </w:tcPr>
-          <w:p>
-            <w:pPr>
-              <w:jc w:val="center"/>
-            </w:pPr>
-          </w:p>
+            <w:vAlign w:val="center"/>
+          </w:tcPr>
+          <w:p/>
         </w:tc>
         <w:tc>
           <w:tcPr>
             <w:tcW w:w="913" w:type="dxa"/>
-          </w:tcPr>
-          <w:p>
-            <w:pPr>
-              <w:jc w:val="center"/>
+            <w:vAlign w:val="center"/>
+          </w:tcPr>
+          <w:p>
+            <w:pPr>
               <w:rPr>
                 <w:rFonts w:ascii="Times" w:eastAsia="Times" w:hAnsi="Times" w:cs="Times"/>
               </w:rPr>
@@ -1479,6 +1530,7 @@
         <w:tc>
           <w:tcPr>
             <w:tcW w:w="3679" w:type="dxa"/>
+            <w:vAlign w:val="center"/>
           </w:tcPr>
           <w:p>
             <w:pPr>
@@ -1491,10 +1543,10 @@
         <w:tc>
           <w:tcPr>
             <w:tcW w:w="2711" w:type="dxa"/>
-          </w:tcPr>
-          <w:p>
-            <w:pPr>
-              <w:jc w:val="center"/>
+            <w:vAlign w:val="center"/>
+          </w:tcPr>
+          <w:p>
+            <w:pPr>
               <w:rPr>
                 <w:rFonts w:ascii="Times" w:eastAsia="Times" w:hAnsi="Times" w:cs="Times"/>
               </w:rPr>
@@ -1509,20 +1561,17 @@
         <w:tc>
           <w:tcPr>
             <w:tcW w:w="1782" w:type="dxa"/>
-          </w:tcPr>
-          <w:p>
-            <w:pPr>
-              <w:jc w:val="center"/>
-            </w:pPr>
-          </w:p>
+            <w:vAlign w:val="center"/>
+          </w:tcPr>
+          <w:p/>
         </w:tc>
         <w:tc>
           <w:tcPr>
             <w:tcW w:w="913" w:type="dxa"/>
-          </w:tcPr>
-          <w:p>
-            <w:pPr>
-              <w:jc w:val="center"/>
+            <w:vAlign w:val="center"/>
+          </w:tcPr>
+          <w:p>
+            <w:pPr>
               <w:rPr>
                 <w:rFonts w:ascii="Times" w:eastAsia="Times" w:hAnsi="Times" w:cs="Times"/>
               </w:rPr>
@@ -1532,6 +1581,7 @@
         <w:tc>
           <w:tcPr>
             <w:tcW w:w="3679" w:type="dxa"/>
+            <w:vAlign w:val="center"/>
           </w:tcPr>
           <w:p>
             <w:pPr>
@@ -1544,10 +1594,10 @@
         <w:tc>
           <w:tcPr>
             <w:tcW w:w="2711" w:type="dxa"/>
-          </w:tcPr>
-          <w:p>
-            <w:pPr>
-              <w:jc w:val="center"/>
+            <w:vAlign w:val="center"/>
+          </w:tcPr>
+          <w:p>
+            <w:pPr>
               <w:rPr>
                 <w:rFonts w:ascii="Times" w:eastAsia="Times" w:hAnsi="Times" w:cs="Times"/>
               </w:rPr>
@@ -1562,20 +1612,17 @@
         <w:tc>
           <w:tcPr>
             <w:tcW w:w="1782" w:type="dxa"/>
-          </w:tcPr>
-          <w:p>
-            <w:pPr>
-              <w:jc w:val="center"/>
-            </w:pPr>
-          </w:p>
+            <w:vAlign w:val="center"/>
+          </w:tcPr>
+          <w:p/>
         </w:tc>
         <w:tc>
           <w:tcPr>
             <w:tcW w:w="913" w:type="dxa"/>
-          </w:tcPr>
-          <w:p>
-            <w:pPr>
-              <w:jc w:val="center"/>
+            <w:vAlign w:val="center"/>
+          </w:tcPr>
+          <w:p>
+            <w:pPr>
               <w:rPr>
                 <w:rFonts w:ascii="Times" w:eastAsia="Times" w:hAnsi="Times" w:cs="Times"/>
               </w:rPr>
@@ -1585,6 +1632,7 @@
         <w:tc>
           <w:tcPr>
             <w:tcW w:w="3679" w:type="dxa"/>
+            <w:vAlign w:val="center"/>
           </w:tcPr>
           <w:p>
             <w:pPr>
@@ -1597,10 +1645,10 @@
         <w:tc>
           <w:tcPr>
             <w:tcW w:w="2711" w:type="dxa"/>
-          </w:tcPr>
-          <w:p>
-            <w:pPr>
-              <w:jc w:val="center"/>
+            <w:vAlign w:val="center"/>
+          </w:tcPr>
+          <w:p>
+            <w:pPr>
               <w:rPr>
                 <w:rFonts w:ascii="Times" w:eastAsia="Times" w:hAnsi="Times" w:cs="Times"/>
               </w:rPr>
@@ -1615,20 +1663,17 @@
         <w:tc>
           <w:tcPr>
             <w:tcW w:w="1782" w:type="dxa"/>
-          </w:tcPr>
-          <w:p>
-            <w:pPr>
-              <w:jc w:val="center"/>
-            </w:pPr>
-          </w:p>
+            <w:vAlign w:val="center"/>
+          </w:tcPr>
+          <w:p/>
         </w:tc>
         <w:tc>
           <w:tcPr>
             <w:tcW w:w="913" w:type="dxa"/>
-          </w:tcPr>
-          <w:p>
-            <w:pPr>
-              <w:jc w:val="center"/>
+            <w:vAlign w:val="center"/>
+          </w:tcPr>
+          <w:p>
+            <w:pPr>
               <w:rPr>
                 <w:rFonts w:ascii="Times" w:eastAsia="Times" w:hAnsi="Times" w:cs="Times"/>
               </w:rPr>
@@ -1638,6 +1683,7 @@
         <w:tc>
           <w:tcPr>
             <w:tcW w:w="3679" w:type="dxa"/>
+            <w:vAlign w:val="center"/>
           </w:tcPr>
           <w:p>
             <w:pPr>
@@ -1650,10 +1696,10 @@
         <w:tc>
           <w:tcPr>
             <w:tcW w:w="2711" w:type="dxa"/>
-          </w:tcPr>
-          <w:p>
-            <w:pPr>
-              <w:jc w:val="center"/>
+            <w:vAlign w:val="center"/>
+          </w:tcPr>
+          <w:p>
+            <w:pPr>
               <w:rPr>
                 <w:rFonts w:ascii="Times" w:eastAsia="Times" w:hAnsi="Times" w:cs="Times"/>
               </w:rPr>
@@ -1668,20 +1714,17 @@
         <w:tc>
           <w:tcPr>
             <w:tcW w:w="1782" w:type="dxa"/>
-          </w:tcPr>
-          <w:p>
-            <w:pPr>
-              <w:jc w:val="center"/>
-            </w:pPr>
-          </w:p>
+            <w:vAlign w:val="center"/>
+          </w:tcPr>
+          <w:p/>
         </w:tc>
         <w:tc>
           <w:tcPr>
             <w:tcW w:w="913" w:type="dxa"/>
-          </w:tcPr>
-          <w:p>
-            <w:pPr>
-              <w:jc w:val="center"/>
+            <w:vAlign w:val="center"/>
+          </w:tcPr>
+          <w:p>
+            <w:pPr>
               <w:rPr>
                 <w:rFonts w:ascii="Times" w:eastAsia="Times" w:hAnsi="Times" w:cs="Times"/>
               </w:rPr>
@@ -1691,6 +1734,7 @@
         <w:tc>
           <w:tcPr>
             <w:tcW w:w="3679" w:type="dxa"/>
+            <w:vAlign w:val="center"/>
           </w:tcPr>
           <w:p>
             <w:pPr>
@@ -1703,10 +1747,10 @@
         <w:tc>
           <w:tcPr>
             <w:tcW w:w="2711" w:type="dxa"/>
-          </w:tcPr>
-          <w:p>
-            <w:pPr>
-              <w:jc w:val="center"/>
+            <w:vAlign w:val="center"/>
+          </w:tcPr>
+          <w:p>
+            <w:pPr>
               <w:rPr>
                 <w:rFonts w:ascii="Times" w:eastAsia="Times" w:hAnsi="Times" w:cs="Times"/>
               </w:rPr>
@@ -1721,20 +1765,17 @@
         <w:tc>
           <w:tcPr>
             <w:tcW w:w="1782" w:type="dxa"/>
-          </w:tcPr>
-          <w:p>
-            <w:pPr>
-              <w:jc w:val="center"/>
-            </w:pPr>
-          </w:p>
+            <w:vAlign w:val="center"/>
+          </w:tcPr>
+          <w:p/>
         </w:tc>
         <w:tc>
           <w:tcPr>
             <w:tcW w:w="913" w:type="dxa"/>
-          </w:tcPr>
-          <w:p>
-            <w:pPr>
-              <w:jc w:val="center"/>
+            <w:vAlign w:val="center"/>
+          </w:tcPr>
+          <w:p>
+            <w:pPr>
               <w:rPr>
                 <w:rFonts w:ascii="Times" w:eastAsia="Times" w:hAnsi="Times" w:cs="Times"/>
               </w:rPr>
@@ -1744,6 +1785,7 @@
         <w:tc>
           <w:tcPr>
             <w:tcW w:w="3679" w:type="dxa"/>
+            <w:vAlign w:val="center"/>
           </w:tcPr>
           <w:p>
             <w:pPr>
@@ -1756,10 +1798,10 @@
         <w:tc>
           <w:tcPr>
             <w:tcW w:w="2711" w:type="dxa"/>
-          </w:tcPr>
-          <w:p>
-            <w:pPr>
-              <w:jc w:val="center"/>
+            <w:vAlign w:val="center"/>
+          </w:tcPr>
+          <w:p>
+            <w:pPr>
               <w:rPr>
                 <w:rFonts w:ascii="Times" w:eastAsia="Times" w:hAnsi="Times" w:cs="Times"/>
               </w:rPr>
@@ -1774,20 +1816,17 @@
         <w:tc>
           <w:tcPr>
             <w:tcW w:w="1782" w:type="dxa"/>
-          </w:tcPr>
-          <w:p>
-            <w:pPr>
-              <w:jc w:val="center"/>
-            </w:pPr>
-          </w:p>
+            <w:vAlign w:val="center"/>
+          </w:tcPr>
+          <w:p/>
         </w:tc>
         <w:tc>
           <w:tcPr>
             <w:tcW w:w="913" w:type="dxa"/>
-          </w:tcPr>
-          <w:p>
-            <w:pPr>
-              <w:jc w:val="center"/>
+            <w:vAlign w:val="center"/>
+          </w:tcPr>
+          <w:p>
+            <w:pPr>
               <w:rPr>
                 <w:rFonts w:ascii="Times" w:eastAsia="Times" w:hAnsi="Times" w:cs="Times"/>
               </w:rPr>
@@ -1797,6 +1836,7 @@
         <w:tc>
           <w:tcPr>
             <w:tcW w:w="3679" w:type="dxa"/>
+            <w:vAlign w:val="center"/>
           </w:tcPr>
           <w:p>
             <w:pPr>
@@ -1809,10 +1849,10 @@
         <w:tc>
           <w:tcPr>
             <w:tcW w:w="2711" w:type="dxa"/>
-          </w:tcPr>
-          <w:p>
-            <w:pPr>
-              <w:jc w:val="center"/>
+            <w:vAlign w:val="center"/>
+          </w:tcPr>
+          <w:p>
+            <w:pPr>
               <w:rPr>
                 <w:rFonts w:ascii="Times" w:eastAsia="Times" w:hAnsi="Times" w:cs="Times"/>
               </w:rPr>
@@ -1827,26 +1867,19 @@
         <w:tc>
           <w:tcPr>
             <w:tcW w:w="1782" w:type="dxa"/>
-          </w:tcPr>
-          <w:p>
-            <w:pPr>
-              <w:jc w:val="center"/>
-              <w:rPr>
-                <w:color w:val="ED7D31" w:themeColor="accent2"/>
-              </w:rPr>
-            </w:pPr>
-          </w:p>
+            <w:vAlign w:val="center"/>
+          </w:tcPr>
+          <w:p/>
         </w:tc>
         <w:tc>
           <w:tcPr>
             <w:tcW w:w="913" w:type="dxa"/>
-          </w:tcPr>
-          <w:p>
-            <w:pPr>
-              <w:jc w:val="center"/>
-              <w:rPr>
-                <w:rFonts w:ascii="Times" w:eastAsia="Times" w:hAnsi="Times" w:cs="Times"/>
-                <w:color w:val="ED7D31" w:themeColor="accent2"/>
+            <w:vAlign w:val="center"/>
+          </w:tcPr>
+          <w:p>
+            <w:pPr>
+              <w:rPr>
+                <w:rFonts w:ascii="Times" w:eastAsia="Times" w:hAnsi="Times" w:cs="Times"/>
               </w:rPr>
             </w:pPr>
           </w:p>
@@ -1854,12 +1887,12 @@
         <w:tc>
           <w:tcPr>
             <w:tcW w:w="3679" w:type="dxa"/>
-          </w:tcPr>
-          <w:p>
-            <w:pPr>
-              <w:rPr>
-                <w:rFonts w:ascii="Times" w:eastAsia="Times" w:hAnsi="Times" w:cs="Times"/>
-                <w:color w:val="ED7D31" w:themeColor="accent2"/>
+            <w:vAlign w:val="center"/>
+          </w:tcPr>
+          <w:p>
+            <w:pPr>
+              <w:rPr>
+                <w:rFonts w:ascii="Times" w:eastAsia="Times" w:hAnsi="Times" w:cs="Times"/>
               </w:rPr>
             </w:pPr>
           </w:p>
@@ -1867,10 +1900,10 @@
         <w:tc>
           <w:tcPr>
             <w:tcW w:w="2711" w:type="dxa"/>
-          </w:tcPr>
-          <w:p>
-            <w:pPr>
-              <w:jc w:val="center"/>
+            <w:vAlign w:val="center"/>
+          </w:tcPr>
+          <w:p>
+            <w:pPr>
               <w:rPr>
                 <w:rFonts w:ascii="Times" w:eastAsia="Times" w:hAnsi="Times" w:cs="Times"/>
               </w:rPr>
@@ -1885,26 +1918,19 @@
         <w:tc>
           <w:tcPr>
             <w:tcW w:w="1782" w:type="dxa"/>
-          </w:tcPr>
-          <w:p>
-            <w:pPr>
-              <w:jc w:val="center"/>
-              <w:rPr>
-                <w:color w:val="ED7D31" w:themeColor="accent2"/>
-              </w:rPr>
-            </w:pPr>
-          </w:p>
+            <w:vAlign w:val="center"/>
+          </w:tcPr>
+          <w:p/>
         </w:tc>
         <w:tc>
           <w:tcPr>
             <w:tcW w:w="913" w:type="dxa"/>
-          </w:tcPr>
-          <w:p>
-            <w:pPr>
-              <w:jc w:val="center"/>
-              <w:rPr>
-                <w:rFonts w:ascii="Times" w:eastAsia="Times" w:hAnsi="Times" w:cs="Times"/>
-                <w:color w:val="ED7D31" w:themeColor="accent2"/>
+            <w:vAlign w:val="center"/>
+          </w:tcPr>
+          <w:p>
+            <w:pPr>
+              <w:rPr>
+                <w:rFonts w:ascii="Times" w:eastAsia="Times" w:hAnsi="Times" w:cs="Times"/>
               </w:rPr>
             </w:pPr>
           </w:p>
@@ -1912,12 +1938,12 @@
         <w:tc>
           <w:tcPr>
             <w:tcW w:w="3679" w:type="dxa"/>
-          </w:tcPr>
-          <w:p>
-            <w:pPr>
-              <w:rPr>
-                <w:rFonts w:ascii="Times" w:eastAsia="Times" w:hAnsi="Times" w:cs="Times"/>
-                <w:color w:val="ED7D31" w:themeColor="accent2"/>
+            <w:vAlign w:val="center"/>
+          </w:tcPr>
+          <w:p>
+            <w:pPr>
+              <w:rPr>
+                <w:rFonts w:ascii="Times" w:eastAsia="Times" w:hAnsi="Times" w:cs="Times"/>
               </w:rPr>
             </w:pPr>
           </w:p>
@@ -1925,10 +1951,10 @@
         <w:tc>
           <w:tcPr>
             <w:tcW w:w="2711" w:type="dxa"/>
-          </w:tcPr>
-          <w:p>
-            <w:pPr>
-              <w:jc w:val="center"/>
+            <w:vAlign w:val="center"/>
+          </w:tcPr>
+          <w:p>
+            <w:pPr>
               <w:rPr>
                 <w:rFonts w:ascii="Times" w:eastAsia="Times" w:hAnsi="Times" w:cs="Times"/>
               </w:rPr>
@@ -1943,26 +1969,19 @@
         <w:tc>
           <w:tcPr>
             <w:tcW w:w="1782" w:type="dxa"/>
-          </w:tcPr>
-          <w:p>
-            <w:pPr>
-              <w:jc w:val="center"/>
-              <w:rPr>
-                <w:color w:val="ED7D31" w:themeColor="accent2"/>
-              </w:rPr>
-            </w:pPr>
-          </w:p>
+            <w:vAlign w:val="center"/>
+          </w:tcPr>
+          <w:p/>
         </w:tc>
         <w:tc>
           <w:tcPr>
             <w:tcW w:w="913" w:type="dxa"/>
-          </w:tcPr>
-          <w:p>
-            <w:pPr>
-              <w:jc w:val="center"/>
-              <w:rPr>
-                <w:rFonts w:ascii="Times" w:eastAsia="Times" w:hAnsi="Times" w:cs="Times"/>
-                <w:color w:val="ED7D31" w:themeColor="accent2"/>
+            <w:vAlign w:val="center"/>
+          </w:tcPr>
+          <w:p>
+            <w:pPr>
+              <w:rPr>
+                <w:rFonts w:ascii="Times" w:eastAsia="Times" w:hAnsi="Times" w:cs="Times"/>
               </w:rPr>
             </w:pPr>
           </w:p>
@@ -1970,12 +1989,12 @@
         <w:tc>
           <w:tcPr>
             <w:tcW w:w="3679" w:type="dxa"/>
-          </w:tcPr>
-          <w:p>
-            <w:pPr>
-              <w:rPr>
-                <w:rFonts w:ascii="Times" w:eastAsia="Times" w:hAnsi="Times" w:cs="Times"/>
-                <w:color w:val="ED7D31" w:themeColor="accent2"/>
+            <w:vAlign w:val="center"/>
+          </w:tcPr>
+          <w:p>
+            <w:pPr>
+              <w:rPr>
+                <w:rFonts w:ascii="Times" w:eastAsia="Times" w:hAnsi="Times" w:cs="Times"/>
               </w:rPr>
             </w:pPr>
           </w:p>
@@ -1983,10 +2002,10 @@
         <w:tc>
           <w:tcPr>
             <w:tcW w:w="2711" w:type="dxa"/>
-          </w:tcPr>
-          <w:p>
-            <w:pPr>
-              <w:jc w:val="center"/>
+            <w:vAlign w:val="center"/>
+          </w:tcPr>
+          <w:p>
+            <w:pPr>
               <w:rPr>
                 <w:rFonts w:ascii="Times" w:eastAsia="Times" w:hAnsi="Times" w:cs="Times"/>
               </w:rPr>
@@ -2001,20 +2020,17 @@
         <w:tc>
           <w:tcPr>
             <w:tcW w:w="1782" w:type="dxa"/>
-          </w:tcPr>
-          <w:p>
-            <w:pPr>
-              <w:jc w:val="center"/>
-            </w:pPr>
-          </w:p>
+            <w:vAlign w:val="center"/>
+          </w:tcPr>
+          <w:p/>
         </w:tc>
         <w:tc>
           <w:tcPr>
             <w:tcW w:w="913" w:type="dxa"/>
-          </w:tcPr>
-          <w:p>
-            <w:pPr>
-              <w:jc w:val="center"/>
+            <w:vAlign w:val="center"/>
+          </w:tcPr>
+          <w:p>
+            <w:pPr>
               <w:rPr>
                 <w:rFonts w:ascii="Times" w:eastAsia="Times" w:hAnsi="Times" w:cs="Times"/>
               </w:rPr>
@@ -2024,6 +2040,7 @@
         <w:tc>
           <w:tcPr>
             <w:tcW w:w="3679" w:type="dxa"/>
+            <w:vAlign w:val="center"/>
           </w:tcPr>
           <w:p>
             <w:pPr>
@@ -2036,10 +2053,10 @@
         <w:tc>
           <w:tcPr>
             <w:tcW w:w="2711" w:type="dxa"/>
-          </w:tcPr>
-          <w:p>
-            <w:pPr>
-              <w:jc w:val="center"/>
+            <w:vAlign w:val="center"/>
+          </w:tcPr>
+          <w:p>
+            <w:pPr>
               <w:rPr>
                 <w:rFonts w:ascii="Times" w:eastAsia="Times" w:hAnsi="Times" w:cs="Times"/>
               </w:rPr>
@@ -2054,26 +2071,19 @@
         <w:tc>
           <w:tcPr>
             <w:tcW w:w="1782" w:type="dxa"/>
-          </w:tcPr>
-          <w:p>
-            <w:pPr>
-              <w:jc w:val="center"/>
-              <w:rPr>
-                <w:color w:val="ED7D31" w:themeColor="accent2"/>
-              </w:rPr>
-            </w:pPr>
-          </w:p>
+            <w:vAlign w:val="center"/>
+          </w:tcPr>
+          <w:p/>
         </w:tc>
         <w:tc>
           <w:tcPr>
             <w:tcW w:w="913" w:type="dxa"/>
-          </w:tcPr>
-          <w:p>
-            <w:pPr>
-              <w:jc w:val="center"/>
-              <w:rPr>
-                <w:rFonts w:ascii="Times" w:eastAsia="Times" w:hAnsi="Times" w:cs="Times"/>
-                <w:color w:val="ED7D31" w:themeColor="accent2"/>
+            <w:vAlign w:val="center"/>
+          </w:tcPr>
+          <w:p>
+            <w:pPr>
+              <w:rPr>
+                <w:rFonts w:ascii="Times" w:eastAsia="Times" w:hAnsi="Times" w:cs="Times"/>
               </w:rPr>
             </w:pPr>
           </w:p>
@@ -2081,12 +2091,12 @@
         <w:tc>
           <w:tcPr>
             <w:tcW w:w="3679" w:type="dxa"/>
-          </w:tcPr>
-          <w:p>
-            <w:pPr>
-              <w:rPr>
-                <w:rFonts w:ascii="Times" w:eastAsia="Times" w:hAnsi="Times" w:cs="Times"/>
-                <w:color w:val="ED7D31" w:themeColor="accent2"/>
+            <w:vAlign w:val="center"/>
+          </w:tcPr>
+          <w:p>
+            <w:pPr>
+              <w:rPr>
+                <w:rFonts w:ascii="Times" w:eastAsia="Times" w:hAnsi="Times" w:cs="Times"/>
               </w:rPr>
             </w:pPr>
           </w:p>
@@ -2094,13 +2104,12 @@
         <w:tc>
           <w:tcPr>
             <w:tcW w:w="2711" w:type="dxa"/>
-          </w:tcPr>
-          <w:p>
-            <w:pPr>
-              <w:jc w:val="center"/>
-              <w:rPr>
-                <w:rFonts w:ascii="Times" w:eastAsia="Times" w:hAnsi="Times" w:cs="Times"/>
-                <w:color w:val="ED7D31" w:themeColor="accent2"/>
+            <w:vAlign w:val="center"/>
+          </w:tcPr>
+          <w:p>
+            <w:pPr>
+              <w:rPr>
+                <w:rFonts w:ascii="Times" w:eastAsia="Times" w:hAnsi="Times" w:cs="Times"/>
               </w:rPr>
             </w:pPr>
           </w:p>
@@ -2113,20 +2122,17 @@
         <w:tc>
           <w:tcPr>
             <w:tcW w:w="1782" w:type="dxa"/>
-          </w:tcPr>
-          <w:p>
-            <w:pPr>
-              <w:jc w:val="center"/>
-            </w:pPr>
-          </w:p>
+            <w:vAlign w:val="center"/>
+          </w:tcPr>
+          <w:p/>
         </w:tc>
         <w:tc>
           <w:tcPr>
             <w:tcW w:w="913" w:type="dxa"/>
-          </w:tcPr>
-          <w:p>
-            <w:pPr>
-              <w:jc w:val="center"/>
+            <w:vAlign w:val="center"/>
+          </w:tcPr>
+          <w:p>
+            <w:pPr>
               <w:rPr>
                 <w:rFonts w:ascii="Times" w:eastAsia="Times" w:hAnsi="Times" w:cs="Times"/>
               </w:rPr>
@@ -2136,6 +2142,7 @@
         <w:tc>
           <w:tcPr>
             <w:tcW w:w="3679" w:type="dxa"/>
+            <w:vAlign w:val="center"/>
           </w:tcPr>
           <w:p>
             <w:pPr>
@@ -2148,10 +2155,10 @@
         <w:tc>
           <w:tcPr>
             <w:tcW w:w="2711" w:type="dxa"/>
-          </w:tcPr>
-          <w:p>
-            <w:pPr>
-              <w:jc w:val="center"/>
+            <w:vAlign w:val="center"/>
+          </w:tcPr>
+          <w:p>
+            <w:pPr>
               <w:rPr>
                 <w:rFonts w:ascii="Times" w:eastAsia="Times" w:hAnsi="Times" w:cs="Times"/>
               </w:rPr>
@@ -2166,26 +2173,19 @@
         <w:tc>
           <w:tcPr>
             <w:tcW w:w="1782" w:type="dxa"/>
-          </w:tcPr>
-          <w:p>
-            <w:pPr>
-              <w:jc w:val="center"/>
-              <w:rPr>
-                <w:color w:val="ED7D31" w:themeColor="accent2"/>
-              </w:rPr>
-            </w:pPr>
-          </w:p>
+            <w:vAlign w:val="center"/>
+          </w:tcPr>
+          <w:p/>
         </w:tc>
         <w:tc>
           <w:tcPr>
             <w:tcW w:w="913" w:type="dxa"/>
-          </w:tcPr>
-          <w:p>
-            <w:pPr>
-              <w:jc w:val="center"/>
-              <w:rPr>
-                <w:rFonts w:ascii="Times" w:eastAsia="Times" w:hAnsi="Times" w:cs="Times"/>
-                <w:color w:val="ED7D31" w:themeColor="accent2"/>
+            <w:vAlign w:val="center"/>
+          </w:tcPr>
+          <w:p>
+            <w:pPr>
+              <w:rPr>
+                <w:rFonts w:ascii="Times" w:eastAsia="Times" w:hAnsi="Times" w:cs="Times"/>
               </w:rPr>
             </w:pPr>
           </w:p>
@@ -2193,12 +2193,12 @@
         <w:tc>
           <w:tcPr>
             <w:tcW w:w="3679" w:type="dxa"/>
-          </w:tcPr>
-          <w:p>
-            <w:pPr>
-              <w:rPr>
-                <w:rFonts w:ascii="Times" w:eastAsia="Times" w:hAnsi="Times" w:cs="Times"/>
-                <w:color w:val="ED7D31" w:themeColor="accent2"/>
+            <w:vAlign w:val="center"/>
+          </w:tcPr>
+          <w:p>
+            <w:pPr>
+              <w:rPr>
+                <w:rFonts w:ascii="Times" w:eastAsia="Times" w:hAnsi="Times" w:cs="Times"/>
               </w:rPr>
             </w:pPr>
           </w:p>
@@ -2206,10 +2206,10 @@
         <w:tc>
           <w:tcPr>
             <w:tcW w:w="2711" w:type="dxa"/>
-          </w:tcPr>
-          <w:p>
-            <w:pPr>
-              <w:jc w:val="center"/>
+            <w:vAlign w:val="center"/>
+          </w:tcPr>
+          <w:p>
+            <w:pPr>
               <w:rPr>
                 <w:rFonts w:ascii="Times" w:eastAsia="Times" w:hAnsi="Times" w:cs="Times"/>
               </w:rPr>
@@ -2224,20 +2224,17 @@
         <w:tc>
           <w:tcPr>
             <w:tcW w:w="1782" w:type="dxa"/>
-          </w:tcPr>
-          <w:p>
-            <w:pPr>
-              <w:jc w:val="center"/>
-            </w:pPr>
-          </w:p>
+            <w:vAlign w:val="center"/>
+          </w:tcPr>
+          <w:p/>
         </w:tc>
         <w:tc>
           <w:tcPr>
             <w:tcW w:w="913" w:type="dxa"/>
-          </w:tcPr>
-          <w:p>
-            <w:pPr>
-              <w:jc w:val="center"/>
+            <w:vAlign w:val="center"/>
+          </w:tcPr>
+          <w:p>
+            <w:pPr>
               <w:rPr>
                 <w:rFonts w:ascii="Times" w:eastAsia="Times" w:hAnsi="Times" w:cs="Times"/>
               </w:rPr>
@@ -2247,6 +2244,7 @@
         <w:tc>
           <w:tcPr>
             <w:tcW w:w="3679" w:type="dxa"/>
+            <w:vAlign w:val="center"/>
           </w:tcPr>
           <w:p>
             <w:pPr>
@@ -2259,10 +2257,10 @@
         <w:tc>
           <w:tcPr>
             <w:tcW w:w="2711" w:type="dxa"/>
-          </w:tcPr>
-          <w:p>
-            <w:pPr>
-              <w:jc w:val="center"/>
+            <w:vAlign w:val="center"/>
+          </w:tcPr>
+          <w:p>
+            <w:pPr>
               <w:rPr>
                 <w:rFonts w:ascii="Times" w:eastAsia="Times" w:hAnsi="Times" w:cs="Times"/>
               </w:rPr>
@@ -2277,20 +2275,17 @@
         <w:tc>
           <w:tcPr>
             <w:tcW w:w="1782" w:type="dxa"/>
-          </w:tcPr>
-          <w:p>
-            <w:pPr>
-              <w:jc w:val="center"/>
-            </w:pPr>
-          </w:p>
+            <w:vAlign w:val="center"/>
+          </w:tcPr>
+          <w:p/>
         </w:tc>
         <w:tc>
           <w:tcPr>
             <w:tcW w:w="913" w:type="dxa"/>
-          </w:tcPr>
-          <w:p>
-            <w:pPr>
-              <w:jc w:val="center"/>
+            <w:vAlign w:val="center"/>
+          </w:tcPr>
+          <w:p>
+            <w:pPr>
               <w:rPr>
                 <w:rFonts w:ascii="Times" w:eastAsia="Times" w:hAnsi="Times" w:cs="Times"/>
               </w:rPr>
@@ -2300,6 +2295,7 @@
         <w:tc>
           <w:tcPr>
             <w:tcW w:w="3679" w:type="dxa"/>
+            <w:vAlign w:val="center"/>
           </w:tcPr>
           <w:p>
             <w:pPr>
@@ -2312,10 +2308,10 @@
         <w:tc>
           <w:tcPr>
             <w:tcW w:w="2711" w:type="dxa"/>
-          </w:tcPr>
-          <w:p>
-            <w:pPr>
-              <w:jc w:val="center"/>
+            <w:vAlign w:val="center"/>
+          </w:tcPr>
+          <w:p>
+            <w:pPr>
               <w:rPr>
                 <w:rFonts w:ascii="Times" w:eastAsia="Times" w:hAnsi="Times" w:cs="Times"/>
               </w:rPr>
@@ -2330,20 +2326,17 @@
         <w:tc>
           <w:tcPr>
             <w:tcW w:w="1782" w:type="dxa"/>
-          </w:tcPr>
-          <w:p>
-            <w:pPr>
-              <w:jc w:val="center"/>
-            </w:pPr>
-          </w:p>
+            <w:vAlign w:val="center"/>
+          </w:tcPr>
+          <w:p/>
         </w:tc>
         <w:tc>
           <w:tcPr>
             <w:tcW w:w="913" w:type="dxa"/>
-          </w:tcPr>
-          <w:p>
-            <w:pPr>
-              <w:jc w:val="center"/>
+            <w:vAlign w:val="center"/>
+          </w:tcPr>
+          <w:p>
+            <w:pPr>
               <w:rPr>
                 <w:rFonts w:ascii="Times" w:eastAsia="Times" w:hAnsi="Times" w:cs="Times"/>
               </w:rPr>
@@ -2353,6 +2346,7 @@
         <w:tc>
           <w:tcPr>
             <w:tcW w:w="3679" w:type="dxa"/>
+            <w:vAlign w:val="center"/>
           </w:tcPr>
           <w:p>
             <w:pPr>
@@ -2365,10 +2359,10 @@
         <w:tc>
           <w:tcPr>
             <w:tcW w:w="2711" w:type="dxa"/>
-          </w:tcPr>
-          <w:p>
-            <w:pPr>
-              <w:jc w:val="center"/>
+            <w:vAlign w:val="center"/>
+          </w:tcPr>
+          <w:p>
+            <w:pPr>
               <w:rPr>
                 <w:rFonts w:ascii="Times" w:eastAsia="Times" w:hAnsi="Times" w:cs="Times"/>
               </w:rPr>
@@ -2383,20 +2377,17 @@
         <w:tc>
           <w:tcPr>
             <w:tcW w:w="1782" w:type="dxa"/>
-          </w:tcPr>
-          <w:p>
-            <w:pPr>
-              <w:jc w:val="center"/>
-            </w:pPr>
-          </w:p>
+            <w:vAlign w:val="center"/>
+          </w:tcPr>
+          <w:p/>
         </w:tc>
         <w:tc>
           <w:tcPr>
             <w:tcW w:w="913" w:type="dxa"/>
-          </w:tcPr>
-          <w:p>
-            <w:pPr>
-              <w:jc w:val="center"/>
+            <w:vAlign w:val="center"/>
+          </w:tcPr>
+          <w:p>
+            <w:pPr>
               <w:rPr>
                 <w:rFonts w:ascii="Times" w:eastAsia="Times" w:hAnsi="Times" w:cs="Times"/>
               </w:rPr>
@@ -2406,6 +2397,7 @@
         <w:tc>
           <w:tcPr>
             <w:tcW w:w="3679" w:type="dxa"/>
+            <w:vAlign w:val="center"/>
           </w:tcPr>
           <w:p>
             <w:pPr>
@@ -2418,10 +2410,10 @@
         <w:tc>
           <w:tcPr>
             <w:tcW w:w="2711" w:type="dxa"/>
-          </w:tcPr>
-          <w:p>
-            <w:pPr>
-              <w:jc w:val="center"/>
+            <w:vAlign w:val="center"/>
+          </w:tcPr>
+          <w:p>
+            <w:pPr>
               <w:rPr>
                 <w:rFonts w:ascii="Times" w:eastAsia="Times" w:hAnsi="Times" w:cs="Times"/>
               </w:rPr>
@@ -2436,26 +2428,19 @@
         <w:tc>
           <w:tcPr>
             <w:tcW w:w="1782" w:type="dxa"/>
-          </w:tcPr>
-          <w:p>
-            <w:pPr>
-              <w:jc w:val="center"/>
-              <w:rPr>
-                <w:color w:val="385623" w:themeColor="accent6" w:themeShade="80"/>
-              </w:rPr>
-            </w:pPr>
-          </w:p>
+            <w:vAlign w:val="center"/>
+          </w:tcPr>
+          <w:p/>
         </w:tc>
         <w:tc>
           <w:tcPr>
             <w:tcW w:w="913" w:type="dxa"/>
-          </w:tcPr>
-          <w:p>
-            <w:pPr>
-              <w:jc w:val="center"/>
-              <w:rPr>
-                <w:rFonts w:ascii="Times" w:eastAsia="Times" w:hAnsi="Times" w:cs="Times"/>
-                <w:color w:val="385623" w:themeColor="accent6" w:themeShade="80"/>
+            <w:vAlign w:val="center"/>
+          </w:tcPr>
+          <w:p>
+            <w:pPr>
+              <w:rPr>
+                <w:rFonts w:ascii="Times" w:eastAsia="Times" w:hAnsi="Times" w:cs="Times"/>
               </w:rPr>
             </w:pPr>
           </w:p>
@@ -2463,12 +2448,12 @@
         <w:tc>
           <w:tcPr>
             <w:tcW w:w="3679" w:type="dxa"/>
-          </w:tcPr>
-          <w:p>
-            <w:pPr>
-              <w:rPr>
-                <w:rFonts w:ascii="Times" w:eastAsia="Times" w:hAnsi="Times" w:cs="Times"/>
-                <w:color w:val="385623" w:themeColor="accent6" w:themeShade="80"/>
+            <w:vAlign w:val="center"/>
+          </w:tcPr>
+          <w:p>
+            <w:pPr>
+              <w:rPr>
+                <w:rFonts w:ascii="Times" w:eastAsia="Times" w:hAnsi="Times" w:cs="Times"/>
               </w:rPr>
             </w:pPr>
           </w:p>
@@ -2476,13 +2461,12 @@
         <w:tc>
           <w:tcPr>
             <w:tcW w:w="2711" w:type="dxa"/>
-          </w:tcPr>
-          <w:p>
-            <w:pPr>
-              <w:jc w:val="center"/>
-              <w:rPr>
-                <w:rFonts w:ascii="Times" w:eastAsia="Times" w:hAnsi="Times" w:cs="Times"/>
-                <w:color w:val="385623" w:themeColor="accent6" w:themeShade="80"/>
+            <w:vAlign w:val="center"/>
+          </w:tcPr>
+          <w:p>
+            <w:pPr>
+              <w:rPr>
+                <w:rFonts w:ascii="Times" w:eastAsia="Times" w:hAnsi="Times" w:cs="Times"/>
               </w:rPr>
             </w:pPr>
           </w:p>
@@ -2495,26 +2479,19 @@
         <w:tc>
           <w:tcPr>
             <w:tcW w:w="1782" w:type="dxa"/>
-          </w:tcPr>
-          <w:p>
-            <w:pPr>
-              <w:jc w:val="center"/>
-              <w:rPr>
-                <w:color w:val="385623" w:themeColor="accent6" w:themeShade="80"/>
-              </w:rPr>
-            </w:pPr>
-          </w:p>
+            <w:vAlign w:val="center"/>
+          </w:tcPr>
+          <w:p/>
         </w:tc>
         <w:tc>
           <w:tcPr>
             <w:tcW w:w="913" w:type="dxa"/>
-          </w:tcPr>
-          <w:p>
-            <w:pPr>
-              <w:jc w:val="center"/>
-              <w:rPr>
-                <w:rFonts w:ascii="Times" w:eastAsia="Times" w:hAnsi="Times" w:cs="Times"/>
-                <w:color w:val="385623" w:themeColor="accent6" w:themeShade="80"/>
+            <w:vAlign w:val="center"/>
+          </w:tcPr>
+          <w:p>
+            <w:pPr>
+              <w:rPr>
+                <w:rFonts w:ascii="Times" w:eastAsia="Times" w:hAnsi="Times" w:cs="Times"/>
               </w:rPr>
             </w:pPr>
           </w:p>
@@ -2522,12 +2499,12 @@
         <w:tc>
           <w:tcPr>
             <w:tcW w:w="3679" w:type="dxa"/>
-          </w:tcPr>
-          <w:p>
-            <w:pPr>
-              <w:rPr>
-                <w:rFonts w:ascii="Times" w:eastAsia="Times" w:hAnsi="Times" w:cs="Times"/>
-                <w:color w:val="385623" w:themeColor="accent6" w:themeShade="80"/>
+            <w:vAlign w:val="center"/>
+          </w:tcPr>
+          <w:p>
+            <w:pPr>
+              <w:rPr>
+                <w:rFonts w:ascii="Times" w:eastAsia="Times" w:hAnsi="Times" w:cs="Times"/>
               </w:rPr>
             </w:pPr>
           </w:p>
@@ -2535,13 +2512,12 @@
         <w:tc>
           <w:tcPr>
             <w:tcW w:w="2711" w:type="dxa"/>
-          </w:tcPr>
-          <w:p>
-            <w:pPr>
-              <w:jc w:val="center"/>
-              <w:rPr>
-                <w:rFonts w:ascii="Times" w:eastAsia="Times" w:hAnsi="Times" w:cs="Times"/>
-                <w:color w:val="385623" w:themeColor="accent6" w:themeShade="80"/>
+            <w:vAlign w:val="center"/>
+          </w:tcPr>
+          <w:p>
+            <w:pPr>
+              <w:rPr>
+                <w:rFonts w:ascii="Times" w:eastAsia="Times" w:hAnsi="Times" w:cs="Times"/>
               </w:rPr>
             </w:pPr>
           </w:p>
@@ -2554,20 +2530,17 @@
         <w:tc>
           <w:tcPr>
             <w:tcW w:w="1782" w:type="dxa"/>
-          </w:tcPr>
-          <w:p>
-            <w:pPr>
-              <w:jc w:val="center"/>
-            </w:pPr>
-          </w:p>
+            <w:vAlign w:val="center"/>
+          </w:tcPr>
+          <w:p/>
         </w:tc>
         <w:tc>
           <w:tcPr>
             <w:tcW w:w="913" w:type="dxa"/>
-          </w:tcPr>
-          <w:p>
-            <w:pPr>
-              <w:jc w:val="center"/>
+            <w:vAlign w:val="center"/>
+          </w:tcPr>
+          <w:p>
+            <w:pPr>
               <w:rPr>
                 <w:rFonts w:ascii="Times" w:eastAsia="Times" w:hAnsi="Times" w:cs="Times"/>
               </w:rPr>
@@ -2577,6 +2550,7 @@
         <w:tc>
           <w:tcPr>
             <w:tcW w:w="3679" w:type="dxa"/>
+            <w:vAlign w:val="center"/>
           </w:tcPr>
           <w:p>
             <w:pPr>
@@ -2589,10 +2563,10 @@
         <w:tc>
           <w:tcPr>
             <w:tcW w:w="2711" w:type="dxa"/>
-          </w:tcPr>
-          <w:p>
-            <w:pPr>
-              <w:jc w:val="center"/>
+            <w:vAlign w:val="center"/>
+          </w:tcPr>
+          <w:p>
+            <w:pPr>
               <w:rPr>
                 <w:rFonts w:ascii="Times" w:eastAsia="Times" w:hAnsi="Times" w:cs="Times"/>
               </w:rPr>
@@ -2607,20 +2581,17 @@
         <w:tc>
           <w:tcPr>
             <w:tcW w:w="1782" w:type="dxa"/>
-          </w:tcPr>
-          <w:p>
-            <w:pPr>
-              <w:jc w:val="center"/>
-            </w:pPr>
-          </w:p>
+            <w:vAlign w:val="center"/>
+          </w:tcPr>
+          <w:p/>
         </w:tc>
         <w:tc>
           <w:tcPr>
             <w:tcW w:w="913" w:type="dxa"/>
-          </w:tcPr>
-          <w:p>
-            <w:pPr>
-              <w:jc w:val="center"/>
+            <w:vAlign w:val="center"/>
+          </w:tcPr>
+          <w:p>
+            <w:pPr>
               <w:rPr>
                 <w:rFonts w:ascii="Times" w:eastAsia="Times" w:hAnsi="Times" w:cs="Times"/>
               </w:rPr>
@@ -2630,6 +2601,7 @@
         <w:tc>
           <w:tcPr>
             <w:tcW w:w="3679" w:type="dxa"/>
+            <w:vAlign w:val="center"/>
           </w:tcPr>
           <w:p>
             <w:pPr>
@@ -2642,10 +2614,10 @@
         <w:tc>
           <w:tcPr>
             <w:tcW w:w="2711" w:type="dxa"/>
-          </w:tcPr>
-          <w:p>
-            <w:pPr>
-              <w:jc w:val="center"/>
+            <w:vAlign w:val="center"/>
+          </w:tcPr>
+          <w:p>
+            <w:pPr>
               <w:rPr>
                 <w:rFonts w:ascii="Times" w:eastAsia="Times" w:hAnsi="Times" w:cs="Times"/>
               </w:rPr>
@@ -2660,20 +2632,17 @@
         <w:tc>
           <w:tcPr>
             <w:tcW w:w="1782" w:type="dxa"/>
-          </w:tcPr>
-          <w:p>
-            <w:pPr>
-              <w:jc w:val="center"/>
-            </w:pPr>
-          </w:p>
+            <w:vAlign w:val="center"/>
+          </w:tcPr>
+          <w:p/>
         </w:tc>
         <w:tc>
           <w:tcPr>
             <w:tcW w:w="913" w:type="dxa"/>
-          </w:tcPr>
-          <w:p>
-            <w:pPr>
-              <w:jc w:val="center"/>
+            <w:vAlign w:val="center"/>
+          </w:tcPr>
+          <w:p>
+            <w:pPr>
               <w:rPr>
                 <w:rFonts w:ascii="Times" w:eastAsia="Times" w:hAnsi="Times" w:cs="Times"/>
               </w:rPr>
@@ -2683,6 +2652,7 @@
         <w:tc>
           <w:tcPr>
             <w:tcW w:w="3679" w:type="dxa"/>
+            <w:vAlign w:val="center"/>
           </w:tcPr>
           <w:p>
             <w:pPr>
@@ -2695,10 +2665,10 @@
         <w:tc>
           <w:tcPr>
             <w:tcW w:w="2711" w:type="dxa"/>
-          </w:tcPr>
-          <w:p>
-            <w:pPr>
-              <w:jc w:val="center"/>
+            <w:vAlign w:val="center"/>
+          </w:tcPr>
+          <w:p>
+            <w:pPr>
               <w:rPr>
                 <w:rFonts w:ascii="Times" w:eastAsia="Times" w:hAnsi="Times" w:cs="Times"/>
               </w:rPr>
@@ -2713,26 +2683,19 @@
         <w:tc>
           <w:tcPr>
             <w:tcW w:w="1782" w:type="dxa"/>
-          </w:tcPr>
-          <w:p>
-            <w:pPr>
-              <w:jc w:val="center"/>
-              <w:rPr>
-                <w:color w:val="385623" w:themeColor="accent6" w:themeShade="80"/>
-              </w:rPr>
-            </w:pPr>
-          </w:p>
+            <w:vAlign w:val="center"/>
+          </w:tcPr>
+          <w:p/>
         </w:tc>
         <w:tc>
           <w:tcPr>
             <w:tcW w:w="913" w:type="dxa"/>
-          </w:tcPr>
-          <w:p>
-            <w:pPr>
-              <w:jc w:val="center"/>
-              <w:rPr>
-                <w:rFonts w:ascii="Times" w:eastAsia="Times" w:hAnsi="Times" w:cs="Times"/>
-                <w:color w:val="385623" w:themeColor="accent6" w:themeShade="80"/>
+            <w:vAlign w:val="center"/>
+          </w:tcPr>
+          <w:p>
+            <w:pPr>
+              <w:rPr>
+                <w:rFonts w:ascii="Times" w:eastAsia="Times" w:hAnsi="Times" w:cs="Times"/>
               </w:rPr>
             </w:pPr>
           </w:p>
@@ -2740,12 +2703,12 @@
         <w:tc>
           <w:tcPr>
             <w:tcW w:w="3679" w:type="dxa"/>
-          </w:tcPr>
-          <w:p>
-            <w:pPr>
-              <w:rPr>
-                <w:rFonts w:ascii="Times" w:eastAsia="Times" w:hAnsi="Times" w:cs="Times"/>
-                <w:color w:val="385623" w:themeColor="accent6" w:themeShade="80"/>
+            <w:vAlign w:val="center"/>
+          </w:tcPr>
+          <w:p>
+            <w:pPr>
+              <w:rPr>
+                <w:rFonts w:ascii="Times" w:eastAsia="Times" w:hAnsi="Times" w:cs="Times"/>
               </w:rPr>
             </w:pPr>
           </w:p>
@@ -2753,13 +2716,12 @@
         <w:tc>
           <w:tcPr>
             <w:tcW w:w="2711" w:type="dxa"/>
-          </w:tcPr>
-          <w:p>
-            <w:pPr>
-              <w:jc w:val="center"/>
-              <w:rPr>
-                <w:rFonts w:ascii="Times" w:eastAsia="Times" w:hAnsi="Times" w:cs="Times"/>
-                <w:color w:val="385623" w:themeColor="accent6" w:themeShade="80"/>
+            <w:vAlign w:val="center"/>
+          </w:tcPr>
+          <w:p>
+            <w:pPr>
+              <w:rPr>
+                <w:rFonts w:ascii="Times" w:eastAsia="Times" w:hAnsi="Times" w:cs="Times"/>
               </w:rPr>
             </w:pPr>
           </w:p>
@@ -2772,26 +2734,19 @@
         <w:tc>
           <w:tcPr>
             <w:tcW w:w="1782" w:type="dxa"/>
-          </w:tcPr>
-          <w:p>
-            <w:pPr>
-              <w:jc w:val="center"/>
-              <w:rPr>
-                <w:color w:val="ED7D31" w:themeColor="accent2"/>
-              </w:rPr>
-            </w:pPr>
-          </w:p>
+            <w:vAlign w:val="center"/>
+          </w:tcPr>
+          <w:p/>
         </w:tc>
         <w:tc>
           <w:tcPr>
             <w:tcW w:w="913" w:type="dxa"/>
-          </w:tcPr>
-          <w:p>
-            <w:pPr>
-              <w:jc w:val="center"/>
-              <w:rPr>
-                <w:rFonts w:ascii="Times" w:eastAsia="Times" w:hAnsi="Times" w:cs="Times"/>
-                <w:color w:val="ED7D31" w:themeColor="accent2"/>
+            <w:vAlign w:val="center"/>
+          </w:tcPr>
+          <w:p>
+            <w:pPr>
+              <w:rPr>
+                <w:rFonts w:ascii="Times" w:eastAsia="Times" w:hAnsi="Times" w:cs="Times"/>
               </w:rPr>
             </w:pPr>
           </w:p>
@@ -2799,12 +2754,12 @@
         <w:tc>
           <w:tcPr>
             <w:tcW w:w="3679" w:type="dxa"/>
-          </w:tcPr>
-          <w:p>
-            <w:pPr>
-              <w:rPr>
-                <w:rFonts w:ascii="Times" w:eastAsia="Times" w:hAnsi="Times" w:cs="Times"/>
-                <w:color w:val="ED7D31" w:themeColor="accent2"/>
+            <w:vAlign w:val="center"/>
+          </w:tcPr>
+          <w:p>
+            <w:pPr>
+              <w:rPr>
+                <w:rFonts w:ascii="Times" w:eastAsia="Times" w:hAnsi="Times" w:cs="Times"/>
               </w:rPr>
             </w:pPr>
           </w:p>
@@ -2812,10 +2767,10 @@
         <w:tc>
           <w:tcPr>
             <w:tcW w:w="2711" w:type="dxa"/>
-          </w:tcPr>
-          <w:p>
-            <w:pPr>
-              <w:jc w:val="center"/>
+            <w:vAlign w:val="center"/>
+          </w:tcPr>
+          <w:p>
+            <w:pPr>
               <w:rPr>
                 <w:rFonts w:ascii="Times" w:eastAsia="Times" w:hAnsi="Times" w:cs="Times"/>
               </w:rPr>
@@ -2830,26 +2785,19 @@
         <w:tc>
           <w:tcPr>
             <w:tcW w:w="1782" w:type="dxa"/>
-          </w:tcPr>
-          <w:p>
-            <w:pPr>
-              <w:jc w:val="center"/>
-              <w:rPr>
-                <w:color w:val="385623" w:themeColor="accent6" w:themeShade="80"/>
-              </w:rPr>
-            </w:pPr>
-          </w:p>
+            <w:vAlign w:val="center"/>
+          </w:tcPr>
+          <w:p/>
         </w:tc>
         <w:tc>
           <w:tcPr>
             <w:tcW w:w="913" w:type="dxa"/>
-          </w:tcPr>
-          <w:p>
-            <w:pPr>
-              <w:jc w:val="center"/>
-              <w:rPr>
-                <w:rFonts w:ascii="Times" w:eastAsia="Times" w:hAnsi="Times" w:cs="Times"/>
-                <w:color w:val="385623" w:themeColor="accent6" w:themeShade="80"/>
+            <w:vAlign w:val="center"/>
+          </w:tcPr>
+          <w:p>
+            <w:pPr>
+              <w:rPr>
+                <w:rFonts w:ascii="Times" w:eastAsia="Times" w:hAnsi="Times" w:cs="Times"/>
               </w:rPr>
             </w:pPr>
           </w:p>
@@ -2857,12 +2805,12 @@
         <w:tc>
           <w:tcPr>
             <w:tcW w:w="3679" w:type="dxa"/>
-          </w:tcPr>
-          <w:p>
-            <w:pPr>
-              <w:rPr>
-                <w:rFonts w:ascii="Times" w:eastAsia="Times" w:hAnsi="Times" w:cs="Times"/>
-                <w:color w:val="385623" w:themeColor="accent6" w:themeShade="80"/>
+            <w:vAlign w:val="center"/>
+          </w:tcPr>
+          <w:p>
+            <w:pPr>
+              <w:rPr>
+                <w:rFonts w:ascii="Times" w:eastAsia="Times" w:hAnsi="Times" w:cs="Times"/>
               </w:rPr>
             </w:pPr>
           </w:p>
@@ -2870,15 +2818,14 @@
         <w:tc>
           <w:tcPr>
             <w:tcW w:w="2711" w:type="dxa"/>
-          </w:tcPr>
-          <w:p>
-            <w:pPr>
-              <w:jc w:val="center"/>
+            <w:vAlign w:val="center"/>
+          </w:tcPr>
+          <w:p>
+            <w:pPr>
               <w:rPr>
                 <w:rFonts w:ascii="Times" w:eastAsia="Times" w:hAnsi="Times" w:cs="Times"/>
                 <w:i/>
                 <w:iCs/>
-                <w:color w:val="385623" w:themeColor="accent6" w:themeShade="80"/>
               </w:rPr>
             </w:pPr>
           </w:p>
@@ -2891,26 +2838,19 @@
         <w:tc>
           <w:tcPr>
             <w:tcW w:w="1782" w:type="dxa"/>
-          </w:tcPr>
-          <w:p>
-            <w:pPr>
-              <w:jc w:val="center"/>
-              <w:rPr>
-                <w:color w:val="385623" w:themeColor="accent6" w:themeShade="80"/>
-              </w:rPr>
-            </w:pPr>
-          </w:p>
+            <w:vAlign w:val="center"/>
+          </w:tcPr>
+          <w:p/>
         </w:tc>
         <w:tc>
           <w:tcPr>
             <w:tcW w:w="913" w:type="dxa"/>
-          </w:tcPr>
-          <w:p>
-            <w:pPr>
-              <w:jc w:val="center"/>
-              <w:rPr>
-                <w:rFonts w:ascii="Times" w:eastAsia="Times" w:hAnsi="Times" w:cs="Times"/>
-                <w:color w:val="385623" w:themeColor="accent6" w:themeShade="80"/>
+            <w:vAlign w:val="center"/>
+          </w:tcPr>
+          <w:p>
+            <w:pPr>
+              <w:rPr>
+                <w:rFonts w:ascii="Times" w:eastAsia="Times" w:hAnsi="Times" w:cs="Times"/>
               </w:rPr>
             </w:pPr>
           </w:p>
@@ -2918,12 +2858,12 @@
         <w:tc>
           <w:tcPr>
             <w:tcW w:w="3679" w:type="dxa"/>
-          </w:tcPr>
-          <w:p>
-            <w:pPr>
-              <w:rPr>
-                <w:rFonts w:ascii="Times" w:eastAsia="Times" w:hAnsi="Times" w:cs="Times"/>
-                <w:color w:val="385623" w:themeColor="accent6" w:themeShade="80"/>
+            <w:vAlign w:val="center"/>
+          </w:tcPr>
+          <w:p>
+            <w:pPr>
+              <w:rPr>
+                <w:rFonts w:ascii="Times" w:eastAsia="Times" w:hAnsi="Times" w:cs="Times"/>
               </w:rPr>
             </w:pPr>
           </w:p>
@@ -2931,13 +2871,12 @@
         <w:tc>
           <w:tcPr>
             <w:tcW w:w="2711" w:type="dxa"/>
-          </w:tcPr>
-          <w:p>
-            <w:pPr>
-              <w:jc w:val="center"/>
-              <w:rPr>
-                <w:rFonts w:ascii="Times" w:eastAsia="Times" w:hAnsi="Times" w:cs="Times"/>
-                <w:color w:val="385623" w:themeColor="accent6" w:themeShade="80"/>
+            <w:vAlign w:val="center"/>
+          </w:tcPr>
+          <w:p>
+            <w:pPr>
+              <w:rPr>
+                <w:rFonts w:ascii="Times" w:eastAsia="Times" w:hAnsi="Times" w:cs="Times"/>
               </w:rPr>
             </w:pPr>
           </w:p>
@@ -2950,26 +2889,19 @@
         <w:tc>
           <w:tcPr>
             <w:tcW w:w="1782" w:type="dxa"/>
-          </w:tcPr>
-          <w:p>
-            <w:pPr>
-              <w:jc w:val="center"/>
-              <w:rPr>
-                <w:color w:val="ED7D31" w:themeColor="accent2"/>
-              </w:rPr>
-            </w:pPr>
-          </w:p>
+            <w:vAlign w:val="center"/>
+          </w:tcPr>
+          <w:p/>
         </w:tc>
         <w:tc>
           <w:tcPr>
             <w:tcW w:w="913" w:type="dxa"/>
-          </w:tcPr>
-          <w:p>
-            <w:pPr>
-              <w:jc w:val="center"/>
-              <w:rPr>
-                <w:rFonts w:ascii="Times" w:eastAsia="Times" w:hAnsi="Times" w:cs="Times"/>
-                <w:color w:val="ED7D31" w:themeColor="accent2"/>
+            <w:vAlign w:val="center"/>
+          </w:tcPr>
+          <w:p>
+            <w:pPr>
+              <w:rPr>
+                <w:rFonts w:ascii="Times" w:eastAsia="Times" w:hAnsi="Times" w:cs="Times"/>
               </w:rPr>
             </w:pPr>
           </w:p>
@@ -2977,12 +2909,12 @@
         <w:tc>
           <w:tcPr>
             <w:tcW w:w="3679" w:type="dxa"/>
-          </w:tcPr>
-          <w:p>
-            <w:pPr>
-              <w:rPr>
-                <w:rFonts w:ascii="Times" w:eastAsia="Times" w:hAnsi="Times" w:cs="Times"/>
-                <w:color w:val="ED7D31" w:themeColor="accent2"/>
+            <w:vAlign w:val="center"/>
+          </w:tcPr>
+          <w:p>
+            <w:pPr>
+              <w:rPr>
+                <w:rFonts w:ascii="Times" w:eastAsia="Times" w:hAnsi="Times" w:cs="Times"/>
               </w:rPr>
             </w:pPr>
           </w:p>
@@ -2990,10 +2922,10 @@
         <w:tc>
           <w:tcPr>
             <w:tcW w:w="2711" w:type="dxa"/>
-          </w:tcPr>
-          <w:p>
-            <w:pPr>
-              <w:jc w:val="center"/>
+            <w:vAlign w:val="center"/>
+          </w:tcPr>
+          <w:p>
+            <w:pPr>
               <w:rPr>
                 <w:rFonts w:ascii="Times" w:eastAsia="Times" w:hAnsi="Times" w:cs="Times"/>
               </w:rPr>
@@ -3008,20 +2940,17 @@
         <w:tc>
           <w:tcPr>
             <w:tcW w:w="1782" w:type="dxa"/>
-          </w:tcPr>
-          <w:p>
-            <w:pPr>
-              <w:jc w:val="center"/>
-            </w:pPr>
-          </w:p>
+            <w:vAlign w:val="center"/>
+          </w:tcPr>
+          <w:p/>
         </w:tc>
         <w:tc>
           <w:tcPr>
             <w:tcW w:w="913" w:type="dxa"/>
-          </w:tcPr>
-          <w:p>
-            <w:pPr>
-              <w:jc w:val="center"/>
+            <w:vAlign w:val="center"/>
+          </w:tcPr>
+          <w:p>
+            <w:pPr>
               <w:rPr>
                 <w:rFonts w:ascii="Times" w:eastAsia="Times" w:hAnsi="Times" w:cs="Times"/>
               </w:rPr>
@@ -3031,6 +2960,7 @@
         <w:tc>
           <w:tcPr>
             <w:tcW w:w="3679" w:type="dxa"/>
+            <w:vAlign w:val="center"/>
           </w:tcPr>
           <w:p>
             <w:pPr>
@@ -3043,10 +2973,10 @@
         <w:tc>
           <w:tcPr>
             <w:tcW w:w="2711" w:type="dxa"/>
-          </w:tcPr>
-          <w:p>
-            <w:pPr>
-              <w:jc w:val="center"/>
+            <w:vAlign w:val="center"/>
+          </w:tcPr>
+          <w:p>
+            <w:pPr>
               <w:rPr>
                 <w:rFonts w:ascii="Times" w:eastAsia="Times" w:hAnsi="Times" w:cs="Times"/>
               </w:rPr>
@@ -3061,20 +2991,17 @@
         <w:tc>
           <w:tcPr>
             <w:tcW w:w="1782" w:type="dxa"/>
-          </w:tcPr>
-          <w:p>
-            <w:pPr>
-              <w:jc w:val="center"/>
-            </w:pPr>
-          </w:p>
+            <w:vAlign w:val="center"/>
+          </w:tcPr>
+          <w:p/>
         </w:tc>
         <w:tc>
           <w:tcPr>
             <w:tcW w:w="913" w:type="dxa"/>
-          </w:tcPr>
-          <w:p>
-            <w:pPr>
-              <w:jc w:val="center"/>
+            <w:vAlign w:val="center"/>
+          </w:tcPr>
+          <w:p>
+            <w:pPr>
               <w:rPr>
                 <w:rFonts w:ascii="Times" w:eastAsia="Times" w:hAnsi="Times" w:cs="Times"/>
               </w:rPr>
@@ -3084,14 +3011,10 @@
         <w:tc>
           <w:tcPr>
             <w:tcW w:w="3679" w:type="dxa"/>
-          </w:tcPr>
-          <w:p>
-            <w:pPr>
-              <w:pStyle w:val="ListParagraph"/>
-              <w:numPr>
-                <w:ilvl w:val="0"/>
-                <w:numId w:val="5"/>
-              </w:numPr>
+            <w:vAlign w:val="center"/>
+          </w:tcPr>
+          <w:p>
+            <w:pPr>
               <w:rPr>
                 <w:rFonts w:ascii="Times" w:eastAsia="Times" w:hAnsi="Times" w:cs="Times"/>
               </w:rPr>
@@ -3101,10 +3024,10 @@
         <w:tc>
           <w:tcPr>
             <w:tcW w:w="2711" w:type="dxa"/>
-          </w:tcPr>
-          <w:p>
-            <w:pPr>
-              <w:jc w:val="center"/>
+            <w:vAlign w:val="center"/>
+          </w:tcPr>
+          <w:p>
+            <w:pPr>
               <w:rPr>
                 <w:rFonts w:ascii="Times" w:eastAsia="Times" w:hAnsi="Times" w:cs="Times"/>
               </w:rPr>
@@ -3119,26 +3042,19 @@
         <w:tc>
           <w:tcPr>
             <w:tcW w:w="1782" w:type="dxa"/>
-          </w:tcPr>
-          <w:p>
-            <w:pPr>
-              <w:jc w:val="center"/>
-              <w:rPr>
-                <w:color w:val="ED7D31" w:themeColor="accent2"/>
-              </w:rPr>
-            </w:pPr>
-          </w:p>
+            <w:vAlign w:val="center"/>
+          </w:tcPr>
+          <w:p/>
         </w:tc>
         <w:tc>
           <w:tcPr>
             <w:tcW w:w="913" w:type="dxa"/>
-          </w:tcPr>
-          <w:p>
-            <w:pPr>
-              <w:jc w:val="center"/>
-              <w:rPr>
-                <w:rFonts w:ascii="Times" w:eastAsia="Times" w:hAnsi="Times" w:cs="Times"/>
-                <w:color w:val="ED7D31" w:themeColor="accent2"/>
+            <w:vAlign w:val="center"/>
+          </w:tcPr>
+          <w:p>
+            <w:pPr>
+              <w:rPr>
+                <w:rFonts w:ascii="Times" w:eastAsia="Times" w:hAnsi="Times" w:cs="Times"/>
               </w:rPr>
             </w:pPr>
           </w:p>
@@ -3146,12 +3062,12 @@
         <w:tc>
           <w:tcPr>
             <w:tcW w:w="3679" w:type="dxa"/>
-          </w:tcPr>
-          <w:p>
-            <w:pPr>
-              <w:rPr>
-                <w:rFonts w:ascii="Times" w:eastAsia="Times" w:hAnsi="Times" w:cs="Times"/>
-                <w:color w:val="ED7D31" w:themeColor="accent2"/>
+            <w:vAlign w:val="center"/>
+          </w:tcPr>
+          <w:p>
+            <w:pPr>
+              <w:rPr>
+                <w:rFonts w:ascii="Times" w:eastAsia="Times" w:hAnsi="Times" w:cs="Times"/>
               </w:rPr>
             </w:pPr>
           </w:p>
@@ -3159,10 +3075,10 @@
         <w:tc>
           <w:tcPr>
             <w:tcW w:w="2711" w:type="dxa"/>
-          </w:tcPr>
-          <w:p>
-            <w:pPr>
-              <w:jc w:val="center"/>
+            <w:vAlign w:val="center"/>
+          </w:tcPr>
+          <w:p>
+            <w:pPr>
               <w:rPr>
                 <w:rFonts w:ascii="Times" w:eastAsia="Times" w:hAnsi="Times" w:cs="Times"/>
               </w:rPr>
@@ -3177,20 +3093,17 @@
         <w:tc>
           <w:tcPr>
             <w:tcW w:w="1782" w:type="dxa"/>
-          </w:tcPr>
-          <w:p>
-            <w:pPr>
-              <w:jc w:val="center"/>
-            </w:pPr>
-          </w:p>
+            <w:vAlign w:val="center"/>
+          </w:tcPr>
+          <w:p/>
         </w:tc>
         <w:tc>
           <w:tcPr>
             <w:tcW w:w="913" w:type="dxa"/>
-          </w:tcPr>
-          <w:p>
-            <w:pPr>
-              <w:jc w:val="center"/>
+            <w:vAlign w:val="center"/>
+          </w:tcPr>
+          <w:p>
+            <w:pPr>
               <w:rPr>
                 <w:rFonts w:ascii="Times" w:eastAsia="Times" w:hAnsi="Times" w:cs="Times"/>
               </w:rPr>
@@ -3200,6 +3113,7 @@
         <w:tc>
           <w:tcPr>
             <w:tcW w:w="3679" w:type="dxa"/>
+            <w:vAlign w:val="center"/>
           </w:tcPr>
           <w:p>
             <w:pPr>
@@ -3212,10 +3126,10 @@
         <w:tc>
           <w:tcPr>
             <w:tcW w:w="2711" w:type="dxa"/>
-          </w:tcPr>
-          <w:p>
-            <w:pPr>
-              <w:jc w:val="center"/>
+            <w:vAlign w:val="center"/>
+          </w:tcPr>
+          <w:p>
+            <w:pPr>
               <w:rPr>
                 <w:rFonts w:ascii="Times" w:eastAsia="Times" w:hAnsi="Times" w:cs="Times"/>
               </w:rPr>
@@ -3230,20 +3144,17 @@
         <w:tc>
           <w:tcPr>
             <w:tcW w:w="1782" w:type="dxa"/>
-          </w:tcPr>
-          <w:p>
-            <w:pPr>
-              <w:jc w:val="center"/>
-            </w:pPr>
-          </w:p>
+            <w:vAlign w:val="center"/>
+          </w:tcPr>
+          <w:p/>
         </w:tc>
         <w:tc>
           <w:tcPr>
             <w:tcW w:w="913" w:type="dxa"/>
-          </w:tcPr>
-          <w:p>
-            <w:pPr>
-              <w:jc w:val="center"/>
+            <w:vAlign w:val="center"/>
+          </w:tcPr>
+          <w:p>
+            <w:pPr>
               <w:rPr>
                 <w:rFonts w:ascii="Times" w:eastAsia="Times" w:hAnsi="Times" w:cs="Times"/>
               </w:rPr>
@@ -3253,6 +3164,7 @@
         <w:tc>
           <w:tcPr>
             <w:tcW w:w="3679" w:type="dxa"/>
+            <w:vAlign w:val="center"/>
           </w:tcPr>
           <w:p>
             <w:pPr>
@@ -3265,10 +3177,10 @@
         <w:tc>
           <w:tcPr>
             <w:tcW w:w="2711" w:type="dxa"/>
-          </w:tcPr>
-          <w:p>
-            <w:pPr>
-              <w:jc w:val="center"/>
+            <w:vAlign w:val="center"/>
+          </w:tcPr>
+          <w:p>
+            <w:pPr>
               <w:rPr>
                 <w:rFonts w:ascii="Times" w:eastAsia="Times" w:hAnsi="Times" w:cs="Times"/>
               </w:rPr>
@@ -3283,20 +3195,17 @@
         <w:tc>
           <w:tcPr>
             <w:tcW w:w="1782" w:type="dxa"/>
-          </w:tcPr>
-          <w:p>
-            <w:pPr>
-              <w:jc w:val="center"/>
-            </w:pPr>
-          </w:p>
+            <w:vAlign w:val="center"/>
+          </w:tcPr>
+          <w:p/>
         </w:tc>
         <w:tc>
           <w:tcPr>
             <w:tcW w:w="913" w:type="dxa"/>
-          </w:tcPr>
-          <w:p>
-            <w:pPr>
-              <w:jc w:val="center"/>
+            <w:vAlign w:val="center"/>
+          </w:tcPr>
+          <w:p>
+            <w:pPr>
               <w:rPr>
                 <w:rFonts w:ascii="Times" w:eastAsia="Times" w:hAnsi="Times" w:cs="Times"/>
               </w:rPr>
@@ -3306,6 +3215,7 @@
         <w:tc>
           <w:tcPr>
             <w:tcW w:w="3679" w:type="dxa"/>
+            <w:vAlign w:val="center"/>
           </w:tcPr>
           <w:p>
             <w:pPr>
@@ -3318,10 +3228,10 @@
         <w:tc>
           <w:tcPr>
             <w:tcW w:w="2711" w:type="dxa"/>
-          </w:tcPr>
-          <w:p>
-            <w:pPr>
-              <w:jc w:val="center"/>
+            <w:vAlign w:val="center"/>
+          </w:tcPr>
+          <w:p>
+            <w:pPr>
               <w:rPr>
                 <w:rFonts w:ascii="Times" w:eastAsia="Times" w:hAnsi="Times" w:cs="Times"/>
               </w:rPr>
@@ -3336,20 +3246,17 @@
         <w:tc>
           <w:tcPr>
             <w:tcW w:w="1782" w:type="dxa"/>
-          </w:tcPr>
-          <w:p>
-            <w:pPr>
-              <w:jc w:val="center"/>
-            </w:pPr>
-          </w:p>
+            <w:vAlign w:val="center"/>
+          </w:tcPr>
+          <w:p/>
         </w:tc>
         <w:tc>
           <w:tcPr>
             <w:tcW w:w="913" w:type="dxa"/>
-          </w:tcPr>
-          <w:p>
-            <w:pPr>
-              <w:jc w:val="center"/>
+            <w:vAlign w:val="center"/>
+          </w:tcPr>
+          <w:p>
+            <w:pPr>
               <w:rPr>
                 <w:rFonts w:ascii="Times" w:eastAsia="Times" w:hAnsi="Times" w:cs="Times"/>
               </w:rPr>
@@ -3359,6 +3266,7 @@
         <w:tc>
           <w:tcPr>
             <w:tcW w:w="3679" w:type="dxa"/>
+            <w:vAlign w:val="center"/>
           </w:tcPr>
           <w:p>
             <w:pPr>
@@ -3371,10 +3279,10 @@
         <w:tc>
           <w:tcPr>
             <w:tcW w:w="2711" w:type="dxa"/>
-          </w:tcPr>
-          <w:p>
-            <w:pPr>
-              <w:jc w:val="center"/>
+            <w:vAlign w:val="center"/>
+          </w:tcPr>
+          <w:p>
+            <w:pPr>
               <w:rPr>
                 <w:rFonts w:ascii="Times" w:eastAsia="Times" w:hAnsi="Times" w:cs="Times"/>
               </w:rPr>
@@ -3389,26 +3297,19 @@
         <w:tc>
           <w:tcPr>
             <w:tcW w:w="1782" w:type="dxa"/>
-          </w:tcPr>
-          <w:p>
-            <w:pPr>
-              <w:jc w:val="center"/>
-              <w:rPr>
-                <w:color w:val="ED7D31" w:themeColor="accent2"/>
-              </w:rPr>
-            </w:pPr>
-          </w:p>
+            <w:vAlign w:val="center"/>
+          </w:tcPr>
+          <w:p/>
         </w:tc>
         <w:tc>
           <w:tcPr>
             <w:tcW w:w="913" w:type="dxa"/>
-          </w:tcPr>
-          <w:p>
-            <w:pPr>
-              <w:jc w:val="center"/>
-              <w:rPr>
-                <w:rFonts w:ascii="Times" w:eastAsia="Times" w:hAnsi="Times" w:cs="Times"/>
-                <w:color w:val="ED7D31" w:themeColor="accent2"/>
+            <w:vAlign w:val="center"/>
+          </w:tcPr>
+          <w:p>
+            <w:pPr>
+              <w:rPr>
+                <w:rFonts w:ascii="Times" w:eastAsia="Times" w:hAnsi="Times" w:cs="Times"/>
               </w:rPr>
             </w:pPr>
           </w:p>
@@ -3416,12 +3317,12 @@
         <w:tc>
           <w:tcPr>
             <w:tcW w:w="3679" w:type="dxa"/>
-          </w:tcPr>
-          <w:p>
-            <w:pPr>
-              <w:rPr>
-                <w:rFonts w:ascii="Times" w:eastAsia="Times" w:hAnsi="Times" w:cs="Times"/>
-                <w:color w:val="ED7D31" w:themeColor="accent2"/>
+            <w:vAlign w:val="center"/>
+          </w:tcPr>
+          <w:p>
+            <w:pPr>
+              <w:rPr>
+                <w:rFonts w:ascii="Times" w:eastAsia="Times" w:hAnsi="Times" w:cs="Times"/>
               </w:rPr>
             </w:pPr>
           </w:p>
@@ -3429,10 +3330,10 @@
         <w:tc>
           <w:tcPr>
             <w:tcW w:w="2711" w:type="dxa"/>
-          </w:tcPr>
-          <w:p>
-            <w:pPr>
-              <w:jc w:val="center"/>
+            <w:vAlign w:val="center"/>
+          </w:tcPr>
+          <w:p>
+            <w:pPr>
               <w:rPr>
                 <w:rFonts w:ascii="Times" w:eastAsia="Times" w:hAnsi="Times" w:cs="Times"/>
               </w:rPr>
@@ -3447,20 +3348,17 @@
         <w:tc>
           <w:tcPr>
             <w:tcW w:w="1782" w:type="dxa"/>
-          </w:tcPr>
-          <w:p>
-            <w:pPr>
-              <w:jc w:val="center"/>
-            </w:pPr>
-          </w:p>
+            <w:vAlign w:val="center"/>
+          </w:tcPr>
+          <w:p/>
         </w:tc>
         <w:tc>
           <w:tcPr>
             <w:tcW w:w="913" w:type="dxa"/>
-          </w:tcPr>
-          <w:p>
-            <w:pPr>
-              <w:jc w:val="center"/>
+            <w:vAlign w:val="center"/>
+          </w:tcPr>
+          <w:p>
+            <w:pPr>
               <w:rPr>
                 <w:rFonts w:ascii="Times" w:eastAsia="Times" w:hAnsi="Times" w:cs="Times"/>
               </w:rPr>
@@ -3470,6 +3368,7 @@
         <w:tc>
           <w:tcPr>
             <w:tcW w:w="3679" w:type="dxa"/>
+            <w:vAlign w:val="center"/>
           </w:tcPr>
           <w:p>
             <w:pPr>
@@ -3482,10 +3381,10 @@
         <w:tc>
           <w:tcPr>
             <w:tcW w:w="2711" w:type="dxa"/>
-          </w:tcPr>
-          <w:p>
-            <w:pPr>
-              <w:jc w:val="center"/>
+            <w:vAlign w:val="center"/>
+          </w:tcPr>
+          <w:p>
+            <w:pPr>
               <w:rPr>
                 <w:rFonts w:ascii="Times" w:eastAsia="Times" w:hAnsi="Times" w:cs="Times"/>
               </w:rPr>
@@ -3500,20 +3399,17 @@
         <w:tc>
           <w:tcPr>
             <w:tcW w:w="1782" w:type="dxa"/>
-          </w:tcPr>
-          <w:p>
-            <w:pPr>
-              <w:jc w:val="center"/>
-            </w:pPr>
-          </w:p>
+            <w:vAlign w:val="center"/>
+          </w:tcPr>
+          <w:p/>
         </w:tc>
         <w:tc>
           <w:tcPr>
             <w:tcW w:w="913" w:type="dxa"/>
-          </w:tcPr>
-          <w:p>
-            <w:pPr>
-              <w:jc w:val="center"/>
+            <w:vAlign w:val="center"/>
+          </w:tcPr>
+          <w:p>
+            <w:pPr>
               <w:rPr>
                 <w:rFonts w:ascii="Times" w:eastAsia="Times" w:hAnsi="Times" w:cs="Times"/>
               </w:rPr>
@@ -3523,6 +3419,7 @@
         <w:tc>
           <w:tcPr>
             <w:tcW w:w="3679" w:type="dxa"/>
+            <w:vAlign w:val="center"/>
           </w:tcPr>
           <w:p>
             <w:pPr>
@@ -3535,10 +3432,10 @@
         <w:tc>
           <w:tcPr>
             <w:tcW w:w="2711" w:type="dxa"/>
-          </w:tcPr>
-          <w:p>
-            <w:pPr>
-              <w:jc w:val="center"/>
+            <w:vAlign w:val="center"/>
+          </w:tcPr>
+          <w:p>
+            <w:pPr>
               <w:rPr>
                 <w:rFonts w:ascii="Times" w:eastAsia="Times" w:hAnsi="Times" w:cs="Times"/>
               </w:rPr>

</xml_diff>

<commit_message>
V11: Edited 1st batch to match new style guide
</commit_message>
<xml_diff>
--- a/Proof Reading and Review/LARA Bonecas Russas - Errata_v1.docx
+++ b/Proof Reading and Review/LARA Bonecas Russas - Errata_v1.docx
@@ -256,7 +256,44 @@
           <w:sz w:val="20"/>
           <w:szCs w:val="20"/>
         </w:rPr>
-        <w:t>. The relevant edits are also listed here in case I was incorrect, then kindly let me know. However if I was correct, you can simply leave those boxes blank.</w:t>
+        <w:t xml:space="preserve">. </w:t>
+      </w:r>
+    </w:p>
+    <w:p>
+      <w:pPr>
+        <w:pStyle w:val="ListParagraph"/>
+        <w:numPr>
+          <w:ilvl w:val="0"/>
+          <w:numId w:val="4"/>
+        </w:numPr>
+        <w:rPr>
+          <w:rFonts w:ascii="Times" w:eastAsia="Times" w:hAnsi="Times" w:cs="Times"/>
+          <w:b/>
+          <w:bCs/>
+          <w:sz w:val="20"/>
+          <w:szCs w:val="20"/>
+        </w:rPr>
+      </w:pPr>
+      <w:r>
+        <w:rPr>
+          <w:rFonts w:ascii="Times" w:eastAsia="Times" w:hAnsi="Times" w:cs="Times"/>
+          <w:b/>
+          <w:bCs/>
+          <w:color w:val="70AD47" w:themeColor="accent6"/>
+          <w:sz w:val="20"/>
+          <w:szCs w:val="20"/>
+        </w:rPr>
+        <w:t xml:space="preserve">Green </w:t>
+      </w:r>
+      <w:r>
+        <w:rPr>
+          <w:rFonts w:ascii="Times" w:eastAsia="Times" w:hAnsi="Times" w:cs="Times"/>
+          <w:b/>
+          <w:bCs/>
+          <w:sz w:val="20"/>
+          <w:szCs w:val="20"/>
+        </w:rPr>
+        <w:t>markings can be ignored – they are only for engraver reference.</w:t>
       </w:r>
     </w:p>
     <w:p>
@@ -284,10 +321,10 @@
         <w:tblLook w:val="0400" w:firstRow="0" w:lastRow="0" w:firstColumn="0" w:lastColumn="0" w:noHBand="0" w:noVBand="1"/>
       </w:tblPr>
       <w:tblGrid>
-        <w:gridCol w:w="2737"/>
-        <w:gridCol w:w="1400"/>
-        <w:gridCol w:w="6954"/>
-        <w:gridCol w:w="2857"/>
+        <w:gridCol w:w="1770"/>
+        <w:gridCol w:w="905"/>
+        <w:gridCol w:w="4495"/>
+        <w:gridCol w:w="1846"/>
       </w:tblGrid>
       <w:tr>
         <w:trPr>
@@ -424,157 +461,6 @@
               <w:rPr>
                 <w:rFonts w:ascii="Times" w:eastAsia="Times" w:hAnsi="Times" w:cs="Times"/>
               </w:rPr>
-              <w:t>27</w:t>
-            </w:r>
-          </w:p>
-        </w:tc>
-        <w:tc>
-          <w:tcPr>
-            <w:tcW w:w="2493" w:type="pct"/>
-            <w:vAlign w:val="center"/>
-          </w:tcPr>
-          <w:p>
-            <w:pPr>
-              <w:rPr>
-                <w:rFonts w:ascii="Times" w:eastAsia="Times" w:hAnsi="Times" w:cs="Times"/>
-              </w:rPr>
-            </w:pPr>
-          </w:p>
-          <w:p>
-            <w:pPr>
-              <w:rPr>
-                <w:rFonts w:ascii="Times" w:eastAsia="Times" w:hAnsi="Times" w:cs="Times"/>
-              </w:rPr>
-            </w:pPr>
-            <w:r>
-              <w:rPr>
-                <w:rFonts w:ascii="Times" w:eastAsia="Times" w:hAnsi="Times" w:cs="Times"/>
-                <w:noProof/>
-              </w:rPr>
-              <w:drawing>
-                <wp:inline distT="0" distB="0" distL="0" distR="0" wp14:anchorId="65140A51" wp14:editId="0D95A813">
-                  <wp:extent cx="1802980" cy="704428"/>
-                  <wp:effectExtent l="0" t="0" r="6985" b="635"/>
-                  <wp:docPr id="1489938688" name="Picture 1"/>
-                  <wp:cNvGraphicFramePr>
-                    <a:graphicFrameLocks xmlns:a="http://schemas.openxmlformats.org/drawingml/2006/main" noChangeAspect="1"/>
-                  </wp:cNvGraphicFramePr>
-                  <a:graphic xmlns:a="http://schemas.openxmlformats.org/drawingml/2006/main">
-                    <a:graphicData uri="http://schemas.openxmlformats.org/drawingml/2006/picture">
-                      <pic:pic xmlns:pic="http://schemas.openxmlformats.org/drawingml/2006/picture">
-                        <pic:nvPicPr>
-                          <pic:cNvPr id="1489938688" name=""/>
-                          <pic:cNvPicPr/>
-                        </pic:nvPicPr>
-                        <pic:blipFill>
-                          <a:blip r:embed="rId8"/>
-                          <a:stretch>
-                            <a:fillRect/>
-                          </a:stretch>
-                        </pic:blipFill>
-                        <pic:spPr>
-                          <a:xfrm>
-                            <a:off x="0" y="0"/>
-                            <a:ext cx="1818969" cy="710675"/>
-                          </a:xfrm>
-                          <a:prstGeom prst="rect">
-                            <a:avLst/>
-                          </a:prstGeom>
-                        </pic:spPr>
-                      </pic:pic>
-                    </a:graphicData>
-                  </a:graphic>
-                </wp:inline>
-              </w:drawing>
-            </w:r>
-          </w:p>
-          <w:p>
-            <w:pPr>
-              <w:rPr>
-                <w:rFonts w:ascii="Times" w:eastAsia="Times" w:hAnsi="Times" w:cs="Times"/>
-              </w:rPr>
-            </w:pPr>
-            <w:r>
-              <w:rPr>
-                <w:rFonts w:ascii="Times" w:eastAsia="Times" w:hAnsi="Times" w:cs="Times"/>
-              </w:rPr>
-              <w:t xml:space="preserve">Is this meant to be a 3 </w:t>
-            </w:r>
-            <w:proofErr w:type="spellStart"/>
-            <w:r>
-              <w:rPr>
-                <w:rFonts w:ascii="Times" w:eastAsia="Times" w:hAnsi="Times" w:cs="Times"/>
-              </w:rPr>
-              <w:t>tuplet</w:t>
-            </w:r>
-            <w:proofErr w:type="spellEnd"/>
-            <w:r>
-              <w:rPr>
-                <w:rFonts w:ascii="Times" w:eastAsia="Times" w:hAnsi="Times" w:cs="Times"/>
-              </w:rPr>
-              <w:t>?</w:t>
-            </w:r>
-          </w:p>
-          <w:p>
-            <w:pPr>
-              <w:rPr>
-                <w:rFonts w:ascii="Times" w:eastAsia="Times" w:hAnsi="Times" w:cs="Times"/>
-              </w:rPr>
-            </w:pPr>
-          </w:p>
-        </w:tc>
-        <w:tc>
-          <w:tcPr>
-            <w:tcW w:w="1024" w:type="pct"/>
-            <w:vAlign w:val="center"/>
-          </w:tcPr>
-          <w:p>
-            <w:pPr>
-              <w:rPr>
-                <w:rFonts w:ascii="Times" w:eastAsia="Times" w:hAnsi="Times" w:cs="Times"/>
-              </w:rPr>
-            </w:pPr>
-          </w:p>
-        </w:tc>
-      </w:tr>
-      <w:tr>
-        <w:trPr>
-          <w:trHeight w:val="552"/>
-        </w:trPr>
-        <w:tc>
-          <w:tcPr>
-            <w:tcW w:w="981" w:type="pct"/>
-            <w:vAlign w:val="center"/>
-          </w:tcPr>
-          <w:p>
-            <w:pPr>
-              <w:rPr>
-                <w:rFonts w:ascii="Times" w:eastAsia="Times" w:hAnsi="Times" w:cs="Times"/>
-              </w:rPr>
-            </w:pPr>
-            <w:r>
-              <w:rPr>
-                <w:rFonts w:ascii="Times" w:eastAsia="Times" w:hAnsi="Times" w:cs="Times"/>
-              </w:rPr>
-              <w:t>Trumpet</w:t>
-            </w:r>
-          </w:p>
-        </w:tc>
-        <w:tc>
-          <w:tcPr>
-            <w:tcW w:w="502" w:type="pct"/>
-            <w:vAlign w:val="center"/>
-          </w:tcPr>
-          <w:p>
-            <w:pPr>
-              <w:rPr>
-                <w:rFonts w:ascii="Times" w:eastAsia="Times" w:hAnsi="Times" w:cs="Times"/>
-              </w:rPr>
-            </w:pPr>
-            <w:r>
-              <w:rPr>
-                <w:rFonts w:ascii="Times" w:eastAsia="Times" w:hAnsi="Times" w:cs="Times"/>
-              </w:rPr>
               <w:t>59</w:t>
             </w:r>
           </w:p>
@@ -611,7 +497,7 @@
                           <pic:cNvPicPr/>
                         </pic:nvPicPr>
                         <pic:blipFill>
-                          <a:blip r:embed="rId9"/>
+                          <a:blip r:embed="rId8"/>
                           <a:stretch>
                             <a:fillRect/>
                           </a:stretch>
@@ -769,6 +655,7 @@
             <w:r>
               <w:rPr>
                 <w:rFonts w:ascii="Times" w:eastAsia="Times" w:hAnsi="Times" w:cs="Times"/>
+                <w:noProof/>
               </w:rPr>
               <w:drawing>
                 <wp:inline distT="0" distB="0" distL="0" distR="0" wp14:anchorId="3E6DD9AB" wp14:editId="39BCBB9D">
@@ -786,7 +673,7 @@
                           <pic:cNvPicPr/>
                         </pic:nvPicPr>
                         <pic:blipFill>
-                          <a:blip r:embed="rId10"/>
+                          <a:blip r:embed="rId9"/>
                           <a:stretch>
                             <a:fillRect/>
                           </a:stretch>
@@ -817,7 +704,13 @@
               <w:rPr>
                 <w:rFonts w:ascii="Times" w:eastAsia="Times" w:hAnsi="Times" w:cs="Times"/>
               </w:rPr>
-              <w:t xml:space="preserve">There is only one instance of G# M60 voice. </w:t>
+              <w:t>Are you referring to another passage?</w:t>
+            </w:r>
+            <w:r>
+              <w:rPr>
+                <w:rFonts w:ascii="Times" w:eastAsia="Times" w:hAnsi="Times" w:cs="Times"/>
+              </w:rPr>
+              <w:t xml:space="preserve"> </w:t>
             </w:r>
           </w:p>
         </w:tc>
@@ -850,6 +743,12 @@
                 <w:rFonts w:ascii="Times" w:eastAsia="Times" w:hAnsi="Times" w:cs="Times"/>
               </w:rPr>
             </w:pPr>
+            <w:r>
+              <w:rPr>
+                <w:rFonts w:ascii="Times" w:eastAsia="Times" w:hAnsi="Times" w:cs="Times"/>
+              </w:rPr>
+              <w:t>Trombone</w:t>
+            </w:r>
           </w:p>
         </w:tc>
         <w:tc>
@@ -863,6 +762,12 @@
                 <w:rFonts w:ascii="Times" w:eastAsia="Times" w:hAnsi="Times" w:cs="Times"/>
               </w:rPr>
             </w:pPr>
+            <w:r>
+              <w:rPr>
+                <w:rFonts w:ascii="Times" w:eastAsia="Times" w:hAnsi="Times" w:cs="Times"/>
+              </w:rPr>
+              <w:t>98, 105</w:t>
+            </w:r>
           </w:p>
         </w:tc>
         <w:tc>
@@ -876,6 +781,34 @@
                 <w:rFonts w:ascii="Times" w:eastAsia="Times" w:hAnsi="Times" w:cs="Times"/>
               </w:rPr>
             </w:pPr>
+            <w:proofErr w:type="spellStart"/>
+            <w:r>
+              <w:rPr>
+                <w:rFonts w:ascii="Times" w:eastAsia="Times" w:hAnsi="Times" w:cs="Times"/>
+              </w:rPr>
+              <w:t>Spuccato</w:t>
+            </w:r>
+            <w:proofErr w:type="spellEnd"/>
+            <w:r>
+              <w:rPr>
+                <w:rFonts w:ascii="Times" w:eastAsia="Times" w:hAnsi="Times" w:cs="Times"/>
+              </w:rPr>
+              <w:t xml:space="preserve"> (slap with lips) – I moved the ‘slap with lips’ instruction to the first occurrence of </w:t>
+            </w:r>
+            <w:proofErr w:type="spellStart"/>
+            <w:r>
+              <w:rPr>
+                <w:rFonts w:ascii="Times" w:eastAsia="Times" w:hAnsi="Times" w:cs="Times"/>
+              </w:rPr>
+              <w:t>Spuccato</w:t>
+            </w:r>
+            <w:proofErr w:type="spellEnd"/>
+            <w:r>
+              <w:rPr>
+                <w:rFonts w:ascii="Times" w:eastAsia="Times" w:hAnsi="Times" w:cs="Times"/>
+              </w:rPr>
+              <w:t xml:space="preserve"> in 98, instead of 105. Is that okay?</w:t>
+            </w:r>
           </w:p>
         </w:tc>
         <w:tc>
@@ -949,2701 +882,7 @@
           </w:p>
         </w:tc>
       </w:tr>
-      <w:tr>
-        <w:trPr>
-          <w:trHeight w:val="552"/>
-        </w:trPr>
-        <w:tc>
-          <w:tcPr>
-            <w:tcW w:w="981" w:type="pct"/>
-            <w:vAlign w:val="center"/>
-          </w:tcPr>
-          <w:p>
-            <w:pPr>
-              <w:rPr>
-                <w:rFonts w:ascii="Times" w:eastAsia="Times" w:hAnsi="Times" w:cs="Times"/>
-              </w:rPr>
-            </w:pPr>
-          </w:p>
-        </w:tc>
-        <w:tc>
-          <w:tcPr>
-            <w:tcW w:w="502" w:type="pct"/>
-            <w:vAlign w:val="center"/>
-          </w:tcPr>
-          <w:p>
-            <w:pPr>
-              <w:rPr>
-                <w:rFonts w:ascii="Times" w:eastAsia="Times" w:hAnsi="Times" w:cs="Times"/>
-              </w:rPr>
-            </w:pPr>
-          </w:p>
-        </w:tc>
-        <w:tc>
-          <w:tcPr>
-            <w:tcW w:w="2493" w:type="pct"/>
-            <w:vAlign w:val="center"/>
-          </w:tcPr>
-          <w:p>
-            <w:pPr>
-              <w:rPr>
-                <w:rFonts w:ascii="Times" w:eastAsia="Times" w:hAnsi="Times" w:cs="Times"/>
-              </w:rPr>
-            </w:pPr>
-          </w:p>
-        </w:tc>
-        <w:tc>
-          <w:tcPr>
-            <w:tcW w:w="1024" w:type="pct"/>
-            <w:vAlign w:val="center"/>
-          </w:tcPr>
-          <w:p>
-            <w:pPr>
-              <w:rPr>
-                <w:rFonts w:ascii="Times" w:eastAsia="Times" w:hAnsi="Times" w:cs="Times"/>
-              </w:rPr>
-            </w:pPr>
-          </w:p>
-        </w:tc>
-      </w:tr>
-      <w:tr>
-        <w:trPr>
-          <w:trHeight w:val="552"/>
-        </w:trPr>
-        <w:tc>
-          <w:tcPr>
-            <w:tcW w:w="981" w:type="pct"/>
-            <w:vAlign w:val="center"/>
-          </w:tcPr>
-          <w:p>
-            <w:pPr>
-              <w:rPr>
-                <w:rFonts w:ascii="Times" w:eastAsia="Times" w:hAnsi="Times" w:cs="Times"/>
-              </w:rPr>
-            </w:pPr>
-          </w:p>
-        </w:tc>
-        <w:tc>
-          <w:tcPr>
-            <w:tcW w:w="502" w:type="pct"/>
-            <w:vAlign w:val="center"/>
-          </w:tcPr>
-          <w:p>
-            <w:pPr>
-              <w:rPr>
-                <w:rFonts w:ascii="Times" w:eastAsia="Times" w:hAnsi="Times" w:cs="Times"/>
-              </w:rPr>
-            </w:pPr>
-          </w:p>
-        </w:tc>
-        <w:tc>
-          <w:tcPr>
-            <w:tcW w:w="2493" w:type="pct"/>
-            <w:vAlign w:val="center"/>
-          </w:tcPr>
-          <w:p>
-            <w:pPr>
-              <w:rPr>
-                <w:rFonts w:ascii="Times" w:eastAsia="Times" w:hAnsi="Times" w:cs="Times"/>
-              </w:rPr>
-            </w:pPr>
-          </w:p>
-        </w:tc>
-        <w:tc>
-          <w:tcPr>
-            <w:tcW w:w="1024" w:type="pct"/>
-            <w:vAlign w:val="center"/>
-          </w:tcPr>
-          <w:p>
-            <w:pPr>
-              <w:rPr>
-                <w:rFonts w:ascii="Times" w:eastAsia="Times" w:hAnsi="Times" w:cs="Times"/>
-              </w:rPr>
-            </w:pPr>
-          </w:p>
-        </w:tc>
-      </w:tr>
-      <w:tr>
-        <w:trPr>
-          <w:trHeight w:val="552"/>
-        </w:trPr>
-        <w:tc>
-          <w:tcPr>
-            <w:tcW w:w="981" w:type="pct"/>
-            <w:vAlign w:val="center"/>
-          </w:tcPr>
-          <w:p>
-            <w:pPr>
-              <w:rPr>
-                <w:rFonts w:ascii="Times" w:eastAsia="Times" w:hAnsi="Times" w:cs="Times"/>
-              </w:rPr>
-            </w:pPr>
-          </w:p>
-        </w:tc>
-        <w:tc>
-          <w:tcPr>
-            <w:tcW w:w="502" w:type="pct"/>
-            <w:vAlign w:val="center"/>
-          </w:tcPr>
-          <w:p>
-            <w:pPr>
-              <w:rPr>
-                <w:rFonts w:ascii="Times" w:eastAsia="Times" w:hAnsi="Times" w:cs="Times"/>
-              </w:rPr>
-            </w:pPr>
-          </w:p>
-        </w:tc>
-        <w:tc>
-          <w:tcPr>
-            <w:tcW w:w="2493" w:type="pct"/>
-            <w:vAlign w:val="center"/>
-          </w:tcPr>
-          <w:p>
-            <w:pPr>
-              <w:rPr>
-                <w:rFonts w:ascii="Times" w:eastAsia="Times" w:hAnsi="Times" w:cs="Times"/>
-              </w:rPr>
-            </w:pPr>
-          </w:p>
-        </w:tc>
-        <w:tc>
-          <w:tcPr>
-            <w:tcW w:w="1024" w:type="pct"/>
-            <w:vAlign w:val="center"/>
-          </w:tcPr>
-          <w:p>
-            <w:pPr>
-              <w:rPr>
-                <w:rFonts w:ascii="Times" w:eastAsia="Times" w:hAnsi="Times" w:cs="Times"/>
-              </w:rPr>
-            </w:pPr>
-          </w:p>
-        </w:tc>
-      </w:tr>
-      <w:tr>
-        <w:trPr>
-          <w:trHeight w:val="552"/>
-        </w:trPr>
-        <w:tc>
-          <w:tcPr>
-            <w:tcW w:w="981" w:type="pct"/>
-            <w:vAlign w:val="center"/>
-          </w:tcPr>
-          <w:p>
-            <w:pPr>
-              <w:rPr>
-                <w:rFonts w:ascii="Times" w:eastAsia="Times" w:hAnsi="Times" w:cs="Times"/>
-              </w:rPr>
-            </w:pPr>
-          </w:p>
-        </w:tc>
-        <w:tc>
-          <w:tcPr>
-            <w:tcW w:w="502" w:type="pct"/>
-            <w:vAlign w:val="center"/>
-          </w:tcPr>
-          <w:p>
-            <w:pPr>
-              <w:rPr>
-                <w:rFonts w:ascii="Times" w:eastAsia="Times" w:hAnsi="Times" w:cs="Times"/>
-              </w:rPr>
-            </w:pPr>
-          </w:p>
-        </w:tc>
-        <w:tc>
-          <w:tcPr>
-            <w:tcW w:w="2493" w:type="pct"/>
-            <w:vAlign w:val="center"/>
-          </w:tcPr>
-          <w:p>
-            <w:pPr>
-              <w:rPr>
-                <w:rFonts w:ascii="Times" w:eastAsia="Times" w:hAnsi="Times" w:cs="Times"/>
-              </w:rPr>
-            </w:pPr>
-          </w:p>
-        </w:tc>
-        <w:tc>
-          <w:tcPr>
-            <w:tcW w:w="1024" w:type="pct"/>
-            <w:vAlign w:val="center"/>
-          </w:tcPr>
-          <w:p>
-            <w:pPr>
-              <w:rPr>
-                <w:rFonts w:ascii="Times" w:eastAsia="Times" w:hAnsi="Times" w:cs="Times"/>
-              </w:rPr>
-            </w:pPr>
-          </w:p>
-        </w:tc>
-      </w:tr>
-      <w:tr>
-        <w:trPr>
-          <w:trHeight w:val="552"/>
-        </w:trPr>
-        <w:tc>
-          <w:tcPr>
-            <w:tcW w:w="981" w:type="pct"/>
-            <w:vAlign w:val="center"/>
-          </w:tcPr>
-          <w:p/>
-        </w:tc>
-        <w:tc>
-          <w:tcPr>
-            <w:tcW w:w="502" w:type="pct"/>
-            <w:vAlign w:val="center"/>
-          </w:tcPr>
-          <w:p>
-            <w:pPr>
-              <w:rPr>
-                <w:rFonts w:ascii="Times" w:eastAsia="Times" w:hAnsi="Times" w:cs="Times"/>
-              </w:rPr>
-            </w:pPr>
-          </w:p>
-        </w:tc>
-        <w:tc>
-          <w:tcPr>
-            <w:tcW w:w="2493" w:type="pct"/>
-            <w:vAlign w:val="center"/>
-          </w:tcPr>
-          <w:p>
-            <w:pPr>
-              <w:rPr>
-                <w:rFonts w:ascii="Times" w:eastAsia="Times" w:hAnsi="Times" w:cs="Times"/>
-              </w:rPr>
-            </w:pPr>
-          </w:p>
-        </w:tc>
-        <w:tc>
-          <w:tcPr>
-            <w:tcW w:w="1024" w:type="pct"/>
-            <w:vAlign w:val="center"/>
-          </w:tcPr>
-          <w:p>
-            <w:pPr>
-              <w:rPr>
-                <w:rFonts w:ascii="Times" w:eastAsia="Times" w:hAnsi="Times" w:cs="Times"/>
-              </w:rPr>
-            </w:pPr>
-          </w:p>
-        </w:tc>
-      </w:tr>
-      <w:tr>
-        <w:trPr>
-          <w:trHeight w:val="552"/>
-        </w:trPr>
-        <w:tc>
-          <w:tcPr>
-            <w:tcW w:w="981" w:type="pct"/>
-            <w:vAlign w:val="center"/>
-          </w:tcPr>
-          <w:p/>
-        </w:tc>
-        <w:tc>
-          <w:tcPr>
-            <w:tcW w:w="502" w:type="pct"/>
-            <w:vAlign w:val="center"/>
-          </w:tcPr>
-          <w:p>
-            <w:pPr>
-              <w:rPr>
-                <w:rFonts w:ascii="Times" w:eastAsia="Times" w:hAnsi="Times" w:cs="Times"/>
-              </w:rPr>
-            </w:pPr>
-          </w:p>
-        </w:tc>
-        <w:tc>
-          <w:tcPr>
-            <w:tcW w:w="2493" w:type="pct"/>
-            <w:vAlign w:val="center"/>
-          </w:tcPr>
-          <w:p>
-            <w:pPr>
-              <w:rPr>
-                <w:rFonts w:ascii="Times" w:eastAsia="Times" w:hAnsi="Times" w:cs="Times"/>
-              </w:rPr>
-            </w:pPr>
-          </w:p>
-        </w:tc>
-        <w:tc>
-          <w:tcPr>
-            <w:tcW w:w="1024" w:type="pct"/>
-            <w:vAlign w:val="center"/>
-          </w:tcPr>
-          <w:p>
-            <w:pPr>
-              <w:rPr>
-                <w:rFonts w:ascii="Times" w:eastAsia="Times" w:hAnsi="Times" w:cs="Times"/>
-              </w:rPr>
-            </w:pPr>
-          </w:p>
-        </w:tc>
-      </w:tr>
-      <w:tr>
-        <w:trPr>
-          <w:trHeight w:val="552"/>
-        </w:trPr>
-        <w:tc>
-          <w:tcPr>
-            <w:tcW w:w="981" w:type="pct"/>
-            <w:vAlign w:val="center"/>
-          </w:tcPr>
-          <w:p/>
-        </w:tc>
-        <w:tc>
-          <w:tcPr>
-            <w:tcW w:w="502" w:type="pct"/>
-            <w:vAlign w:val="center"/>
-          </w:tcPr>
-          <w:p>
-            <w:pPr>
-              <w:rPr>
-                <w:rFonts w:ascii="Times" w:eastAsia="Times" w:hAnsi="Times" w:cs="Times"/>
-              </w:rPr>
-            </w:pPr>
-          </w:p>
-        </w:tc>
-        <w:tc>
-          <w:tcPr>
-            <w:tcW w:w="2493" w:type="pct"/>
-            <w:vAlign w:val="center"/>
-          </w:tcPr>
-          <w:p>
-            <w:pPr>
-              <w:rPr>
-                <w:rFonts w:ascii="Times" w:eastAsia="Times" w:hAnsi="Times" w:cs="Times"/>
-              </w:rPr>
-            </w:pPr>
-          </w:p>
-        </w:tc>
-        <w:tc>
-          <w:tcPr>
-            <w:tcW w:w="1024" w:type="pct"/>
-            <w:vAlign w:val="center"/>
-          </w:tcPr>
-          <w:p>
-            <w:pPr>
-              <w:rPr>
-                <w:rFonts w:ascii="Times" w:eastAsia="Times" w:hAnsi="Times" w:cs="Times"/>
-              </w:rPr>
-            </w:pPr>
-          </w:p>
-        </w:tc>
-      </w:tr>
-      <w:tr>
-        <w:trPr>
-          <w:trHeight w:val="552"/>
-        </w:trPr>
-        <w:tc>
-          <w:tcPr>
-            <w:tcW w:w="981" w:type="pct"/>
-            <w:vAlign w:val="center"/>
-          </w:tcPr>
-          <w:p/>
-        </w:tc>
-        <w:tc>
-          <w:tcPr>
-            <w:tcW w:w="502" w:type="pct"/>
-            <w:vAlign w:val="center"/>
-          </w:tcPr>
-          <w:p>
-            <w:pPr>
-              <w:rPr>
-                <w:rFonts w:ascii="Times" w:eastAsia="Times" w:hAnsi="Times" w:cs="Times"/>
-              </w:rPr>
-            </w:pPr>
-          </w:p>
-        </w:tc>
-        <w:tc>
-          <w:tcPr>
-            <w:tcW w:w="2493" w:type="pct"/>
-            <w:vAlign w:val="center"/>
-          </w:tcPr>
-          <w:p>
-            <w:pPr>
-              <w:rPr>
-                <w:rFonts w:ascii="Times" w:eastAsia="Times" w:hAnsi="Times" w:cs="Times"/>
-              </w:rPr>
-            </w:pPr>
-          </w:p>
-        </w:tc>
-        <w:tc>
-          <w:tcPr>
-            <w:tcW w:w="1024" w:type="pct"/>
-            <w:vAlign w:val="center"/>
-          </w:tcPr>
-          <w:p>
-            <w:pPr>
-              <w:rPr>
-                <w:rFonts w:ascii="Times" w:eastAsia="Times" w:hAnsi="Times" w:cs="Times"/>
-              </w:rPr>
-            </w:pPr>
-          </w:p>
-        </w:tc>
-      </w:tr>
-      <w:tr>
-        <w:trPr>
-          <w:trHeight w:val="552"/>
-        </w:trPr>
-        <w:tc>
-          <w:tcPr>
-            <w:tcW w:w="981" w:type="pct"/>
-            <w:vAlign w:val="center"/>
-          </w:tcPr>
-          <w:p/>
-        </w:tc>
-        <w:tc>
-          <w:tcPr>
-            <w:tcW w:w="502" w:type="pct"/>
-            <w:vAlign w:val="center"/>
-          </w:tcPr>
-          <w:p>
-            <w:pPr>
-              <w:rPr>
-                <w:rFonts w:ascii="Times" w:eastAsia="Times" w:hAnsi="Times" w:cs="Times"/>
-              </w:rPr>
-            </w:pPr>
-          </w:p>
-        </w:tc>
-        <w:tc>
-          <w:tcPr>
-            <w:tcW w:w="2493" w:type="pct"/>
-            <w:vAlign w:val="center"/>
-          </w:tcPr>
-          <w:p>
-            <w:pPr>
-              <w:rPr>
-                <w:rFonts w:ascii="Times" w:eastAsia="Times" w:hAnsi="Times" w:cs="Times"/>
-              </w:rPr>
-            </w:pPr>
-          </w:p>
-        </w:tc>
-        <w:tc>
-          <w:tcPr>
-            <w:tcW w:w="1024" w:type="pct"/>
-            <w:vAlign w:val="center"/>
-          </w:tcPr>
-          <w:p>
-            <w:pPr>
-              <w:rPr>
-                <w:rFonts w:ascii="Times" w:eastAsia="Times" w:hAnsi="Times" w:cs="Times"/>
-              </w:rPr>
-            </w:pPr>
-          </w:p>
-        </w:tc>
-      </w:tr>
-      <w:tr>
-        <w:trPr>
-          <w:trHeight w:val="552"/>
-        </w:trPr>
-        <w:tc>
-          <w:tcPr>
-            <w:tcW w:w="981" w:type="pct"/>
-            <w:vAlign w:val="center"/>
-          </w:tcPr>
-          <w:p/>
-        </w:tc>
-        <w:tc>
-          <w:tcPr>
-            <w:tcW w:w="502" w:type="pct"/>
-            <w:vAlign w:val="center"/>
-          </w:tcPr>
-          <w:p>
-            <w:pPr>
-              <w:rPr>
-                <w:rFonts w:ascii="Times" w:eastAsia="Times" w:hAnsi="Times" w:cs="Times"/>
-              </w:rPr>
-            </w:pPr>
-          </w:p>
-        </w:tc>
-        <w:tc>
-          <w:tcPr>
-            <w:tcW w:w="2493" w:type="pct"/>
-            <w:vAlign w:val="center"/>
-          </w:tcPr>
-          <w:p>
-            <w:pPr>
-              <w:rPr>
-                <w:rFonts w:ascii="Times" w:eastAsia="Times" w:hAnsi="Times" w:cs="Times"/>
-              </w:rPr>
-            </w:pPr>
-          </w:p>
-        </w:tc>
-        <w:tc>
-          <w:tcPr>
-            <w:tcW w:w="1024" w:type="pct"/>
-            <w:vAlign w:val="center"/>
-          </w:tcPr>
-          <w:p>
-            <w:pPr>
-              <w:rPr>
-                <w:rFonts w:ascii="Times" w:eastAsia="Times" w:hAnsi="Times" w:cs="Times"/>
-              </w:rPr>
-            </w:pPr>
-          </w:p>
-        </w:tc>
-      </w:tr>
-      <w:tr>
-        <w:trPr>
-          <w:trHeight w:val="552"/>
-        </w:trPr>
-        <w:tc>
-          <w:tcPr>
-            <w:tcW w:w="981" w:type="pct"/>
-            <w:vAlign w:val="center"/>
-          </w:tcPr>
-          <w:p/>
-        </w:tc>
-        <w:tc>
-          <w:tcPr>
-            <w:tcW w:w="502" w:type="pct"/>
-            <w:vAlign w:val="center"/>
-          </w:tcPr>
-          <w:p>
-            <w:pPr>
-              <w:rPr>
-                <w:rFonts w:ascii="Times" w:eastAsia="Times" w:hAnsi="Times" w:cs="Times"/>
-              </w:rPr>
-            </w:pPr>
-          </w:p>
-        </w:tc>
-        <w:tc>
-          <w:tcPr>
-            <w:tcW w:w="2493" w:type="pct"/>
-            <w:vAlign w:val="center"/>
-          </w:tcPr>
-          <w:p>
-            <w:pPr>
-              <w:rPr>
-                <w:rFonts w:ascii="Times" w:eastAsia="Times" w:hAnsi="Times" w:cs="Times"/>
-              </w:rPr>
-            </w:pPr>
-          </w:p>
-        </w:tc>
-        <w:tc>
-          <w:tcPr>
-            <w:tcW w:w="1024" w:type="pct"/>
-            <w:vAlign w:val="center"/>
-          </w:tcPr>
-          <w:p>
-            <w:pPr>
-              <w:rPr>
-                <w:rFonts w:ascii="Times" w:eastAsia="Times" w:hAnsi="Times" w:cs="Times"/>
-              </w:rPr>
-            </w:pPr>
-          </w:p>
-        </w:tc>
-      </w:tr>
-      <w:tr>
-        <w:trPr>
-          <w:trHeight w:val="552"/>
-        </w:trPr>
-        <w:tc>
-          <w:tcPr>
-            <w:tcW w:w="981" w:type="pct"/>
-            <w:vAlign w:val="center"/>
-          </w:tcPr>
-          <w:p/>
-        </w:tc>
-        <w:tc>
-          <w:tcPr>
-            <w:tcW w:w="502" w:type="pct"/>
-            <w:vAlign w:val="center"/>
-          </w:tcPr>
-          <w:p>
-            <w:pPr>
-              <w:rPr>
-                <w:rFonts w:ascii="Times" w:eastAsia="Times" w:hAnsi="Times" w:cs="Times"/>
-              </w:rPr>
-            </w:pPr>
-          </w:p>
-        </w:tc>
-        <w:tc>
-          <w:tcPr>
-            <w:tcW w:w="2493" w:type="pct"/>
-            <w:vAlign w:val="center"/>
-          </w:tcPr>
-          <w:p>
-            <w:pPr>
-              <w:rPr>
-                <w:rFonts w:ascii="Times" w:eastAsia="Times" w:hAnsi="Times" w:cs="Times"/>
-              </w:rPr>
-            </w:pPr>
-          </w:p>
-        </w:tc>
-        <w:tc>
-          <w:tcPr>
-            <w:tcW w:w="1024" w:type="pct"/>
-            <w:vAlign w:val="center"/>
-          </w:tcPr>
-          <w:p>
-            <w:pPr>
-              <w:rPr>
-                <w:rFonts w:ascii="Times" w:eastAsia="Times" w:hAnsi="Times" w:cs="Times"/>
-              </w:rPr>
-            </w:pPr>
-          </w:p>
-        </w:tc>
-      </w:tr>
-      <w:tr>
-        <w:trPr>
-          <w:trHeight w:val="552"/>
-        </w:trPr>
-        <w:tc>
-          <w:tcPr>
-            <w:tcW w:w="981" w:type="pct"/>
-            <w:vAlign w:val="center"/>
-          </w:tcPr>
-          <w:p/>
-        </w:tc>
-        <w:tc>
-          <w:tcPr>
-            <w:tcW w:w="502" w:type="pct"/>
-            <w:vAlign w:val="center"/>
-          </w:tcPr>
-          <w:p>
-            <w:pPr>
-              <w:rPr>
-                <w:rFonts w:ascii="Times" w:eastAsia="Times" w:hAnsi="Times" w:cs="Times"/>
-              </w:rPr>
-            </w:pPr>
-          </w:p>
-        </w:tc>
-        <w:tc>
-          <w:tcPr>
-            <w:tcW w:w="2493" w:type="pct"/>
-            <w:vAlign w:val="center"/>
-          </w:tcPr>
-          <w:p>
-            <w:pPr>
-              <w:rPr>
-                <w:rFonts w:ascii="Times" w:eastAsia="Times" w:hAnsi="Times" w:cs="Times"/>
-              </w:rPr>
-            </w:pPr>
-          </w:p>
-        </w:tc>
-        <w:tc>
-          <w:tcPr>
-            <w:tcW w:w="1024" w:type="pct"/>
-            <w:vAlign w:val="center"/>
-          </w:tcPr>
-          <w:p>
-            <w:pPr>
-              <w:rPr>
-                <w:rFonts w:ascii="Times" w:eastAsia="Times" w:hAnsi="Times" w:cs="Times"/>
-              </w:rPr>
-            </w:pPr>
-          </w:p>
-        </w:tc>
-      </w:tr>
-      <w:tr>
-        <w:trPr>
-          <w:trHeight w:val="552"/>
-        </w:trPr>
-        <w:tc>
-          <w:tcPr>
-            <w:tcW w:w="981" w:type="pct"/>
-            <w:vAlign w:val="center"/>
-          </w:tcPr>
-          <w:p/>
-        </w:tc>
-        <w:tc>
-          <w:tcPr>
-            <w:tcW w:w="502" w:type="pct"/>
-            <w:vAlign w:val="center"/>
-          </w:tcPr>
-          <w:p>
-            <w:pPr>
-              <w:rPr>
-                <w:rFonts w:ascii="Times" w:eastAsia="Times" w:hAnsi="Times" w:cs="Times"/>
-              </w:rPr>
-            </w:pPr>
-          </w:p>
-        </w:tc>
-        <w:tc>
-          <w:tcPr>
-            <w:tcW w:w="2493" w:type="pct"/>
-            <w:vAlign w:val="center"/>
-          </w:tcPr>
-          <w:p>
-            <w:pPr>
-              <w:rPr>
-                <w:rFonts w:ascii="Times" w:eastAsia="Times" w:hAnsi="Times" w:cs="Times"/>
-              </w:rPr>
-            </w:pPr>
-          </w:p>
-        </w:tc>
-        <w:tc>
-          <w:tcPr>
-            <w:tcW w:w="1024" w:type="pct"/>
-            <w:vAlign w:val="center"/>
-          </w:tcPr>
-          <w:p>
-            <w:pPr>
-              <w:rPr>
-                <w:rFonts w:ascii="Times" w:eastAsia="Times" w:hAnsi="Times" w:cs="Times"/>
-              </w:rPr>
-            </w:pPr>
-          </w:p>
-        </w:tc>
-      </w:tr>
-      <w:tr>
-        <w:trPr>
-          <w:trHeight w:val="552"/>
-        </w:trPr>
-        <w:tc>
-          <w:tcPr>
-            <w:tcW w:w="981" w:type="pct"/>
-            <w:vAlign w:val="center"/>
-          </w:tcPr>
-          <w:p/>
-        </w:tc>
-        <w:tc>
-          <w:tcPr>
-            <w:tcW w:w="502" w:type="pct"/>
-            <w:vAlign w:val="center"/>
-          </w:tcPr>
-          <w:p>
-            <w:pPr>
-              <w:rPr>
-                <w:rFonts w:ascii="Times" w:eastAsia="Times" w:hAnsi="Times" w:cs="Times"/>
-              </w:rPr>
-            </w:pPr>
-          </w:p>
-        </w:tc>
-        <w:tc>
-          <w:tcPr>
-            <w:tcW w:w="2493" w:type="pct"/>
-            <w:vAlign w:val="center"/>
-          </w:tcPr>
-          <w:p>
-            <w:pPr>
-              <w:rPr>
-                <w:rFonts w:ascii="Times" w:eastAsia="Times" w:hAnsi="Times" w:cs="Times"/>
-              </w:rPr>
-            </w:pPr>
-          </w:p>
-        </w:tc>
-        <w:tc>
-          <w:tcPr>
-            <w:tcW w:w="1024" w:type="pct"/>
-            <w:vAlign w:val="center"/>
-          </w:tcPr>
-          <w:p>
-            <w:pPr>
-              <w:rPr>
-                <w:rFonts w:ascii="Times" w:eastAsia="Times" w:hAnsi="Times" w:cs="Times"/>
-              </w:rPr>
-            </w:pPr>
-          </w:p>
-        </w:tc>
-      </w:tr>
-      <w:tr>
-        <w:trPr>
-          <w:trHeight w:val="552"/>
-        </w:trPr>
-        <w:tc>
-          <w:tcPr>
-            <w:tcW w:w="981" w:type="pct"/>
-            <w:vAlign w:val="center"/>
-          </w:tcPr>
-          <w:p/>
-        </w:tc>
-        <w:tc>
-          <w:tcPr>
-            <w:tcW w:w="502" w:type="pct"/>
-            <w:vAlign w:val="center"/>
-          </w:tcPr>
-          <w:p>
-            <w:pPr>
-              <w:rPr>
-                <w:rFonts w:ascii="Times" w:eastAsia="Times" w:hAnsi="Times" w:cs="Times"/>
-              </w:rPr>
-            </w:pPr>
-          </w:p>
-        </w:tc>
-        <w:tc>
-          <w:tcPr>
-            <w:tcW w:w="2493" w:type="pct"/>
-            <w:vAlign w:val="center"/>
-          </w:tcPr>
-          <w:p>
-            <w:pPr>
-              <w:rPr>
-                <w:rFonts w:ascii="Times" w:eastAsia="Times" w:hAnsi="Times" w:cs="Times"/>
-              </w:rPr>
-            </w:pPr>
-          </w:p>
-        </w:tc>
-        <w:tc>
-          <w:tcPr>
-            <w:tcW w:w="1024" w:type="pct"/>
-            <w:vAlign w:val="center"/>
-          </w:tcPr>
-          <w:p>
-            <w:pPr>
-              <w:rPr>
-                <w:rFonts w:ascii="Times" w:eastAsia="Times" w:hAnsi="Times" w:cs="Times"/>
-              </w:rPr>
-            </w:pPr>
-          </w:p>
-        </w:tc>
-      </w:tr>
-      <w:tr>
-        <w:trPr>
-          <w:trHeight w:val="552"/>
-        </w:trPr>
-        <w:tc>
-          <w:tcPr>
-            <w:tcW w:w="981" w:type="pct"/>
-            <w:vAlign w:val="center"/>
-          </w:tcPr>
-          <w:p/>
-        </w:tc>
-        <w:tc>
-          <w:tcPr>
-            <w:tcW w:w="502" w:type="pct"/>
-            <w:vAlign w:val="center"/>
-          </w:tcPr>
-          <w:p>
-            <w:pPr>
-              <w:rPr>
-                <w:rFonts w:ascii="Times" w:eastAsia="Times" w:hAnsi="Times" w:cs="Times"/>
-              </w:rPr>
-            </w:pPr>
-          </w:p>
-        </w:tc>
-        <w:tc>
-          <w:tcPr>
-            <w:tcW w:w="2493" w:type="pct"/>
-            <w:vAlign w:val="center"/>
-          </w:tcPr>
-          <w:p>
-            <w:pPr>
-              <w:rPr>
-                <w:rFonts w:ascii="Times" w:eastAsia="Times" w:hAnsi="Times" w:cs="Times"/>
-              </w:rPr>
-            </w:pPr>
-          </w:p>
-        </w:tc>
-        <w:tc>
-          <w:tcPr>
-            <w:tcW w:w="1024" w:type="pct"/>
-            <w:vAlign w:val="center"/>
-          </w:tcPr>
-          <w:p>
-            <w:pPr>
-              <w:rPr>
-                <w:rFonts w:ascii="Times" w:eastAsia="Times" w:hAnsi="Times" w:cs="Times"/>
-              </w:rPr>
-            </w:pPr>
-          </w:p>
-        </w:tc>
-      </w:tr>
-      <w:tr>
-        <w:trPr>
-          <w:trHeight w:val="552"/>
-        </w:trPr>
-        <w:tc>
-          <w:tcPr>
-            <w:tcW w:w="981" w:type="pct"/>
-            <w:vAlign w:val="center"/>
-          </w:tcPr>
-          <w:p/>
-        </w:tc>
-        <w:tc>
-          <w:tcPr>
-            <w:tcW w:w="502" w:type="pct"/>
-            <w:vAlign w:val="center"/>
-          </w:tcPr>
-          <w:p>
-            <w:pPr>
-              <w:rPr>
-                <w:rFonts w:ascii="Times" w:eastAsia="Times" w:hAnsi="Times" w:cs="Times"/>
-              </w:rPr>
-            </w:pPr>
-          </w:p>
-        </w:tc>
-        <w:tc>
-          <w:tcPr>
-            <w:tcW w:w="2493" w:type="pct"/>
-            <w:vAlign w:val="center"/>
-          </w:tcPr>
-          <w:p>
-            <w:pPr>
-              <w:rPr>
-                <w:rFonts w:ascii="Times" w:eastAsia="Times" w:hAnsi="Times" w:cs="Times"/>
-              </w:rPr>
-            </w:pPr>
-          </w:p>
-        </w:tc>
-        <w:tc>
-          <w:tcPr>
-            <w:tcW w:w="1024" w:type="pct"/>
-            <w:vAlign w:val="center"/>
-          </w:tcPr>
-          <w:p>
-            <w:pPr>
-              <w:rPr>
-                <w:rFonts w:ascii="Times" w:eastAsia="Times" w:hAnsi="Times" w:cs="Times"/>
-              </w:rPr>
-            </w:pPr>
-          </w:p>
-        </w:tc>
-      </w:tr>
-      <w:tr>
-        <w:trPr>
-          <w:trHeight w:val="552"/>
-        </w:trPr>
-        <w:tc>
-          <w:tcPr>
-            <w:tcW w:w="981" w:type="pct"/>
-            <w:vAlign w:val="center"/>
-          </w:tcPr>
-          <w:p/>
-        </w:tc>
-        <w:tc>
-          <w:tcPr>
-            <w:tcW w:w="502" w:type="pct"/>
-            <w:vAlign w:val="center"/>
-          </w:tcPr>
-          <w:p>
-            <w:pPr>
-              <w:rPr>
-                <w:rFonts w:ascii="Times" w:eastAsia="Times" w:hAnsi="Times" w:cs="Times"/>
-              </w:rPr>
-            </w:pPr>
-          </w:p>
-        </w:tc>
-        <w:tc>
-          <w:tcPr>
-            <w:tcW w:w="2493" w:type="pct"/>
-            <w:vAlign w:val="center"/>
-          </w:tcPr>
-          <w:p>
-            <w:pPr>
-              <w:rPr>
-                <w:rFonts w:ascii="Times" w:eastAsia="Times" w:hAnsi="Times" w:cs="Times"/>
-              </w:rPr>
-            </w:pPr>
-          </w:p>
-        </w:tc>
-        <w:tc>
-          <w:tcPr>
-            <w:tcW w:w="1024" w:type="pct"/>
-            <w:vAlign w:val="center"/>
-          </w:tcPr>
-          <w:p>
-            <w:pPr>
-              <w:rPr>
-                <w:rFonts w:ascii="Times" w:eastAsia="Times" w:hAnsi="Times" w:cs="Times"/>
-              </w:rPr>
-            </w:pPr>
-          </w:p>
-        </w:tc>
-      </w:tr>
-      <w:tr>
-        <w:trPr>
-          <w:trHeight w:val="552"/>
-        </w:trPr>
-        <w:tc>
-          <w:tcPr>
-            <w:tcW w:w="981" w:type="pct"/>
-            <w:vAlign w:val="center"/>
-          </w:tcPr>
-          <w:p/>
-        </w:tc>
-        <w:tc>
-          <w:tcPr>
-            <w:tcW w:w="502" w:type="pct"/>
-            <w:vAlign w:val="center"/>
-          </w:tcPr>
-          <w:p>
-            <w:pPr>
-              <w:rPr>
-                <w:rFonts w:ascii="Times" w:eastAsia="Times" w:hAnsi="Times" w:cs="Times"/>
-              </w:rPr>
-            </w:pPr>
-          </w:p>
-        </w:tc>
-        <w:tc>
-          <w:tcPr>
-            <w:tcW w:w="2493" w:type="pct"/>
-            <w:vAlign w:val="center"/>
-          </w:tcPr>
-          <w:p>
-            <w:pPr>
-              <w:rPr>
-                <w:rFonts w:ascii="Times" w:eastAsia="Times" w:hAnsi="Times" w:cs="Times"/>
-              </w:rPr>
-            </w:pPr>
-          </w:p>
-        </w:tc>
-        <w:tc>
-          <w:tcPr>
-            <w:tcW w:w="1024" w:type="pct"/>
-            <w:vAlign w:val="center"/>
-          </w:tcPr>
-          <w:p>
-            <w:pPr>
-              <w:rPr>
-                <w:rFonts w:ascii="Times" w:eastAsia="Times" w:hAnsi="Times" w:cs="Times"/>
-              </w:rPr>
-            </w:pPr>
-          </w:p>
-        </w:tc>
-      </w:tr>
-      <w:tr>
-        <w:trPr>
-          <w:trHeight w:val="552"/>
-        </w:trPr>
-        <w:tc>
-          <w:tcPr>
-            <w:tcW w:w="981" w:type="pct"/>
-            <w:vAlign w:val="center"/>
-          </w:tcPr>
-          <w:p/>
-        </w:tc>
-        <w:tc>
-          <w:tcPr>
-            <w:tcW w:w="502" w:type="pct"/>
-            <w:vAlign w:val="center"/>
-          </w:tcPr>
-          <w:p>
-            <w:pPr>
-              <w:rPr>
-                <w:rFonts w:ascii="Times" w:eastAsia="Times" w:hAnsi="Times" w:cs="Times"/>
-              </w:rPr>
-            </w:pPr>
-          </w:p>
-        </w:tc>
-        <w:tc>
-          <w:tcPr>
-            <w:tcW w:w="2493" w:type="pct"/>
-            <w:vAlign w:val="center"/>
-          </w:tcPr>
-          <w:p>
-            <w:pPr>
-              <w:rPr>
-                <w:rFonts w:ascii="Times" w:eastAsia="Times" w:hAnsi="Times" w:cs="Times"/>
-              </w:rPr>
-            </w:pPr>
-          </w:p>
-        </w:tc>
-        <w:tc>
-          <w:tcPr>
-            <w:tcW w:w="1024" w:type="pct"/>
-            <w:vAlign w:val="center"/>
-          </w:tcPr>
-          <w:p>
-            <w:pPr>
-              <w:rPr>
-                <w:rFonts w:ascii="Times" w:eastAsia="Times" w:hAnsi="Times" w:cs="Times"/>
-              </w:rPr>
-            </w:pPr>
-          </w:p>
-        </w:tc>
-      </w:tr>
-      <w:tr>
-        <w:trPr>
-          <w:trHeight w:val="552"/>
-        </w:trPr>
-        <w:tc>
-          <w:tcPr>
-            <w:tcW w:w="981" w:type="pct"/>
-            <w:vAlign w:val="center"/>
-          </w:tcPr>
-          <w:p/>
-        </w:tc>
-        <w:tc>
-          <w:tcPr>
-            <w:tcW w:w="502" w:type="pct"/>
-            <w:vAlign w:val="center"/>
-          </w:tcPr>
-          <w:p>
-            <w:pPr>
-              <w:rPr>
-                <w:rFonts w:ascii="Times" w:eastAsia="Times" w:hAnsi="Times" w:cs="Times"/>
-              </w:rPr>
-            </w:pPr>
-          </w:p>
-        </w:tc>
-        <w:tc>
-          <w:tcPr>
-            <w:tcW w:w="2493" w:type="pct"/>
-            <w:vAlign w:val="center"/>
-          </w:tcPr>
-          <w:p>
-            <w:pPr>
-              <w:rPr>
-                <w:rFonts w:ascii="Times" w:eastAsia="Times" w:hAnsi="Times" w:cs="Times"/>
-              </w:rPr>
-            </w:pPr>
-          </w:p>
-        </w:tc>
-        <w:tc>
-          <w:tcPr>
-            <w:tcW w:w="1024" w:type="pct"/>
-            <w:vAlign w:val="center"/>
-          </w:tcPr>
-          <w:p>
-            <w:pPr>
-              <w:rPr>
-                <w:rFonts w:ascii="Times" w:eastAsia="Times" w:hAnsi="Times" w:cs="Times"/>
-              </w:rPr>
-            </w:pPr>
-          </w:p>
-        </w:tc>
-      </w:tr>
-      <w:tr>
-        <w:trPr>
-          <w:trHeight w:val="552"/>
-        </w:trPr>
-        <w:tc>
-          <w:tcPr>
-            <w:tcW w:w="981" w:type="pct"/>
-            <w:vAlign w:val="center"/>
-          </w:tcPr>
-          <w:p/>
-        </w:tc>
-        <w:tc>
-          <w:tcPr>
-            <w:tcW w:w="502" w:type="pct"/>
-            <w:vAlign w:val="center"/>
-          </w:tcPr>
-          <w:p>
-            <w:pPr>
-              <w:rPr>
-                <w:rFonts w:ascii="Times" w:eastAsia="Times" w:hAnsi="Times" w:cs="Times"/>
-              </w:rPr>
-            </w:pPr>
-          </w:p>
-        </w:tc>
-        <w:tc>
-          <w:tcPr>
-            <w:tcW w:w="2493" w:type="pct"/>
-            <w:vAlign w:val="center"/>
-          </w:tcPr>
-          <w:p>
-            <w:pPr>
-              <w:rPr>
-                <w:rFonts w:ascii="Times" w:eastAsia="Times" w:hAnsi="Times" w:cs="Times"/>
-              </w:rPr>
-            </w:pPr>
-          </w:p>
-        </w:tc>
-        <w:tc>
-          <w:tcPr>
-            <w:tcW w:w="1024" w:type="pct"/>
-            <w:vAlign w:val="center"/>
-          </w:tcPr>
-          <w:p>
-            <w:pPr>
-              <w:rPr>
-                <w:rFonts w:ascii="Times" w:eastAsia="Times" w:hAnsi="Times" w:cs="Times"/>
-              </w:rPr>
-            </w:pPr>
-          </w:p>
-        </w:tc>
-      </w:tr>
-      <w:tr>
-        <w:trPr>
-          <w:trHeight w:val="552"/>
-        </w:trPr>
-        <w:tc>
-          <w:tcPr>
-            <w:tcW w:w="981" w:type="pct"/>
-            <w:vAlign w:val="center"/>
-          </w:tcPr>
-          <w:p/>
-        </w:tc>
-        <w:tc>
-          <w:tcPr>
-            <w:tcW w:w="502" w:type="pct"/>
-            <w:vAlign w:val="center"/>
-          </w:tcPr>
-          <w:p>
-            <w:pPr>
-              <w:rPr>
-                <w:rFonts w:ascii="Times" w:eastAsia="Times" w:hAnsi="Times" w:cs="Times"/>
-              </w:rPr>
-            </w:pPr>
-          </w:p>
-        </w:tc>
-        <w:tc>
-          <w:tcPr>
-            <w:tcW w:w="2493" w:type="pct"/>
-            <w:vAlign w:val="center"/>
-          </w:tcPr>
-          <w:p>
-            <w:pPr>
-              <w:rPr>
-                <w:rFonts w:ascii="Times" w:eastAsia="Times" w:hAnsi="Times" w:cs="Times"/>
-              </w:rPr>
-            </w:pPr>
-          </w:p>
-        </w:tc>
-        <w:tc>
-          <w:tcPr>
-            <w:tcW w:w="1024" w:type="pct"/>
-            <w:vAlign w:val="center"/>
-          </w:tcPr>
-          <w:p>
-            <w:pPr>
-              <w:rPr>
-                <w:rFonts w:ascii="Times" w:eastAsia="Times" w:hAnsi="Times" w:cs="Times"/>
-              </w:rPr>
-            </w:pPr>
-          </w:p>
-        </w:tc>
-      </w:tr>
-      <w:tr>
-        <w:trPr>
-          <w:trHeight w:val="552"/>
-        </w:trPr>
-        <w:tc>
-          <w:tcPr>
-            <w:tcW w:w="981" w:type="pct"/>
-            <w:vAlign w:val="center"/>
-          </w:tcPr>
-          <w:p/>
-        </w:tc>
-        <w:tc>
-          <w:tcPr>
-            <w:tcW w:w="502" w:type="pct"/>
-            <w:vAlign w:val="center"/>
-          </w:tcPr>
-          <w:p>
-            <w:pPr>
-              <w:rPr>
-                <w:rFonts w:ascii="Times" w:eastAsia="Times" w:hAnsi="Times" w:cs="Times"/>
-              </w:rPr>
-            </w:pPr>
-          </w:p>
-        </w:tc>
-        <w:tc>
-          <w:tcPr>
-            <w:tcW w:w="2493" w:type="pct"/>
-            <w:vAlign w:val="center"/>
-          </w:tcPr>
-          <w:p>
-            <w:pPr>
-              <w:rPr>
-                <w:rFonts w:ascii="Times" w:eastAsia="Times" w:hAnsi="Times" w:cs="Times"/>
-              </w:rPr>
-            </w:pPr>
-          </w:p>
-        </w:tc>
-        <w:tc>
-          <w:tcPr>
-            <w:tcW w:w="1024" w:type="pct"/>
-            <w:vAlign w:val="center"/>
-          </w:tcPr>
-          <w:p>
-            <w:pPr>
-              <w:rPr>
-                <w:rFonts w:ascii="Times" w:eastAsia="Times" w:hAnsi="Times" w:cs="Times"/>
-              </w:rPr>
-            </w:pPr>
-          </w:p>
-        </w:tc>
-      </w:tr>
-      <w:tr>
-        <w:trPr>
-          <w:trHeight w:val="552"/>
-        </w:trPr>
-        <w:tc>
-          <w:tcPr>
-            <w:tcW w:w="981" w:type="pct"/>
-            <w:vAlign w:val="center"/>
-          </w:tcPr>
-          <w:p/>
-        </w:tc>
-        <w:tc>
-          <w:tcPr>
-            <w:tcW w:w="502" w:type="pct"/>
-            <w:vAlign w:val="center"/>
-          </w:tcPr>
-          <w:p>
-            <w:pPr>
-              <w:rPr>
-                <w:rFonts w:ascii="Times" w:eastAsia="Times" w:hAnsi="Times" w:cs="Times"/>
-              </w:rPr>
-            </w:pPr>
-          </w:p>
-        </w:tc>
-        <w:tc>
-          <w:tcPr>
-            <w:tcW w:w="2493" w:type="pct"/>
-            <w:vAlign w:val="center"/>
-          </w:tcPr>
-          <w:p>
-            <w:pPr>
-              <w:rPr>
-                <w:rFonts w:ascii="Times" w:eastAsia="Times" w:hAnsi="Times" w:cs="Times"/>
-              </w:rPr>
-            </w:pPr>
-          </w:p>
-        </w:tc>
-        <w:tc>
-          <w:tcPr>
-            <w:tcW w:w="1024" w:type="pct"/>
-            <w:vAlign w:val="center"/>
-          </w:tcPr>
-          <w:p>
-            <w:pPr>
-              <w:rPr>
-                <w:rFonts w:ascii="Times" w:eastAsia="Times" w:hAnsi="Times" w:cs="Times"/>
-              </w:rPr>
-            </w:pPr>
-          </w:p>
-        </w:tc>
-      </w:tr>
-      <w:tr>
-        <w:trPr>
-          <w:trHeight w:val="552"/>
-        </w:trPr>
-        <w:tc>
-          <w:tcPr>
-            <w:tcW w:w="981" w:type="pct"/>
-            <w:vAlign w:val="center"/>
-          </w:tcPr>
-          <w:p/>
-        </w:tc>
-        <w:tc>
-          <w:tcPr>
-            <w:tcW w:w="502" w:type="pct"/>
-            <w:vAlign w:val="center"/>
-          </w:tcPr>
-          <w:p>
-            <w:pPr>
-              <w:rPr>
-                <w:rFonts w:ascii="Times" w:eastAsia="Times" w:hAnsi="Times" w:cs="Times"/>
-              </w:rPr>
-            </w:pPr>
-          </w:p>
-        </w:tc>
-        <w:tc>
-          <w:tcPr>
-            <w:tcW w:w="2493" w:type="pct"/>
-            <w:vAlign w:val="center"/>
-          </w:tcPr>
-          <w:p>
-            <w:pPr>
-              <w:rPr>
-                <w:rFonts w:ascii="Times" w:eastAsia="Times" w:hAnsi="Times" w:cs="Times"/>
-              </w:rPr>
-            </w:pPr>
-          </w:p>
-        </w:tc>
-        <w:tc>
-          <w:tcPr>
-            <w:tcW w:w="1024" w:type="pct"/>
-            <w:vAlign w:val="center"/>
-          </w:tcPr>
-          <w:p>
-            <w:pPr>
-              <w:rPr>
-                <w:rFonts w:ascii="Times" w:eastAsia="Times" w:hAnsi="Times" w:cs="Times"/>
-              </w:rPr>
-            </w:pPr>
-          </w:p>
-        </w:tc>
-      </w:tr>
-      <w:tr>
-        <w:trPr>
-          <w:trHeight w:val="552"/>
-        </w:trPr>
-        <w:tc>
-          <w:tcPr>
-            <w:tcW w:w="981" w:type="pct"/>
-            <w:vAlign w:val="center"/>
-          </w:tcPr>
-          <w:p/>
-        </w:tc>
-        <w:tc>
-          <w:tcPr>
-            <w:tcW w:w="502" w:type="pct"/>
-            <w:vAlign w:val="center"/>
-          </w:tcPr>
-          <w:p>
-            <w:pPr>
-              <w:rPr>
-                <w:rFonts w:ascii="Times" w:eastAsia="Times" w:hAnsi="Times" w:cs="Times"/>
-              </w:rPr>
-            </w:pPr>
-          </w:p>
-        </w:tc>
-        <w:tc>
-          <w:tcPr>
-            <w:tcW w:w="2493" w:type="pct"/>
-            <w:vAlign w:val="center"/>
-          </w:tcPr>
-          <w:p>
-            <w:pPr>
-              <w:rPr>
-                <w:rFonts w:ascii="Times" w:eastAsia="Times" w:hAnsi="Times" w:cs="Times"/>
-              </w:rPr>
-            </w:pPr>
-          </w:p>
-        </w:tc>
-        <w:tc>
-          <w:tcPr>
-            <w:tcW w:w="1024" w:type="pct"/>
-            <w:vAlign w:val="center"/>
-          </w:tcPr>
-          <w:p>
-            <w:pPr>
-              <w:rPr>
-                <w:rFonts w:ascii="Times" w:eastAsia="Times" w:hAnsi="Times" w:cs="Times"/>
-              </w:rPr>
-            </w:pPr>
-          </w:p>
-        </w:tc>
-      </w:tr>
-      <w:tr>
-        <w:trPr>
-          <w:trHeight w:val="552"/>
-        </w:trPr>
-        <w:tc>
-          <w:tcPr>
-            <w:tcW w:w="981" w:type="pct"/>
-            <w:vAlign w:val="center"/>
-          </w:tcPr>
-          <w:p/>
-        </w:tc>
-        <w:tc>
-          <w:tcPr>
-            <w:tcW w:w="502" w:type="pct"/>
-            <w:vAlign w:val="center"/>
-          </w:tcPr>
-          <w:p>
-            <w:pPr>
-              <w:rPr>
-                <w:rFonts w:ascii="Times" w:eastAsia="Times" w:hAnsi="Times" w:cs="Times"/>
-              </w:rPr>
-            </w:pPr>
-          </w:p>
-        </w:tc>
-        <w:tc>
-          <w:tcPr>
-            <w:tcW w:w="2493" w:type="pct"/>
-            <w:vAlign w:val="center"/>
-          </w:tcPr>
-          <w:p>
-            <w:pPr>
-              <w:rPr>
-                <w:rFonts w:ascii="Times" w:eastAsia="Times" w:hAnsi="Times" w:cs="Times"/>
-              </w:rPr>
-            </w:pPr>
-          </w:p>
-        </w:tc>
-        <w:tc>
-          <w:tcPr>
-            <w:tcW w:w="1024" w:type="pct"/>
-            <w:vAlign w:val="center"/>
-          </w:tcPr>
-          <w:p>
-            <w:pPr>
-              <w:rPr>
-                <w:rFonts w:ascii="Times" w:eastAsia="Times" w:hAnsi="Times" w:cs="Times"/>
-              </w:rPr>
-            </w:pPr>
-          </w:p>
-        </w:tc>
-      </w:tr>
-      <w:tr>
-        <w:trPr>
-          <w:trHeight w:val="552"/>
-        </w:trPr>
-        <w:tc>
-          <w:tcPr>
-            <w:tcW w:w="981" w:type="pct"/>
-            <w:vAlign w:val="center"/>
-          </w:tcPr>
-          <w:p/>
-        </w:tc>
-        <w:tc>
-          <w:tcPr>
-            <w:tcW w:w="502" w:type="pct"/>
-            <w:vAlign w:val="center"/>
-          </w:tcPr>
-          <w:p>
-            <w:pPr>
-              <w:rPr>
-                <w:rFonts w:ascii="Times" w:eastAsia="Times" w:hAnsi="Times" w:cs="Times"/>
-              </w:rPr>
-            </w:pPr>
-          </w:p>
-        </w:tc>
-        <w:tc>
-          <w:tcPr>
-            <w:tcW w:w="2493" w:type="pct"/>
-            <w:vAlign w:val="center"/>
-          </w:tcPr>
-          <w:p>
-            <w:pPr>
-              <w:rPr>
-                <w:rFonts w:ascii="Times" w:eastAsia="Times" w:hAnsi="Times" w:cs="Times"/>
-              </w:rPr>
-            </w:pPr>
-          </w:p>
-        </w:tc>
-        <w:tc>
-          <w:tcPr>
-            <w:tcW w:w="1024" w:type="pct"/>
-            <w:vAlign w:val="center"/>
-          </w:tcPr>
-          <w:p>
-            <w:pPr>
-              <w:rPr>
-                <w:rFonts w:ascii="Times" w:eastAsia="Times" w:hAnsi="Times" w:cs="Times"/>
-              </w:rPr>
-            </w:pPr>
-          </w:p>
-        </w:tc>
-      </w:tr>
-      <w:tr>
-        <w:trPr>
-          <w:trHeight w:val="552"/>
-        </w:trPr>
-        <w:tc>
-          <w:tcPr>
-            <w:tcW w:w="981" w:type="pct"/>
-            <w:vAlign w:val="center"/>
-          </w:tcPr>
-          <w:p/>
-        </w:tc>
-        <w:tc>
-          <w:tcPr>
-            <w:tcW w:w="502" w:type="pct"/>
-            <w:vAlign w:val="center"/>
-          </w:tcPr>
-          <w:p>
-            <w:pPr>
-              <w:rPr>
-                <w:rFonts w:ascii="Times" w:eastAsia="Times" w:hAnsi="Times" w:cs="Times"/>
-              </w:rPr>
-            </w:pPr>
-          </w:p>
-        </w:tc>
-        <w:tc>
-          <w:tcPr>
-            <w:tcW w:w="2493" w:type="pct"/>
-            <w:vAlign w:val="center"/>
-          </w:tcPr>
-          <w:p>
-            <w:pPr>
-              <w:rPr>
-                <w:rFonts w:ascii="Times" w:eastAsia="Times" w:hAnsi="Times" w:cs="Times"/>
-              </w:rPr>
-            </w:pPr>
-          </w:p>
-        </w:tc>
-        <w:tc>
-          <w:tcPr>
-            <w:tcW w:w="1024" w:type="pct"/>
-            <w:vAlign w:val="center"/>
-          </w:tcPr>
-          <w:p>
-            <w:pPr>
-              <w:rPr>
-                <w:rFonts w:ascii="Times" w:eastAsia="Times" w:hAnsi="Times" w:cs="Times"/>
-              </w:rPr>
-            </w:pPr>
-          </w:p>
-        </w:tc>
-      </w:tr>
-      <w:tr>
-        <w:trPr>
-          <w:trHeight w:val="552"/>
-        </w:trPr>
-        <w:tc>
-          <w:tcPr>
-            <w:tcW w:w="981" w:type="pct"/>
-            <w:vAlign w:val="center"/>
-          </w:tcPr>
-          <w:p/>
-        </w:tc>
-        <w:tc>
-          <w:tcPr>
-            <w:tcW w:w="502" w:type="pct"/>
-            <w:vAlign w:val="center"/>
-          </w:tcPr>
-          <w:p>
-            <w:pPr>
-              <w:rPr>
-                <w:rFonts w:ascii="Times" w:eastAsia="Times" w:hAnsi="Times" w:cs="Times"/>
-              </w:rPr>
-            </w:pPr>
-          </w:p>
-        </w:tc>
-        <w:tc>
-          <w:tcPr>
-            <w:tcW w:w="2493" w:type="pct"/>
-            <w:vAlign w:val="center"/>
-          </w:tcPr>
-          <w:p>
-            <w:pPr>
-              <w:rPr>
-                <w:rFonts w:ascii="Times" w:eastAsia="Times" w:hAnsi="Times" w:cs="Times"/>
-              </w:rPr>
-            </w:pPr>
-          </w:p>
-        </w:tc>
-        <w:tc>
-          <w:tcPr>
-            <w:tcW w:w="1024" w:type="pct"/>
-            <w:vAlign w:val="center"/>
-          </w:tcPr>
-          <w:p>
-            <w:pPr>
-              <w:rPr>
-                <w:rFonts w:ascii="Times" w:eastAsia="Times" w:hAnsi="Times" w:cs="Times"/>
-              </w:rPr>
-            </w:pPr>
-          </w:p>
-        </w:tc>
-      </w:tr>
-      <w:tr>
-        <w:trPr>
-          <w:trHeight w:val="552"/>
-        </w:trPr>
-        <w:tc>
-          <w:tcPr>
-            <w:tcW w:w="981" w:type="pct"/>
-            <w:vAlign w:val="center"/>
-          </w:tcPr>
-          <w:p/>
-        </w:tc>
-        <w:tc>
-          <w:tcPr>
-            <w:tcW w:w="502" w:type="pct"/>
-            <w:vAlign w:val="center"/>
-          </w:tcPr>
-          <w:p>
-            <w:pPr>
-              <w:rPr>
-                <w:rFonts w:ascii="Times" w:eastAsia="Times" w:hAnsi="Times" w:cs="Times"/>
-              </w:rPr>
-            </w:pPr>
-          </w:p>
-        </w:tc>
-        <w:tc>
-          <w:tcPr>
-            <w:tcW w:w="2493" w:type="pct"/>
-            <w:vAlign w:val="center"/>
-          </w:tcPr>
-          <w:p>
-            <w:pPr>
-              <w:rPr>
-                <w:rFonts w:ascii="Times" w:eastAsia="Times" w:hAnsi="Times" w:cs="Times"/>
-              </w:rPr>
-            </w:pPr>
-          </w:p>
-        </w:tc>
-        <w:tc>
-          <w:tcPr>
-            <w:tcW w:w="1024" w:type="pct"/>
-            <w:vAlign w:val="center"/>
-          </w:tcPr>
-          <w:p>
-            <w:pPr>
-              <w:rPr>
-                <w:rFonts w:ascii="Times" w:eastAsia="Times" w:hAnsi="Times" w:cs="Times"/>
-              </w:rPr>
-            </w:pPr>
-          </w:p>
-        </w:tc>
-      </w:tr>
-      <w:tr>
-        <w:trPr>
-          <w:trHeight w:val="552"/>
-        </w:trPr>
-        <w:tc>
-          <w:tcPr>
-            <w:tcW w:w="981" w:type="pct"/>
-            <w:vAlign w:val="center"/>
-          </w:tcPr>
-          <w:p/>
-        </w:tc>
-        <w:tc>
-          <w:tcPr>
-            <w:tcW w:w="502" w:type="pct"/>
-            <w:vAlign w:val="center"/>
-          </w:tcPr>
-          <w:p>
-            <w:pPr>
-              <w:rPr>
-                <w:rFonts w:ascii="Times" w:eastAsia="Times" w:hAnsi="Times" w:cs="Times"/>
-              </w:rPr>
-            </w:pPr>
-          </w:p>
-        </w:tc>
-        <w:tc>
-          <w:tcPr>
-            <w:tcW w:w="2493" w:type="pct"/>
-            <w:vAlign w:val="center"/>
-          </w:tcPr>
-          <w:p>
-            <w:pPr>
-              <w:rPr>
-                <w:rFonts w:ascii="Times" w:eastAsia="Times" w:hAnsi="Times" w:cs="Times"/>
-              </w:rPr>
-            </w:pPr>
-          </w:p>
-        </w:tc>
-        <w:tc>
-          <w:tcPr>
-            <w:tcW w:w="1024" w:type="pct"/>
-            <w:vAlign w:val="center"/>
-          </w:tcPr>
-          <w:p>
-            <w:pPr>
-              <w:rPr>
-                <w:rFonts w:ascii="Times" w:eastAsia="Times" w:hAnsi="Times" w:cs="Times"/>
-              </w:rPr>
-            </w:pPr>
-          </w:p>
-        </w:tc>
-      </w:tr>
-      <w:tr>
-        <w:trPr>
-          <w:trHeight w:val="552"/>
-        </w:trPr>
-        <w:tc>
-          <w:tcPr>
-            <w:tcW w:w="981" w:type="pct"/>
-            <w:vAlign w:val="center"/>
-          </w:tcPr>
-          <w:p/>
-        </w:tc>
-        <w:tc>
-          <w:tcPr>
-            <w:tcW w:w="502" w:type="pct"/>
-            <w:vAlign w:val="center"/>
-          </w:tcPr>
-          <w:p>
-            <w:pPr>
-              <w:rPr>
-                <w:rFonts w:ascii="Times" w:eastAsia="Times" w:hAnsi="Times" w:cs="Times"/>
-              </w:rPr>
-            </w:pPr>
-          </w:p>
-        </w:tc>
-        <w:tc>
-          <w:tcPr>
-            <w:tcW w:w="2493" w:type="pct"/>
-            <w:vAlign w:val="center"/>
-          </w:tcPr>
-          <w:p>
-            <w:pPr>
-              <w:rPr>
-                <w:rFonts w:ascii="Times" w:eastAsia="Times" w:hAnsi="Times" w:cs="Times"/>
-              </w:rPr>
-            </w:pPr>
-          </w:p>
-        </w:tc>
-        <w:tc>
-          <w:tcPr>
-            <w:tcW w:w="1024" w:type="pct"/>
-            <w:vAlign w:val="center"/>
-          </w:tcPr>
-          <w:p>
-            <w:pPr>
-              <w:rPr>
-                <w:rFonts w:ascii="Times" w:eastAsia="Times" w:hAnsi="Times" w:cs="Times"/>
-              </w:rPr>
-            </w:pPr>
-          </w:p>
-        </w:tc>
-      </w:tr>
-      <w:tr>
-        <w:trPr>
-          <w:trHeight w:val="552"/>
-        </w:trPr>
-        <w:tc>
-          <w:tcPr>
-            <w:tcW w:w="981" w:type="pct"/>
-            <w:vAlign w:val="center"/>
-          </w:tcPr>
-          <w:p/>
-        </w:tc>
-        <w:tc>
-          <w:tcPr>
-            <w:tcW w:w="502" w:type="pct"/>
-            <w:vAlign w:val="center"/>
-          </w:tcPr>
-          <w:p>
-            <w:pPr>
-              <w:rPr>
-                <w:rFonts w:ascii="Times" w:eastAsia="Times" w:hAnsi="Times" w:cs="Times"/>
-              </w:rPr>
-            </w:pPr>
-          </w:p>
-        </w:tc>
-        <w:tc>
-          <w:tcPr>
-            <w:tcW w:w="2493" w:type="pct"/>
-            <w:vAlign w:val="center"/>
-          </w:tcPr>
-          <w:p>
-            <w:pPr>
-              <w:rPr>
-                <w:rFonts w:ascii="Times" w:eastAsia="Times" w:hAnsi="Times" w:cs="Times"/>
-              </w:rPr>
-            </w:pPr>
-          </w:p>
-        </w:tc>
-        <w:tc>
-          <w:tcPr>
-            <w:tcW w:w="1024" w:type="pct"/>
-            <w:vAlign w:val="center"/>
-          </w:tcPr>
-          <w:p>
-            <w:pPr>
-              <w:rPr>
-                <w:rFonts w:ascii="Times" w:eastAsia="Times" w:hAnsi="Times" w:cs="Times"/>
-              </w:rPr>
-            </w:pPr>
-          </w:p>
-        </w:tc>
-      </w:tr>
-      <w:tr>
-        <w:trPr>
-          <w:trHeight w:val="552"/>
-        </w:trPr>
-        <w:tc>
-          <w:tcPr>
-            <w:tcW w:w="981" w:type="pct"/>
-            <w:vAlign w:val="center"/>
-          </w:tcPr>
-          <w:p/>
-        </w:tc>
-        <w:tc>
-          <w:tcPr>
-            <w:tcW w:w="502" w:type="pct"/>
-            <w:vAlign w:val="center"/>
-          </w:tcPr>
-          <w:p>
-            <w:pPr>
-              <w:rPr>
-                <w:rFonts w:ascii="Times" w:eastAsia="Times" w:hAnsi="Times" w:cs="Times"/>
-              </w:rPr>
-            </w:pPr>
-          </w:p>
-        </w:tc>
-        <w:tc>
-          <w:tcPr>
-            <w:tcW w:w="2493" w:type="pct"/>
-            <w:vAlign w:val="center"/>
-          </w:tcPr>
-          <w:p>
-            <w:pPr>
-              <w:rPr>
-                <w:rFonts w:ascii="Times" w:eastAsia="Times" w:hAnsi="Times" w:cs="Times"/>
-              </w:rPr>
-            </w:pPr>
-          </w:p>
-        </w:tc>
-        <w:tc>
-          <w:tcPr>
-            <w:tcW w:w="1024" w:type="pct"/>
-            <w:vAlign w:val="center"/>
-          </w:tcPr>
-          <w:p>
-            <w:pPr>
-              <w:rPr>
-                <w:rFonts w:ascii="Times" w:eastAsia="Times" w:hAnsi="Times" w:cs="Times"/>
-              </w:rPr>
-            </w:pPr>
-          </w:p>
-        </w:tc>
-      </w:tr>
-      <w:tr>
-        <w:trPr>
-          <w:trHeight w:val="552"/>
-        </w:trPr>
-        <w:tc>
-          <w:tcPr>
-            <w:tcW w:w="981" w:type="pct"/>
-            <w:vAlign w:val="center"/>
-          </w:tcPr>
-          <w:p/>
-        </w:tc>
-        <w:tc>
-          <w:tcPr>
-            <w:tcW w:w="502" w:type="pct"/>
-            <w:vAlign w:val="center"/>
-          </w:tcPr>
-          <w:p>
-            <w:pPr>
-              <w:rPr>
-                <w:rFonts w:ascii="Times" w:eastAsia="Times" w:hAnsi="Times" w:cs="Times"/>
-              </w:rPr>
-            </w:pPr>
-          </w:p>
-        </w:tc>
-        <w:tc>
-          <w:tcPr>
-            <w:tcW w:w="2493" w:type="pct"/>
-            <w:vAlign w:val="center"/>
-          </w:tcPr>
-          <w:p>
-            <w:pPr>
-              <w:rPr>
-                <w:rFonts w:ascii="Times" w:eastAsia="Times" w:hAnsi="Times" w:cs="Times"/>
-              </w:rPr>
-            </w:pPr>
-          </w:p>
-        </w:tc>
-        <w:tc>
-          <w:tcPr>
-            <w:tcW w:w="1024" w:type="pct"/>
-            <w:vAlign w:val="center"/>
-          </w:tcPr>
-          <w:p>
-            <w:pPr>
-              <w:rPr>
-                <w:rFonts w:ascii="Times" w:eastAsia="Times" w:hAnsi="Times" w:cs="Times"/>
-              </w:rPr>
-            </w:pPr>
-          </w:p>
-        </w:tc>
-      </w:tr>
-      <w:tr>
-        <w:trPr>
-          <w:trHeight w:val="552"/>
-        </w:trPr>
-        <w:tc>
-          <w:tcPr>
-            <w:tcW w:w="981" w:type="pct"/>
-            <w:vAlign w:val="center"/>
-          </w:tcPr>
-          <w:p/>
-        </w:tc>
-        <w:tc>
-          <w:tcPr>
-            <w:tcW w:w="502" w:type="pct"/>
-            <w:vAlign w:val="center"/>
-          </w:tcPr>
-          <w:p>
-            <w:pPr>
-              <w:rPr>
-                <w:rFonts w:ascii="Times" w:eastAsia="Times" w:hAnsi="Times" w:cs="Times"/>
-              </w:rPr>
-            </w:pPr>
-          </w:p>
-        </w:tc>
-        <w:tc>
-          <w:tcPr>
-            <w:tcW w:w="2493" w:type="pct"/>
-            <w:vAlign w:val="center"/>
-          </w:tcPr>
-          <w:p>
-            <w:pPr>
-              <w:rPr>
-                <w:rFonts w:ascii="Times" w:eastAsia="Times" w:hAnsi="Times" w:cs="Times"/>
-              </w:rPr>
-            </w:pPr>
-          </w:p>
-        </w:tc>
-        <w:tc>
-          <w:tcPr>
-            <w:tcW w:w="1024" w:type="pct"/>
-            <w:vAlign w:val="center"/>
-          </w:tcPr>
-          <w:p>
-            <w:pPr>
-              <w:rPr>
-                <w:rFonts w:ascii="Times" w:eastAsia="Times" w:hAnsi="Times" w:cs="Times"/>
-              </w:rPr>
-            </w:pPr>
-          </w:p>
-        </w:tc>
-      </w:tr>
-      <w:tr>
-        <w:trPr>
-          <w:trHeight w:val="552"/>
-        </w:trPr>
-        <w:tc>
-          <w:tcPr>
-            <w:tcW w:w="981" w:type="pct"/>
-            <w:vAlign w:val="center"/>
-          </w:tcPr>
-          <w:p/>
-        </w:tc>
-        <w:tc>
-          <w:tcPr>
-            <w:tcW w:w="502" w:type="pct"/>
-            <w:vAlign w:val="center"/>
-          </w:tcPr>
-          <w:p>
-            <w:pPr>
-              <w:rPr>
-                <w:rFonts w:ascii="Times" w:eastAsia="Times" w:hAnsi="Times" w:cs="Times"/>
-              </w:rPr>
-            </w:pPr>
-          </w:p>
-        </w:tc>
-        <w:tc>
-          <w:tcPr>
-            <w:tcW w:w="2493" w:type="pct"/>
-            <w:vAlign w:val="center"/>
-          </w:tcPr>
-          <w:p>
-            <w:pPr>
-              <w:rPr>
-                <w:rFonts w:ascii="Times" w:eastAsia="Times" w:hAnsi="Times" w:cs="Times"/>
-              </w:rPr>
-            </w:pPr>
-          </w:p>
-        </w:tc>
-        <w:tc>
-          <w:tcPr>
-            <w:tcW w:w="1024" w:type="pct"/>
-            <w:vAlign w:val="center"/>
-          </w:tcPr>
-          <w:p>
-            <w:pPr>
-              <w:rPr>
-                <w:rFonts w:ascii="Times" w:eastAsia="Times" w:hAnsi="Times" w:cs="Times"/>
-                <w:i/>
-                <w:iCs/>
-              </w:rPr>
-            </w:pPr>
-          </w:p>
-        </w:tc>
-      </w:tr>
-      <w:tr>
-        <w:trPr>
-          <w:trHeight w:val="552"/>
-        </w:trPr>
-        <w:tc>
-          <w:tcPr>
-            <w:tcW w:w="981" w:type="pct"/>
-            <w:vAlign w:val="center"/>
-          </w:tcPr>
-          <w:p/>
-        </w:tc>
-        <w:tc>
-          <w:tcPr>
-            <w:tcW w:w="502" w:type="pct"/>
-            <w:vAlign w:val="center"/>
-          </w:tcPr>
-          <w:p>
-            <w:pPr>
-              <w:rPr>
-                <w:rFonts w:ascii="Times" w:eastAsia="Times" w:hAnsi="Times" w:cs="Times"/>
-              </w:rPr>
-            </w:pPr>
-          </w:p>
-        </w:tc>
-        <w:tc>
-          <w:tcPr>
-            <w:tcW w:w="2493" w:type="pct"/>
-            <w:vAlign w:val="center"/>
-          </w:tcPr>
-          <w:p>
-            <w:pPr>
-              <w:rPr>
-                <w:rFonts w:ascii="Times" w:eastAsia="Times" w:hAnsi="Times" w:cs="Times"/>
-              </w:rPr>
-            </w:pPr>
-          </w:p>
-        </w:tc>
-        <w:tc>
-          <w:tcPr>
-            <w:tcW w:w="1024" w:type="pct"/>
-            <w:vAlign w:val="center"/>
-          </w:tcPr>
-          <w:p>
-            <w:pPr>
-              <w:rPr>
-                <w:rFonts w:ascii="Times" w:eastAsia="Times" w:hAnsi="Times" w:cs="Times"/>
-              </w:rPr>
-            </w:pPr>
-          </w:p>
-        </w:tc>
-      </w:tr>
-      <w:tr>
-        <w:trPr>
-          <w:trHeight w:val="552"/>
-        </w:trPr>
-        <w:tc>
-          <w:tcPr>
-            <w:tcW w:w="981" w:type="pct"/>
-            <w:vAlign w:val="center"/>
-          </w:tcPr>
-          <w:p/>
-        </w:tc>
-        <w:tc>
-          <w:tcPr>
-            <w:tcW w:w="502" w:type="pct"/>
-            <w:vAlign w:val="center"/>
-          </w:tcPr>
-          <w:p>
-            <w:pPr>
-              <w:rPr>
-                <w:rFonts w:ascii="Times" w:eastAsia="Times" w:hAnsi="Times" w:cs="Times"/>
-              </w:rPr>
-            </w:pPr>
-          </w:p>
-        </w:tc>
-        <w:tc>
-          <w:tcPr>
-            <w:tcW w:w="2493" w:type="pct"/>
-            <w:vAlign w:val="center"/>
-          </w:tcPr>
-          <w:p>
-            <w:pPr>
-              <w:rPr>
-                <w:rFonts w:ascii="Times" w:eastAsia="Times" w:hAnsi="Times" w:cs="Times"/>
-              </w:rPr>
-            </w:pPr>
-          </w:p>
-        </w:tc>
-        <w:tc>
-          <w:tcPr>
-            <w:tcW w:w="1024" w:type="pct"/>
-            <w:vAlign w:val="center"/>
-          </w:tcPr>
-          <w:p>
-            <w:pPr>
-              <w:rPr>
-                <w:rFonts w:ascii="Times" w:eastAsia="Times" w:hAnsi="Times" w:cs="Times"/>
-              </w:rPr>
-            </w:pPr>
-          </w:p>
-        </w:tc>
-      </w:tr>
-      <w:tr>
-        <w:trPr>
-          <w:trHeight w:val="552"/>
-        </w:trPr>
-        <w:tc>
-          <w:tcPr>
-            <w:tcW w:w="981" w:type="pct"/>
-            <w:vAlign w:val="center"/>
-          </w:tcPr>
-          <w:p/>
-        </w:tc>
-        <w:tc>
-          <w:tcPr>
-            <w:tcW w:w="502" w:type="pct"/>
-            <w:vAlign w:val="center"/>
-          </w:tcPr>
-          <w:p>
-            <w:pPr>
-              <w:rPr>
-                <w:rFonts w:ascii="Times" w:eastAsia="Times" w:hAnsi="Times" w:cs="Times"/>
-              </w:rPr>
-            </w:pPr>
-          </w:p>
-        </w:tc>
-        <w:tc>
-          <w:tcPr>
-            <w:tcW w:w="2493" w:type="pct"/>
-            <w:vAlign w:val="center"/>
-          </w:tcPr>
-          <w:p>
-            <w:pPr>
-              <w:rPr>
-                <w:rFonts w:ascii="Times" w:eastAsia="Times" w:hAnsi="Times" w:cs="Times"/>
-              </w:rPr>
-            </w:pPr>
-          </w:p>
-        </w:tc>
-        <w:tc>
-          <w:tcPr>
-            <w:tcW w:w="1024" w:type="pct"/>
-            <w:vAlign w:val="center"/>
-          </w:tcPr>
-          <w:p>
-            <w:pPr>
-              <w:rPr>
-                <w:rFonts w:ascii="Times" w:eastAsia="Times" w:hAnsi="Times" w:cs="Times"/>
-              </w:rPr>
-            </w:pPr>
-          </w:p>
-        </w:tc>
-      </w:tr>
-      <w:tr>
-        <w:trPr>
-          <w:trHeight w:val="552"/>
-        </w:trPr>
-        <w:tc>
-          <w:tcPr>
-            <w:tcW w:w="981" w:type="pct"/>
-            <w:vAlign w:val="center"/>
-          </w:tcPr>
-          <w:p/>
-        </w:tc>
-        <w:tc>
-          <w:tcPr>
-            <w:tcW w:w="502" w:type="pct"/>
-            <w:vAlign w:val="center"/>
-          </w:tcPr>
-          <w:p>
-            <w:pPr>
-              <w:rPr>
-                <w:rFonts w:ascii="Times" w:eastAsia="Times" w:hAnsi="Times" w:cs="Times"/>
-              </w:rPr>
-            </w:pPr>
-          </w:p>
-        </w:tc>
-        <w:tc>
-          <w:tcPr>
-            <w:tcW w:w="2493" w:type="pct"/>
-            <w:vAlign w:val="center"/>
-          </w:tcPr>
-          <w:p>
-            <w:pPr>
-              <w:rPr>
-                <w:rFonts w:ascii="Times" w:eastAsia="Times" w:hAnsi="Times" w:cs="Times"/>
-              </w:rPr>
-            </w:pPr>
-          </w:p>
-        </w:tc>
-        <w:tc>
-          <w:tcPr>
-            <w:tcW w:w="1024" w:type="pct"/>
-            <w:vAlign w:val="center"/>
-          </w:tcPr>
-          <w:p>
-            <w:pPr>
-              <w:rPr>
-                <w:rFonts w:ascii="Times" w:eastAsia="Times" w:hAnsi="Times" w:cs="Times"/>
-              </w:rPr>
-            </w:pPr>
-          </w:p>
-        </w:tc>
-      </w:tr>
-      <w:tr>
-        <w:trPr>
-          <w:trHeight w:val="552"/>
-        </w:trPr>
-        <w:tc>
-          <w:tcPr>
-            <w:tcW w:w="981" w:type="pct"/>
-            <w:vAlign w:val="center"/>
-          </w:tcPr>
-          <w:p/>
-        </w:tc>
-        <w:tc>
-          <w:tcPr>
-            <w:tcW w:w="502" w:type="pct"/>
-            <w:vAlign w:val="center"/>
-          </w:tcPr>
-          <w:p>
-            <w:pPr>
-              <w:rPr>
-                <w:rFonts w:ascii="Times" w:eastAsia="Times" w:hAnsi="Times" w:cs="Times"/>
-              </w:rPr>
-            </w:pPr>
-          </w:p>
-        </w:tc>
-        <w:tc>
-          <w:tcPr>
-            <w:tcW w:w="2493" w:type="pct"/>
-            <w:vAlign w:val="center"/>
-          </w:tcPr>
-          <w:p>
-            <w:pPr>
-              <w:rPr>
-                <w:rFonts w:ascii="Times" w:eastAsia="Times" w:hAnsi="Times" w:cs="Times"/>
-              </w:rPr>
-            </w:pPr>
-          </w:p>
-        </w:tc>
-        <w:tc>
-          <w:tcPr>
-            <w:tcW w:w="1024" w:type="pct"/>
-            <w:vAlign w:val="center"/>
-          </w:tcPr>
-          <w:p>
-            <w:pPr>
-              <w:rPr>
-                <w:rFonts w:ascii="Times" w:eastAsia="Times" w:hAnsi="Times" w:cs="Times"/>
-              </w:rPr>
-            </w:pPr>
-          </w:p>
-        </w:tc>
-      </w:tr>
-      <w:tr>
-        <w:trPr>
-          <w:trHeight w:val="552"/>
-        </w:trPr>
-        <w:tc>
-          <w:tcPr>
-            <w:tcW w:w="981" w:type="pct"/>
-            <w:vAlign w:val="center"/>
-          </w:tcPr>
-          <w:p/>
-        </w:tc>
-        <w:tc>
-          <w:tcPr>
-            <w:tcW w:w="502" w:type="pct"/>
-            <w:vAlign w:val="center"/>
-          </w:tcPr>
-          <w:p>
-            <w:pPr>
-              <w:rPr>
-                <w:rFonts w:ascii="Times" w:eastAsia="Times" w:hAnsi="Times" w:cs="Times"/>
-              </w:rPr>
-            </w:pPr>
-          </w:p>
-        </w:tc>
-        <w:tc>
-          <w:tcPr>
-            <w:tcW w:w="2493" w:type="pct"/>
-            <w:vAlign w:val="center"/>
-          </w:tcPr>
-          <w:p>
-            <w:pPr>
-              <w:rPr>
-                <w:rFonts w:ascii="Times" w:eastAsia="Times" w:hAnsi="Times" w:cs="Times"/>
-              </w:rPr>
-            </w:pPr>
-          </w:p>
-        </w:tc>
-        <w:tc>
-          <w:tcPr>
-            <w:tcW w:w="1024" w:type="pct"/>
-            <w:vAlign w:val="center"/>
-          </w:tcPr>
-          <w:p>
-            <w:pPr>
-              <w:rPr>
-                <w:rFonts w:ascii="Times" w:eastAsia="Times" w:hAnsi="Times" w:cs="Times"/>
-              </w:rPr>
-            </w:pPr>
-          </w:p>
-        </w:tc>
-      </w:tr>
-      <w:tr>
-        <w:trPr>
-          <w:trHeight w:val="552"/>
-        </w:trPr>
-        <w:tc>
-          <w:tcPr>
-            <w:tcW w:w="981" w:type="pct"/>
-            <w:vAlign w:val="center"/>
-          </w:tcPr>
-          <w:p/>
-        </w:tc>
-        <w:tc>
-          <w:tcPr>
-            <w:tcW w:w="502" w:type="pct"/>
-            <w:vAlign w:val="center"/>
-          </w:tcPr>
-          <w:p>
-            <w:pPr>
-              <w:rPr>
-                <w:rFonts w:ascii="Times" w:eastAsia="Times" w:hAnsi="Times" w:cs="Times"/>
-              </w:rPr>
-            </w:pPr>
-          </w:p>
-        </w:tc>
-        <w:tc>
-          <w:tcPr>
-            <w:tcW w:w="2493" w:type="pct"/>
-            <w:vAlign w:val="center"/>
-          </w:tcPr>
-          <w:p>
-            <w:pPr>
-              <w:rPr>
-                <w:rFonts w:ascii="Times" w:eastAsia="Times" w:hAnsi="Times" w:cs="Times"/>
-              </w:rPr>
-            </w:pPr>
-          </w:p>
-        </w:tc>
-        <w:tc>
-          <w:tcPr>
-            <w:tcW w:w="1024" w:type="pct"/>
-            <w:vAlign w:val="center"/>
-          </w:tcPr>
-          <w:p>
-            <w:pPr>
-              <w:rPr>
-                <w:rFonts w:ascii="Times" w:eastAsia="Times" w:hAnsi="Times" w:cs="Times"/>
-              </w:rPr>
-            </w:pPr>
-          </w:p>
-        </w:tc>
-      </w:tr>
-      <w:tr>
-        <w:trPr>
-          <w:trHeight w:val="552"/>
-        </w:trPr>
-        <w:tc>
-          <w:tcPr>
-            <w:tcW w:w="981" w:type="pct"/>
-            <w:vAlign w:val="center"/>
-          </w:tcPr>
-          <w:p/>
-        </w:tc>
-        <w:tc>
-          <w:tcPr>
-            <w:tcW w:w="502" w:type="pct"/>
-            <w:vAlign w:val="center"/>
-          </w:tcPr>
-          <w:p>
-            <w:pPr>
-              <w:rPr>
-                <w:rFonts w:ascii="Times" w:eastAsia="Times" w:hAnsi="Times" w:cs="Times"/>
-              </w:rPr>
-            </w:pPr>
-          </w:p>
-        </w:tc>
-        <w:tc>
-          <w:tcPr>
-            <w:tcW w:w="2493" w:type="pct"/>
-            <w:vAlign w:val="center"/>
-          </w:tcPr>
-          <w:p>
-            <w:pPr>
-              <w:rPr>
-                <w:rFonts w:ascii="Times" w:eastAsia="Times" w:hAnsi="Times" w:cs="Times"/>
-              </w:rPr>
-            </w:pPr>
-          </w:p>
-        </w:tc>
-        <w:tc>
-          <w:tcPr>
-            <w:tcW w:w="1024" w:type="pct"/>
-            <w:vAlign w:val="center"/>
-          </w:tcPr>
-          <w:p>
-            <w:pPr>
-              <w:rPr>
-                <w:rFonts w:ascii="Times" w:eastAsia="Times" w:hAnsi="Times" w:cs="Times"/>
-              </w:rPr>
-            </w:pPr>
-          </w:p>
-        </w:tc>
-      </w:tr>
-      <w:tr>
-        <w:trPr>
-          <w:trHeight w:val="552"/>
-        </w:trPr>
-        <w:tc>
-          <w:tcPr>
-            <w:tcW w:w="981" w:type="pct"/>
-            <w:vAlign w:val="center"/>
-          </w:tcPr>
-          <w:p/>
-        </w:tc>
-        <w:tc>
-          <w:tcPr>
-            <w:tcW w:w="502" w:type="pct"/>
-            <w:vAlign w:val="center"/>
-          </w:tcPr>
-          <w:p>
-            <w:pPr>
-              <w:rPr>
-                <w:rFonts w:ascii="Times" w:eastAsia="Times" w:hAnsi="Times" w:cs="Times"/>
-              </w:rPr>
-            </w:pPr>
-          </w:p>
-        </w:tc>
-        <w:tc>
-          <w:tcPr>
-            <w:tcW w:w="2493" w:type="pct"/>
-            <w:vAlign w:val="center"/>
-          </w:tcPr>
-          <w:p>
-            <w:pPr>
-              <w:rPr>
-                <w:rFonts w:ascii="Times" w:eastAsia="Times" w:hAnsi="Times" w:cs="Times"/>
-              </w:rPr>
-            </w:pPr>
-          </w:p>
-        </w:tc>
-        <w:tc>
-          <w:tcPr>
-            <w:tcW w:w="1024" w:type="pct"/>
-            <w:vAlign w:val="center"/>
-          </w:tcPr>
-          <w:p>
-            <w:pPr>
-              <w:rPr>
-                <w:rFonts w:ascii="Times" w:eastAsia="Times" w:hAnsi="Times" w:cs="Times"/>
-              </w:rPr>
-            </w:pPr>
-          </w:p>
-        </w:tc>
-      </w:tr>
-      <w:tr>
-        <w:trPr>
-          <w:trHeight w:val="552"/>
-        </w:trPr>
-        <w:tc>
-          <w:tcPr>
-            <w:tcW w:w="981" w:type="pct"/>
-            <w:vAlign w:val="center"/>
-          </w:tcPr>
-          <w:p/>
-        </w:tc>
-        <w:tc>
-          <w:tcPr>
-            <w:tcW w:w="502" w:type="pct"/>
-            <w:vAlign w:val="center"/>
-          </w:tcPr>
-          <w:p>
-            <w:pPr>
-              <w:rPr>
-                <w:rFonts w:ascii="Times" w:eastAsia="Times" w:hAnsi="Times" w:cs="Times"/>
-              </w:rPr>
-            </w:pPr>
-          </w:p>
-        </w:tc>
-        <w:tc>
-          <w:tcPr>
-            <w:tcW w:w="2493" w:type="pct"/>
-            <w:vAlign w:val="center"/>
-          </w:tcPr>
-          <w:p>
-            <w:pPr>
-              <w:rPr>
-                <w:rFonts w:ascii="Times" w:eastAsia="Times" w:hAnsi="Times" w:cs="Times"/>
-              </w:rPr>
-            </w:pPr>
-          </w:p>
-        </w:tc>
-        <w:tc>
-          <w:tcPr>
-            <w:tcW w:w="1024" w:type="pct"/>
-            <w:vAlign w:val="center"/>
-          </w:tcPr>
-          <w:p>
-            <w:pPr>
-              <w:rPr>
-                <w:rFonts w:ascii="Times" w:eastAsia="Times" w:hAnsi="Times" w:cs="Times"/>
-              </w:rPr>
-            </w:pPr>
-          </w:p>
-        </w:tc>
-      </w:tr>
-      <w:tr>
-        <w:trPr>
-          <w:trHeight w:val="552"/>
-        </w:trPr>
-        <w:tc>
-          <w:tcPr>
-            <w:tcW w:w="981" w:type="pct"/>
-            <w:vAlign w:val="center"/>
-          </w:tcPr>
-          <w:p/>
-        </w:tc>
-        <w:tc>
-          <w:tcPr>
-            <w:tcW w:w="502" w:type="pct"/>
-            <w:vAlign w:val="center"/>
-          </w:tcPr>
-          <w:p>
-            <w:pPr>
-              <w:rPr>
-                <w:rFonts w:ascii="Times" w:eastAsia="Times" w:hAnsi="Times" w:cs="Times"/>
-              </w:rPr>
-            </w:pPr>
-          </w:p>
-        </w:tc>
-        <w:tc>
-          <w:tcPr>
-            <w:tcW w:w="2493" w:type="pct"/>
-            <w:vAlign w:val="center"/>
-          </w:tcPr>
-          <w:p>
-            <w:pPr>
-              <w:rPr>
-                <w:rFonts w:ascii="Times" w:eastAsia="Times" w:hAnsi="Times" w:cs="Times"/>
-              </w:rPr>
-            </w:pPr>
-          </w:p>
-        </w:tc>
-        <w:tc>
-          <w:tcPr>
-            <w:tcW w:w="1024" w:type="pct"/>
-            <w:vAlign w:val="center"/>
-          </w:tcPr>
-          <w:p>
-            <w:pPr>
-              <w:rPr>
-                <w:rFonts w:ascii="Times" w:eastAsia="Times" w:hAnsi="Times" w:cs="Times"/>
-              </w:rPr>
-            </w:pPr>
-          </w:p>
-        </w:tc>
-      </w:tr>
-      <w:tr>
-        <w:trPr>
-          <w:trHeight w:val="552"/>
-        </w:trPr>
-        <w:tc>
-          <w:tcPr>
-            <w:tcW w:w="981" w:type="pct"/>
-            <w:vAlign w:val="center"/>
-          </w:tcPr>
-          <w:p/>
-        </w:tc>
-        <w:tc>
-          <w:tcPr>
-            <w:tcW w:w="502" w:type="pct"/>
-            <w:vAlign w:val="center"/>
-          </w:tcPr>
-          <w:p>
-            <w:pPr>
-              <w:rPr>
-                <w:rFonts w:ascii="Times" w:eastAsia="Times" w:hAnsi="Times" w:cs="Times"/>
-              </w:rPr>
-            </w:pPr>
-          </w:p>
-        </w:tc>
-        <w:tc>
-          <w:tcPr>
-            <w:tcW w:w="2493" w:type="pct"/>
-            <w:vAlign w:val="center"/>
-          </w:tcPr>
-          <w:p>
-            <w:pPr>
-              <w:rPr>
-                <w:rFonts w:ascii="Times" w:eastAsia="Times" w:hAnsi="Times" w:cs="Times"/>
-              </w:rPr>
-            </w:pPr>
-          </w:p>
-        </w:tc>
-        <w:tc>
-          <w:tcPr>
-            <w:tcW w:w="1024" w:type="pct"/>
-            <w:vAlign w:val="center"/>
-          </w:tcPr>
-          <w:p>
-            <w:pPr>
-              <w:rPr>
-                <w:rFonts w:ascii="Times" w:eastAsia="Times" w:hAnsi="Times" w:cs="Times"/>
-              </w:rPr>
-            </w:pPr>
-          </w:p>
-        </w:tc>
-      </w:tr>
     </w:tbl>
-    <w:p>
-      <w:pPr>
-        <w:rPr>
-          <w:b/>
-          <w:bCs/>
-        </w:rPr>
-      </w:pPr>
-    </w:p>
-    <w:p>
-      <w:pPr>
-        <w:rPr>
-          <w:b/>
-          <w:bCs/>
-        </w:rPr>
-      </w:pPr>
-    </w:p>
     <w:p>
       <w:pPr>
         <w:rPr>
@@ -3694,7 +933,7 @@
       </w:pPr>
     </w:p>
     <w:sectPr>
-      <w:pgSz w:w="16838" w:h="11906" w:orient="landscape"/>
+      <w:pgSz w:w="11906" w:h="16838"/>
       <w:pgMar w:top="1440" w:right="1440" w:bottom="1440" w:left="1440" w:header="708" w:footer="708" w:gutter="0"/>
       <w:pgNumType w:start="1"/>
       <w:cols w:space="720"/>

</xml_diff>